<commit_message>
Adiciona histórico de revisões, glossário e documentos de referência ao relatório técnico
Três folhas pré-textuais que faltavam no relatório ABNT: tabela de
controle de revisões, glossário traduzindo os termos em inglês usados
no texto, e uma lista dos documentos internos do repositório usados
como fonte primária (distinta da lista de referências bibliográficas
externas, já existente).

Co-Authored-By: Claude Sonnet 5 <noreply@anthropic.com>
Claude-Session: https://claude.ai/code/session_01VvvtJDPvh4mDoSVpkHza1d
</commit_message>
<xml_diff>
--- a/docs/relatorio-tecnico-inclinometro.docx
+++ b/docs/relatorio-tecnico-inclinometro.docx
@@ -565,6 +565,295 @@
           <w:sz w:val="24"/>
           <w:szCs w:val="24"/>
         </w:rPr>
+        <w:t xml:space="preserve">HISTÓRICO DE REVISÕES</w:t>
+      </w:r>
+    </w:p>
+    <w:tbl>
+      <w:tblPr>
+        <w:tblW w:type="dxa" w:w="9070"/>
+        <w:tblBorders>
+          <w:top w:val="single" w:color="444444" w:sz="4"/>
+          <w:left w:val="single" w:color="444444" w:sz="4"/>
+          <w:bottom w:val="single" w:color="444444" w:sz="4"/>
+          <w:right w:val="single" w:color="444444" w:sz="4"/>
+          <w:insideH w:val="single" w:color="888888" w:sz="2"/>
+          <w:insideV w:val="single" w:color="888888" w:sz="2"/>
+        </w:tblBorders>
+      </w:tblPr>
+      <w:tblGrid>
+        <w:gridCol w:w="1400"/>
+        <w:gridCol w:w="1600"/>
+        <w:gridCol w:w="4670"/>
+        <w:gridCol w:w="1400"/>
+      </w:tblGrid>
+      <w:tr>
+        <w:trPr>
+          <w:tblHeader/>
+        </w:trPr>
+        <w:tc>
+          <w:tcPr>
+            <w:tcW w:type="dxa" w:w="1400"/>
+            <w:shd w:fill="D9D9D9" w:val="clear"/>
+            <w:tcMar>
+              <w:top w:type="dxa" w:w="60"/>
+              <w:left w:type="dxa" w:w="100"/>
+              <w:bottom w:type="dxa" w:w="60"/>
+              <w:right w:type="dxa" w:w="100"/>
+            </w:tcMar>
+            <w:vAlign w:val="center"/>
+          </w:tcPr>
+          <w:p>
+            <w:pPr>
+              <w:spacing w:line="240" w:lineRule="auto"/>
+              <w:jc w:val="center"/>
+            </w:pPr>
+            <w:r>
+              <w:rPr>
+                <w:rFonts w:ascii="Times New Roman" w:cs="Times New Roman" w:eastAsia="Times New Roman" w:hAnsi="Times New Roman"/>
+                <w:b/>
+                <w:bCs/>
+                <w:sz w:val="20"/>
+                <w:szCs w:val="20"/>
+              </w:rPr>
+              <w:t xml:space="preserve">Revisão</w:t>
+            </w:r>
+          </w:p>
+        </w:tc>
+        <w:tc>
+          <w:tcPr>
+            <w:tcW w:type="dxa" w:w="1600"/>
+            <w:shd w:fill="D9D9D9" w:val="clear"/>
+            <w:tcMar>
+              <w:top w:type="dxa" w:w="60"/>
+              <w:left w:type="dxa" w:w="100"/>
+              <w:bottom w:type="dxa" w:w="60"/>
+              <w:right w:type="dxa" w:w="100"/>
+            </w:tcMar>
+            <w:vAlign w:val="center"/>
+          </w:tcPr>
+          <w:p>
+            <w:pPr>
+              <w:spacing w:line="240" w:lineRule="auto"/>
+              <w:jc w:val="center"/>
+            </w:pPr>
+            <w:r>
+              <w:rPr>
+                <w:rFonts w:ascii="Times New Roman" w:cs="Times New Roman" w:eastAsia="Times New Roman" w:hAnsi="Times New Roman"/>
+                <w:b/>
+                <w:bCs/>
+                <w:sz w:val="20"/>
+                <w:szCs w:val="20"/>
+              </w:rPr>
+              <w:t xml:space="preserve">Data</w:t>
+            </w:r>
+          </w:p>
+        </w:tc>
+        <w:tc>
+          <w:tcPr>
+            <w:tcW w:type="dxa" w:w="4670"/>
+            <w:shd w:fill="D9D9D9" w:val="clear"/>
+            <w:tcMar>
+              <w:top w:type="dxa" w:w="60"/>
+              <w:left w:type="dxa" w:w="100"/>
+              <w:bottom w:type="dxa" w:w="60"/>
+              <w:right w:type="dxa" w:w="100"/>
+            </w:tcMar>
+            <w:vAlign w:val="center"/>
+          </w:tcPr>
+          <w:p>
+            <w:pPr>
+              <w:spacing w:line="240" w:lineRule="auto"/>
+              <w:jc w:val="center"/>
+            </w:pPr>
+            <w:r>
+              <w:rPr>
+                <w:rFonts w:ascii="Times New Roman" w:cs="Times New Roman" w:eastAsia="Times New Roman" w:hAnsi="Times New Roman"/>
+                <w:b/>
+                <w:bCs/>
+                <w:sz w:val="20"/>
+                <w:szCs w:val="20"/>
+              </w:rPr>
+              <w:t xml:space="preserve">Descrição da alteração</w:t>
+            </w:r>
+          </w:p>
+        </w:tc>
+        <w:tc>
+          <w:tcPr>
+            <w:tcW w:type="dxa" w:w="1400"/>
+            <w:shd w:fill="D9D9D9" w:val="clear"/>
+            <w:tcMar>
+              <w:top w:type="dxa" w:w="60"/>
+              <w:left w:type="dxa" w:w="100"/>
+              <w:bottom w:type="dxa" w:w="60"/>
+              <w:right w:type="dxa" w:w="100"/>
+            </w:tcMar>
+            <w:vAlign w:val="center"/>
+          </w:tcPr>
+          <w:p>
+            <w:pPr>
+              <w:spacing w:line="240" w:lineRule="auto"/>
+              <w:jc w:val="center"/>
+            </w:pPr>
+            <w:r>
+              <w:rPr>
+                <w:rFonts w:ascii="Times New Roman" w:cs="Times New Roman" w:eastAsia="Times New Roman" w:hAnsi="Times New Roman"/>
+                <w:b/>
+                <w:bCs/>
+                <w:sz w:val="20"/>
+                <w:szCs w:val="20"/>
+              </w:rPr>
+              <w:t xml:space="preserve">Autor</w:t>
+            </w:r>
+          </w:p>
+        </w:tc>
+      </w:tr>
+      <w:tr>
+        <w:tc>
+          <w:tcPr>
+            <w:tcW w:type="dxa" w:w="1400"/>
+            <w:tcMar>
+              <w:top w:type="dxa" w:w="60"/>
+              <w:left w:type="dxa" w:w="100"/>
+              <w:bottom w:type="dxa" w:w="60"/>
+              <w:right w:type="dxa" w:w="100"/>
+            </w:tcMar>
+            <w:vAlign w:val="center"/>
+          </w:tcPr>
+          <w:p>
+            <w:pPr>
+              <w:spacing w:line="240" w:lineRule="auto"/>
+              <w:jc w:val="left"/>
+            </w:pPr>
+            <w:r>
+              <w:rPr>
+                <w:rFonts w:ascii="Times New Roman" w:cs="Times New Roman" w:eastAsia="Times New Roman" w:hAnsi="Times New Roman"/>
+                <w:b w:val="false"/>
+                <w:bCs w:val="false"/>
+                <w:sz w:val="20"/>
+                <w:szCs w:val="20"/>
+              </w:rPr>
+              <w:t xml:space="preserve">00</w:t>
+            </w:r>
+          </w:p>
+        </w:tc>
+        <w:tc>
+          <w:tcPr>
+            <w:tcW w:type="dxa" w:w="1600"/>
+            <w:tcMar>
+              <w:top w:type="dxa" w:w="60"/>
+              <w:left w:type="dxa" w:w="100"/>
+              <w:bottom w:type="dxa" w:w="60"/>
+              <w:right w:type="dxa" w:w="100"/>
+            </w:tcMar>
+            <w:vAlign w:val="center"/>
+          </w:tcPr>
+          <w:p>
+            <w:pPr>
+              <w:spacing w:line="240" w:lineRule="auto"/>
+              <w:jc w:val="left"/>
+            </w:pPr>
+            <w:r>
+              <w:rPr>
+                <w:rFonts w:ascii="Times New Roman" w:cs="Times New Roman" w:eastAsia="Times New Roman" w:hAnsi="Times New Roman"/>
+                <w:b w:val="false"/>
+                <w:bCs w:val="false"/>
+                <w:sz w:val="20"/>
+                <w:szCs w:val="20"/>
+              </w:rPr>
+              <w:t xml:space="preserve">16/09/2026</w:t>
+            </w:r>
+          </w:p>
+        </w:tc>
+        <w:tc>
+          <w:tcPr>
+            <w:tcW w:type="dxa" w:w="4670"/>
+            <w:tcMar>
+              <w:top w:type="dxa" w:w="60"/>
+              <w:left w:type="dxa" w:w="100"/>
+              <w:bottom w:type="dxa" w:w="60"/>
+              <w:right w:type="dxa" w:w="100"/>
+            </w:tcMar>
+            <w:vAlign w:val="center"/>
+          </w:tcPr>
+          <w:p>
+            <w:pPr>
+              <w:spacing w:line="240" w:lineRule="auto"/>
+              <w:jc w:val="left"/>
+            </w:pPr>
+            <w:r>
+              <w:rPr>
+                <w:rFonts w:ascii="Times New Roman" w:cs="Times New Roman" w:eastAsia="Times New Roman" w:hAnsi="Times New Roman"/>
+                <w:b w:val="false"/>
+                <w:bCs w:val="false"/>
+                <w:sz w:val="20"/>
+                <w:szCs w:val="20"/>
+              </w:rPr>
+              <w:t xml:space="preserve">Emissão inicial do documento.</w:t>
+            </w:r>
+          </w:p>
+        </w:tc>
+        <w:tc>
+          <w:tcPr>
+            <w:tcW w:type="dxa" w:w="1400"/>
+            <w:tcMar>
+              <w:top w:type="dxa" w:w="60"/>
+              <w:left w:type="dxa" w:w="100"/>
+              <w:bottom w:type="dxa" w:w="60"/>
+              <w:right w:type="dxa" w:w="100"/>
+            </w:tcMar>
+            <w:vAlign w:val="center"/>
+          </w:tcPr>
+          <w:p>
+            <w:pPr>
+              <w:spacing w:line="240" w:lineRule="auto"/>
+              <w:jc w:val="left"/>
+            </w:pPr>
+            <w:r>
+              <w:rPr>
+                <w:rFonts w:ascii="Times New Roman" w:cs="Times New Roman" w:eastAsia="Times New Roman" w:hAnsi="Times New Roman"/>
+                <w:b w:val="false"/>
+                <w:bCs w:val="false"/>
+                <w:sz w:val="20"/>
+                <w:szCs w:val="20"/>
+              </w:rPr>
+              <w:t xml:space="preserve">[NOME DO AUTOR]</w:t>
+            </w:r>
+          </w:p>
+        </w:tc>
+      </w:tr>
+    </w:tbl>
+    <w:p>
+      <w:pPr>
+        <w:spacing w:after="240" w:before="120"/>
+        <w:jc w:val="left"/>
+      </w:pPr>
+      <w:r>
+        <w:rPr>
+          <w:rFonts w:ascii="Times New Roman" w:cs="Times New Roman" w:eastAsia="Times New Roman" w:hAnsi="Times New Roman"/>
+          <w:sz w:val="20"/>
+          <w:szCs w:val="20"/>
+        </w:rPr>
+        <w:t xml:space="preserve">Tabela — Histórico de revisões deste documento. A revisão "00" corresponde à emissão inicial; revisões subsequentes devem ser numeradas sequencialmente (01, 02, ...) e descrever apenas o que foi alterado em relação à revisão anterior. Fonte: elaborado pelo autor.</w:t>
+      </w:r>
+    </w:p>
+    <w:p>
+      <w:r>
+        <w:br w:type="page"/>
+      </w:r>
+    </w:p>
+    <w:p>
+      <w:pPr>
+        <w:pStyle w:val="Heading1"/>
+        <w:spacing w:after="240" w:before="0"/>
+      </w:pPr>
+      <w:r>
+        <w:rPr>
+          <w:rFonts w:ascii="Times New Roman" w:cs="Times New Roman" w:eastAsia="Times New Roman" w:hAnsi="Times New Roman"/>
+          <w:b/>
+          <w:bCs/>
+          <w:sz w:val="24"/>
+          <w:szCs w:val="24"/>
+        </w:rPr>
         <w:t xml:space="preserve">RESUMO</w:t>
       </w:r>
     </w:p>
@@ -594,6 +883,1817 @@
           <w:szCs w:val="24"/>
         </w:rPr>
         <w:t xml:space="preserve">Palavras-chave: Inclinômetro. ESP32. MPU6050. Modbus RTU. Bluetooth Low Energy. ZUPT. Instrumentação eletrônica.</w:t>
+      </w:r>
+    </w:p>
+    <w:p>
+      <w:r>
+        <w:br w:type="page"/>
+      </w:r>
+    </w:p>
+    <w:p>
+      <w:pPr>
+        <w:pStyle w:val="Heading1"/>
+        <w:spacing w:after="240" w:before="0"/>
+      </w:pPr>
+      <w:r>
+        <w:rPr>
+          <w:rFonts w:ascii="Times New Roman" w:cs="Times New Roman" w:eastAsia="Times New Roman" w:hAnsi="Times New Roman"/>
+          <w:b/>
+          <w:bCs/>
+          <w:sz w:val="24"/>
+          <w:szCs w:val="24"/>
+        </w:rPr>
+        <w:t xml:space="preserve">GLOSSÁRIO — TERMOS EM INGLÊS TRADUZIDOS</w:t>
+      </w:r>
+    </w:p>
+    <w:p>
+      <w:pPr>
+        <w:spacing w:after="200" w:before="0" w:line="360" w:lineRule="auto"/>
+        <w:jc w:val="both"/>
+      </w:pPr>
+      <w:r>
+        <w:rPr>
+          <w:rFonts w:ascii="Times New Roman" w:cs="Times New Roman" w:eastAsia="Times New Roman" w:hAnsi="Times New Roman"/>
+          <w:sz w:val="24"/>
+          <w:szCs w:val="24"/>
+        </w:rPr>
+        <w:t xml:space="preserve">Este documento e o projeto que descreve empregam, como é usual na área de eletrônica embarcada, diversos termos técnicos em inglês sem tradução consagrada em português ou cuja tradução literal é pouco usual no meio técnico. A lista a seguir traduz e explica, em ordem alfabética, os termos em inglês utilizados neste relatório.</w:t>
+      </w:r>
+    </w:p>
+    <w:tbl>
+      <w:tblPr>
+        <w:tblW w:type="dxa" w:w="9070"/>
+        <w:tblBorders>
+          <w:top w:val="single" w:color="444444" w:sz="4"/>
+          <w:left w:val="single" w:color="444444" w:sz="4"/>
+          <w:bottom w:val="single" w:color="444444" w:sz="4"/>
+          <w:right w:val="single" w:color="444444" w:sz="4"/>
+          <w:insideH w:val="single" w:color="888888" w:sz="2"/>
+          <w:insideV w:val="single" w:color="888888" w:sz="2"/>
+        </w:tblBorders>
+      </w:tblPr>
+      <w:tblGrid>
+        <w:gridCol w:w="3000"/>
+        <w:gridCol w:w="6070"/>
+      </w:tblGrid>
+      <w:tr>
+        <w:trPr>
+          <w:tblHeader/>
+        </w:trPr>
+        <w:tc>
+          <w:tcPr>
+            <w:tcW w:type="dxa" w:w="3000"/>
+            <w:shd w:fill="D9D9D9" w:val="clear"/>
+            <w:tcMar>
+              <w:top w:type="dxa" w:w="60"/>
+              <w:left w:type="dxa" w:w="100"/>
+              <w:bottom w:type="dxa" w:w="60"/>
+              <w:right w:type="dxa" w:w="100"/>
+            </w:tcMar>
+            <w:vAlign w:val="center"/>
+          </w:tcPr>
+          <w:p>
+            <w:pPr>
+              <w:spacing w:line="240" w:lineRule="auto"/>
+              <w:jc w:val="center"/>
+            </w:pPr>
+            <w:r>
+              <w:rPr>
+                <w:rFonts w:ascii="Times New Roman" w:cs="Times New Roman" w:eastAsia="Times New Roman" w:hAnsi="Times New Roman"/>
+                <w:b/>
+                <w:bCs/>
+                <w:sz w:val="20"/>
+                <w:szCs w:val="20"/>
+              </w:rPr>
+              <w:t xml:space="preserve">Termo (inglês)</w:t>
+            </w:r>
+          </w:p>
+        </w:tc>
+        <w:tc>
+          <w:tcPr>
+            <w:tcW w:type="dxa" w:w="6070"/>
+            <w:shd w:fill="D9D9D9" w:val="clear"/>
+            <w:tcMar>
+              <w:top w:type="dxa" w:w="60"/>
+              <w:left w:type="dxa" w:w="100"/>
+              <w:bottom w:type="dxa" w:w="60"/>
+              <w:right w:type="dxa" w:w="100"/>
+            </w:tcMar>
+            <w:vAlign w:val="center"/>
+          </w:tcPr>
+          <w:p>
+            <w:pPr>
+              <w:spacing w:line="240" w:lineRule="auto"/>
+              <w:jc w:val="center"/>
+            </w:pPr>
+            <w:r>
+              <w:rPr>
+                <w:rFonts w:ascii="Times New Roman" w:cs="Times New Roman" w:eastAsia="Times New Roman" w:hAnsi="Times New Roman"/>
+                <w:b/>
+                <w:bCs/>
+                <w:sz w:val="20"/>
+                <w:szCs w:val="20"/>
+              </w:rPr>
+              <w:t xml:space="preserve">Tradução / explicação em português</w:t>
+            </w:r>
+          </w:p>
+        </w:tc>
+      </w:tr>
+      <w:tr>
+        <w:tc>
+          <w:tcPr>
+            <w:tcW w:type="dxa" w:w="3000"/>
+            <w:tcMar>
+              <w:top w:type="dxa" w:w="60"/>
+              <w:left w:type="dxa" w:w="100"/>
+              <w:bottom w:type="dxa" w:w="60"/>
+              <w:right w:type="dxa" w:w="100"/>
+            </w:tcMar>
+            <w:vAlign w:val="center"/>
+          </w:tcPr>
+          <w:p>
+            <w:pPr>
+              <w:spacing w:line="240" w:lineRule="auto"/>
+              <w:jc w:val="left"/>
+            </w:pPr>
+            <w:r>
+              <w:rPr>
+                <w:rFonts w:ascii="Times New Roman" w:cs="Times New Roman" w:eastAsia="Times New Roman" w:hAnsi="Times New Roman"/>
+                <w:b w:val="false"/>
+                <w:bCs w:val="false"/>
+                <w:sz w:val="20"/>
+                <w:szCs w:val="20"/>
+              </w:rPr>
+              <w:t xml:space="preserve">Bias</w:t>
+            </w:r>
+          </w:p>
+        </w:tc>
+        <w:tc>
+          <w:tcPr>
+            <w:tcW w:type="dxa" w:w="6070"/>
+            <w:tcMar>
+              <w:top w:type="dxa" w:w="60"/>
+              <w:left w:type="dxa" w:w="100"/>
+              <w:bottom w:type="dxa" w:w="60"/>
+              <w:right w:type="dxa" w:w="100"/>
+            </w:tcMar>
+            <w:vAlign w:val="center"/>
+          </w:tcPr>
+          <w:p>
+            <w:pPr>
+              <w:spacing w:line="240" w:lineRule="auto"/>
+              <w:jc w:val="left"/>
+            </w:pPr>
+            <w:r>
+              <w:rPr>
+                <w:rFonts w:ascii="Times New Roman" w:cs="Times New Roman" w:eastAsia="Times New Roman" w:hAnsi="Times New Roman"/>
+                <w:b w:val="false"/>
+                <w:bCs w:val="false"/>
+                <w:sz w:val="20"/>
+                <w:szCs w:val="20"/>
+              </w:rPr>
+              <w:t xml:space="preserve">Viés — erro sistemático aproximadamente constante presente na leitura de um sensor.</w:t>
+            </w:r>
+          </w:p>
+        </w:tc>
+      </w:tr>
+      <w:tr>
+        <w:tc>
+          <w:tcPr>
+            <w:tcW w:type="dxa" w:w="3000"/>
+            <w:tcMar>
+              <w:top w:type="dxa" w:w="60"/>
+              <w:left w:type="dxa" w:w="100"/>
+              <w:bottom w:type="dxa" w:w="60"/>
+              <w:right w:type="dxa" w:w="100"/>
+            </w:tcMar>
+            <w:vAlign w:val="center"/>
+          </w:tcPr>
+          <w:p>
+            <w:pPr>
+              <w:spacing w:line="240" w:lineRule="auto"/>
+              <w:jc w:val="left"/>
+            </w:pPr>
+            <w:r>
+              <w:rPr>
+                <w:rFonts w:ascii="Times New Roman" w:cs="Times New Roman" w:eastAsia="Times New Roman" w:hAnsi="Times New Roman"/>
+                <w:b w:val="false"/>
+                <w:bCs w:val="false"/>
+                <w:sz w:val="20"/>
+                <w:szCs w:val="20"/>
+              </w:rPr>
+              <w:t xml:space="preserve">Board</w:t>
+            </w:r>
+          </w:p>
+        </w:tc>
+        <w:tc>
+          <w:tcPr>
+            <w:tcW w:type="dxa" w:w="6070"/>
+            <w:tcMar>
+              <w:top w:type="dxa" w:w="60"/>
+              <w:left w:type="dxa" w:w="100"/>
+              <w:bottom w:type="dxa" w:w="60"/>
+              <w:right w:type="dxa" w:w="100"/>
+            </w:tcMar>
+            <w:vAlign w:val="center"/>
+          </w:tcPr>
+          <w:p>
+            <w:pPr>
+              <w:spacing w:line="240" w:lineRule="auto"/>
+              <w:jc w:val="left"/>
+            </w:pPr>
+            <w:r>
+              <w:rPr>
+                <w:rFonts w:ascii="Times New Roman" w:cs="Times New Roman" w:eastAsia="Times New Roman" w:hAnsi="Times New Roman"/>
+                <w:b w:val="false"/>
+                <w:bCs w:val="false"/>
+                <w:sz w:val="20"/>
+                <w:szCs w:val="20"/>
+              </w:rPr>
+              <w:t xml:space="preserve">Placa — placa de circuito eletrônico (neste projeto, a placa ESP32 DevKit).</w:t>
+            </w:r>
+          </w:p>
+        </w:tc>
+      </w:tr>
+      <w:tr>
+        <w:tc>
+          <w:tcPr>
+            <w:tcW w:type="dxa" w:w="3000"/>
+            <w:tcMar>
+              <w:top w:type="dxa" w:w="60"/>
+              <w:left w:type="dxa" w:w="100"/>
+              <w:bottom w:type="dxa" w:w="60"/>
+              <w:right w:type="dxa" w:w="100"/>
+            </w:tcMar>
+            <w:vAlign w:val="center"/>
+          </w:tcPr>
+          <w:p>
+            <w:pPr>
+              <w:spacing w:line="240" w:lineRule="auto"/>
+              <w:jc w:val="left"/>
+            </w:pPr>
+            <w:r>
+              <w:rPr>
+                <w:rFonts w:ascii="Times New Roman" w:cs="Times New Roman" w:eastAsia="Times New Roman" w:hAnsi="Times New Roman"/>
+                <w:b w:val="false"/>
+                <w:bCs w:val="false"/>
+                <w:sz w:val="20"/>
+                <w:szCs w:val="20"/>
+              </w:rPr>
+              <w:t xml:space="preserve">Buck converter</w:t>
+            </w:r>
+          </w:p>
+        </w:tc>
+        <w:tc>
+          <w:tcPr>
+            <w:tcW w:type="dxa" w:w="6070"/>
+            <w:tcMar>
+              <w:top w:type="dxa" w:w="60"/>
+              <w:left w:type="dxa" w:w="100"/>
+              <w:bottom w:type="dxa" w:w="60"/>
+              <w:right w:type="dxa" w:w="100"/>
+            </w:tcMar>
+            <w:vAlign w:val="center"/>
+          </w:tcPr>
+          <w:p>
+            <w:pPr>
+              <w:spacing w:line="240" w:lineRule="auto"/>
+              <w:jc w:val="left"/>
+            </w:pPr>
+            <w:r>
+              <w:rPr>
+                <w:rFonts w:ascii="Times New Roman" w:cs="Times New Roman" w:eastAsia="Times New Roman" w:hAnsi="Times New Roman"/>
+                <w:b w:val="false"/>
+                <w:bCs w:val="false"/>
+                <w:sz w:val="20"/>
+                <w:szCs w:val="20"/>
+              </w:rPr>
+              <w:t xml:space="preserve">Conversor abaixador — conversor de tensão contínua por comutação, mais eficiente que um regulador linear.</w:t>
+            </w:r>
+          </w:p>
+        </w:tc>
+      </w:tr>
+      <w:tr>
+        <w:tc>
+          <w:tcPr>
+            <w:tcW w:type="dxa" w:w="3000"/>
+            <w:tcMar>
+              <w:top w:type="dxa" w:w="60"/>
+              <w:left w:type="dxa" w:w="100"/>
+              <w:bottom w:type="dxa" w:w="60"/>
+              <w:right w:type="dxa" w:w="100"/>
+            </w:tcMar>
+            <w:vAlign w:val="center"/>
+          </w:tcPr>
+          <w:p>
+            <w:pPr>
+              <w:spacing w:line="240" w:lineRule="auto"/>
+              <w:jc w:val="left"/>
+            </w:pPr>
+            <w:r>
+              <w:rPr>
+                <w:rFonts w:ascii="Times New Roman" w:cs="Times New Roman" w:eastAsia="Times New Roman" w:hAnsi="Times New Roman"/>
+                <w:b w:val="false"/>
+                <w:bCs w:val="false"/>
+                <w:sz w:val="20"/>
+                <w:szCs w:val="20"/>
+              </w:rPr>
+              <w:t xml:space="preserve">Buffer</w:t>
+            </w:r>
+          </w:p>
+        </w:tc>
+        <w:tc>
+          <w:tcPr>
+            <w:tcW w:type="dxa" w:w="6070"/>
+            <w:tcMar>
+              <w:top w:type="dxa" w:w="60"/>
+              <w:left w:type="dxa" w:w="100"/>
+              <w:bottom w:type="dxa" w:w="60"/>
+              <w:right w:type="dxa" w:w="100"/>
+            </w:tcMar>
+            <w:vAlign w:val="center"/>
+          </w:tcPr>
+          <w:p>
+            <w:pPr>
+              <w:spacing w:line="240" w:lineRule="auto"/>
+              <w:jc w:val="left"/>
+            </w:pPr>
+            <w:r>
+              <w:rPr>
+                <w:rFonts w:ascii="Times New Roman" w:cs="Times New Roman" w:eastAsia="Times New Roman" w:hAnsi="Times New Roman"/>
+                <w:b w:val="false"/>
+                <w:bCs w:val="false"/>
+                <w:sz w:val="20"/>
+                <w:szCs w:val="20"/>
+              </w:rPr>
+              <w:t xml:space="preserve">Memória temporária — região de memória usada para armazenamento intermediário de dados, como as amostras do Modo Vibração.</w:t>
+            </w:r>
+          </w:p>
+        </w:tc>
+      </w:tr>
+      <w:tr>
+        <w:tc>
+          <w:tcPr>
+            <w:tcW w:type="dxa" w:w="3000"/>
+            <w:tcMar>
+              <w:top w:type="dxa" w:w="60"/>
+              <w:left w:type="dxa" w:w="100"/>
+              <w:bottom w:type="dxa" w:w="60"/>
+              <w:right w:type="dxa" w:w="100"/>
+            </w:tcMar>
+            <w:vAlign w:val="center"/>
+          </w:tcPr>
+          <w:p>
+            <w:pPr>
+              <w:spacing w:line="240" w:lineRule="auto"/>
+              <w:jc w:val="left"/>
+            </w:pPr>
+            <w:r>
+              <w:rPr>
+                <w:rFonts w:ascii="Times New Roman" w:cs="Times New Roman" w:eastAsia="Times New Roman" w:hAnsi="Times New Roman"/>
+                <w:b w:val="false"/>
+                <w:bCs w:val="false"/>
+                <w:sz w:val="20"/>
+                <w:szCs w:val="20"/>
+              </w:rPr>
+              <w:t xml:space="preserve">Burst (leitura em burst)</w:t>
+            </w:r>
+          </w:p>
+        </w:tc>
+        <w:tc>
+          <w:tcPr>
+            <w:tcW w:type="dxa" w:w="6070"/>
+            <w:tcMar>
+              <w:top w:type="dxa" w:w="60"/>
+              <w:left w:type="dxa" w:w="100"/>
+              <w:bottom w:type="dxa" w:w="60"/>
+              <w:right w:type="dxa" w:w="100"/>
+            </w:tcMar>
+            <w:vAlign w:val="center"/>
+          </w:tcPr>
+          <w:p>
+            <w:pPr>
+              <w:spacing w:line="240" w:lineRule="auto"/>
+              <w:jc w:val="left"/>
+            </w:pPr>
+            <w:r>
+              <w:rPr>
+                <w:rFonts w:ascii="Times New Roman" w:cs="Times New Roman" w:eastAsia="Times New Roman" w:hAnsi="Times New Roman"/>
+                <w:b w:val="false"/>
+                <w:bCs w:val="false"/>
+                <w:sz w:val="20"/>
+                <w:szCs w:val="20"/>
+              </w:rPr>
+              <w:t xml:space="preserve">Leitura em bloco — transação única do barramento que lê vários registradores consecutivos do sensor.</w:t>
+            </w:r>
+          </w:p>
+        </w:tc>
+      </w:tr>
+      <w:tr>
+        <w:tc>
+          <w:tcPr>
+            <w:tcW w:type="dxa" w:w="3000"/>
+            <w:tcMar>
+              <w:top w:type="dxa" w:w="60"/>
+              <w:left w:type="dxa" w:w="100"/>
+              <w:bottom w:type="dxa" w:w="60"/>
+              <w:right w:type="dxa" w:w="100"/>
+            </w:tcMar>
+            <w:vAlign w:val="center"/>
+          </w:tcPr>
+          <w:p>
+            <w:pPr>
+              <w:spacing w:line="240" w:lineRule="auto"/>
+              <w:jc w:val="left"/>
+            </w:pPr>
+            <w:r>
+              <w:rPr>
+                <w:rFonts w:ascii="Times New Roman" w:cs="Times New Roman" w:eastAsia="Times New Roman" w:hAnsi="Times New Roman"/>
+                <w:b w:val="false"/>
+                <w:bCs w:val="false"/>
+                <w:sz w:val="20"/>
+                <w:szCs w:val="20"/>
+              </w:rPr>
+              <w:t xml:space="preserve">Byte</w:t>
+            </w:r>
+          </w:p>
+        </w:tc>
+        <w:tc>
+          <w:tcPr>
+            <w:tcW w:type="dxa" w:w="6070"/>
+            <w:tcMar>
+              <w:top w:type="dxa" w:w="60"/>
+              <w:left w:type="dxa" w:w="100"/>
+              <w:bottom w:type="dxa" w:w="60"/>
+              <w:right w:type="dxa" w:w="100"/>
+            </w:tcMar>
+            <w:vAlign w:val="center"/>
+          </w:tcPr>
+          <w:p>
+            <w:pPr>
+              <w:spacing w:line="240" w:lineRule="auto"/>
+              <w:jc w:val="left"/>
+            </w:pPr>
+            <w:r>
+              <w:rPr>
+                <w:rFonts w:ascii="Times New Roman" w:cs="Times New Roman" w:eastAsia="Times New Roman" w:hAnsi="Times New Roman"/>
+                <w:b w:val="false"/>
+                <w:bCs w:val="false"/>
+                <w:sz w:val="20"/>
+                <w:szCs w:val="20"/>
+              </w:rPr>
+              <w:t xml:space="preserve">Byte — unidade de informação de 8 bits.</w:t>
+            </w:r>
+          </w:p>
+        </w:tc>
+      </w:tr>
+      <w:tr>
+        <w:tc>
+          <w:tcPr>
+            <w:tcW w:type="dxa" w:w="3000"/>
+            <w:tcMar>
+              <w:top w:type="dxa" w:w="60"/>
+              <w:left w:type="dxa" w:w="100"/>
+              <w:bottom w:type="dxa" w:w="60"/>
+              <w:right w:type="dxa" w:w="100"/>
+            </w:tcMar>
+            <w:vAlign w:val="center"/>
+          </w:tcPr>
+          <w:p>
+            <w:pPr>
+              <w:spacing w:line="240" w:lineRule="auto"/>
+              <w:jc w:val="left"/>
+            </w:pPr>
+            <w:r>
+              <w:rPr>
+                <w:rFonts w:ascii="Times New Roman" w:cs="Times New Roman" w:eastAsia="Times New Roman" w:hAnsi="Times New Roman"/>
+                <w:b w:val="false"/>
+                <w:bCs w:val="false"/>
+                <w:sz w:val="20"/>
+                <w:szCs w:val="20"/>
+              </w:rPr>
+              <w:t xml:space="preserve">Callback</w:t>
+            </w:r>
+          </w:p>
+        </w:tc>
+        <w:tc>
+          <w:tcPr>
+            <w:tcW w:type="dxa" w:w="6070"/>
+            <w:tcMar>
+              <w:top w:type="dxa" w:w="60"/>
+              <w:left w:type="dxa" w:w="100"/>
+              <w:bottom w:type="dxa" w:w="60"/>
+              <w:right w:type="dxa" w:w="100"/>
+            </w:tcMar>
+            <w:vAlign w:val="center"/>
+          </w:tcPr>
+          <w:p>
+            <w:pPr>
+              <w:spacing w:line="240" w:lineRule="auto"/>
+              <w:jc w:val="left"/>
+            </w:pPr>
+            <w:r>
+              <w:rPr>
+                <w:rFonts w:ascii="Times New Roman" w:cs="Times New Roman" w:eastAsia="Times New Roman" w:hAnsi="Times New Roman"/>
+                <w:b w:val="false"/>
+                <w:bCs w:val="false"/>
+                <w:sz w:val="20"/>
+                <w:szCs w:val="20"/>
+              </w:rPr>
+              <w:t xml:space="preserve">Função de retorno — rotina de software executada automaticamente em resposta a um evento (por exemplo, uma desconexão BLE).</w:t>
+            </w:r>
+          </w:p>
+        </w:tc>
+      </w:tr>
+      <w:tr>
+        <w:tc>
+          <w:tcPr>
+            <w:tcW w:type="dxa" w:w="3000"/>
+            <w:tcMar>
+              <w:top w:type="dxa" w:w="60"/>
+              <w:left w:type="dxa" w:w="100"/>
+              <w:bottom w:type="dxa" w:w="60"/>
+              <w:right w:type="dxa" w:w="100"/>
+            </w:tcMar>
+            <w:vAlign w:val="center"/>
+          </w:tcPr>
+          <w:p>
+            <w:pPr>
+              <w:spacing w:line="240" w:lineRule="auto"/>
+              <w:jc w:val="left"/>
+            </w:pPr>
+            <w:r>
+              <w:rPr>
+                <w:rFonts w:ascii="Times New Roman" w:cs="Times New Roman" w:eastAsia="Times New Roman" w:hAnsi="Times New Roman"/>
+                <w:b w:val="false"/>
+                <w:bCs w:val="false"/>
+                <w:sz w:val="20"/>
+                <w:szCs w:val="20"/>
+              </w:rPr>
+              <w:t xml:space="preserve">Characteristic (BLE)</w:t>
+            </w:r>
+          </w:p>
+        </w:tc>
+        <w:tc>
+          <w:tcPr>
+            <w:tcW w:type="dxa" w:w="6070"/>
+            <w:tcMar>
+              <w:top w:type="dxa" w:w="60"/>
+              <w:left w:type="dxa" w:w="100"/>
+              <w:bottom w:type="dxa" w:w="60"/>
+              <w:right w:type="dxa" w:w="100"/>
+            </w:tcMar>
+            <w:vAlign w:val="center"/>
+          </w:tcPr>
+          <w:p>
+            <w:pPr>
+              <w:spacing w:line="240" w:lineRule="auto"/>
+              <w:jc w:val="left"/>
+            </w:pPr>
+            <w:r>
+              <w:rPr>
+                <w:rFonts w:ascii="Times New Roman" w:cs="Times New Roman" w:eastAsia="Times New Roman" w:hAnsi="Times New Roman"/>
+                <w:b w:val="false"/>
+                <w:bCs w:val="false"/>
+                <w:sz w:val="20"/>
+                <w:szCs w:val="20"/>
+              </w:rPr>
+              <w:t xml:space="preserve">Característica — unidade de dado dentro de um serviço BLE, identificada por um UUID próprio.</w:t>
+            </w:r>
+          </w:p>
+        </w:tc>
+      </w:tr>
+      <w:tr>
+        <w:tc>
+          <w:tcPr>
+            <w:tcW w:type="dxa" w:w="3000"/>
+            <w:tcMar>
+              <w:top w:type="dxa" w:w="60"/>
+              <w:left w:type="dxa" w:w="100"/>
+              <w:bottom w:type="dxa" w:w="60"/>
+              <w:right w:type="dxa" w:w="100"/>
+            </w:tcMar>
+            <w:vAlign w:val="center"/>
+          </w:tcPr>
+          <w:p>
+            <w:pPr>
+              <w:spacing w:line="240" w:lineRule="auto"/>
+              <w:jc w:val="left"/>
+            </w:pPr>
+            <w:r>
+              <w:rPr>
+                <w:rFonts w:ascii="Times New Roman" w:cs="Times New Roman" w:eastAsia="Times New Roman" w:hAnsi="Times New Roman"/>
+                <w:b w:val="false"/>
+                <w:bCs w:val="false"/>
+                <w:sz w:val="20"/>
+                <w:szCs w:val="20"/>
+              </w:rPr>
+              <w:t xml:space="preserve">DevKit</w:t>
+            </w:r>
+          </w:p>
+        </w:tc>
+        <w:tc>
+          <w:tcPr>
+            <w:tcW w:type="dxa" w:w="6070"/>
+            <w:tcMar>
+              <w:top w:type="dxa" w:w="60"/>
+              <w:left w:type="dxa" w:w="100"/>
+              <w:bottom w:type="dxa" w:w="60"/>
+              <w:right w:type="dxa" w:w="100"/>
+            </w:tcMar>
+            <w:vAlign w:val="center"/>
+          </w:tcPr>
+          <w:p>
+            <w:pPr>
+              <w:spacing w:line="240" w:lineRule="auto"/>
+              <w:jc w:val="left"/>
+            </w:pPr>
+            <w:r>
+              <w:rPr>
+                <w:rFonts w:ascii="Times New Roman" w:cs="Times New Roman" w:eastAsia="Times New Roman" w:hAnsi="Times New Roman"/>
+                <w:b w:val="false"/>
+                <w:bCs w:val="false"/>
+                <w:sz w:val="20"/>
+                <w:szCs w:val="20"/>
+              </w:rPr>
+              <w:t xml:space="preserve">Kit de desenvolvimento — placa eletrônica pronta, destinada à prototipagem, que já inclui o microcontrolador e a interface USB.</w:t>
+            </w:r>
+          </w:p>
+        </w:tc>
+      </w:tr>
+      <w:tr>
+        <w:tc>
+          <w:tcPr>
+            <w:tcW w:type="dxa" w:w="3000"/>
+            <w:tcMar>
+              <w:top w:type="dxa" w:w="60"/>
+              <w:left w:type="dxa" w:w="100"/>
+              <w:bottom w:type="dxa" w:w="60"/>
+              <w:right w:type="dxa" w:w="100"/>
+            </w:tcMar>
+            <w:vAlign w:val="center"/>
+          </w:tcPr>
+          <w:p>
+            <w:pPr>
+              <w:spacing w:line="240" w:lineRule="auto"/>
+              <w:jc w:val="left"/>
+            </w:pPr>
+            <w:r>
+              <w:rPr>
+                <w:rFonts w:ascii="Times New Roman" w:cs="Times New Roman" w:eastAsia="Times New Roman" w:hAnsi="Times New Roman"/>
+                <w:b w:val="false"/>
+                <w:bCs w:val="false"/>
+                <w:sz w:val="20"/>
+                <w:szCs w:val="20"/>
+              </w:rPr>
+              <w:t xml:space="preserve">Drift</w:t>
+            </w:r>
+          </w:p>
+        </w:tc>
+        <w:tc>
+          <w:tcPr>
+            <w:tcW w:type="dxa" w:w="6070"/>
+            <w:tcMar>
+              <w:top w:type="dxa" w:w="60"/>
+              <w:left w:type="dxa" w:w="100"/>
+              <w:bottom w:type="dxa" w:w="60"/>
+              <w:right w:type="dxa" w:w="100"/>
+            </w:tcMar>
+            <w:vAlign w:val="center"/>
+          </w:tcPr>
+          <w:p>
+            <w:pPr>
+              <w:spacing w:line="240" w:lineRule="auto"/>
+              <w:jc w:val="left"/>
+            </w:pPr>
+            <w:r>
+              <w:rPr>
+                <w:rFonts w:ascii="Times New Roman" w:cs="Times New Roman" w:eastAsia="Times New Roman" w:hAnsi="Times New Roman"/>
+                <w:b w:val="false"/>
+                <w:bCs w:val="false"/>
+                <w:sz w:val="20"/>
+                <w:szCs w:val="20"/>
+              </w:rPr>
+              <w:t xml:space="preserve">Desvio, deriva — erro que cresce continuamente com o tempo, característico da integração de sinais de giroscópio.</w:t>
+            </w:r>
+          </w:p>
+        </w:tc>
+      </w:tr>
+      <w:tr>
+        <w:tc>
+          <w:tcPr>
+            <w:tcW w:type="dxa" w:w="3000"/>
+            <w:tcMar>
+              <w:top w:type="dxa" w:w="60"/>
+              <w:left w:type="dxa" w:w="100"/>
+              <w:bottom w:type="dxa" w:w="60"/>
+              <w:right w:type="dxa" w:w="100"/>
+            </w:tcMar>
+            <w:vAlign w:val="center"/>
+          </w:tcPr>
+          <w:p>
+            <w:pPr>
+              <w:spacing w:line="240" w:lineRule="auto"/>
+              <w:jc w:val="left"/>
+            </w:pPr>
+            <w:r>
+              <w:rPr>
+                <w:rFonts w:ascii="Times New Roman" w:cs="Times New Roman" w:eastAsia="Times New Roman" w:hAnsi="Times New Roman"/>
+                <w:b w:val="false"/>
+                <w:bCs w:val="false"/>
+                <w:sz w:val="20"/>
+                <w:szCs w:val="20"/>
+              </w:rPr>
+              <w:t xml:space="preserve">Driver</w:t>
+            </w:r>
+          </w:p>
+        </w:tc>
+        <w:tc>
+          <w:tcPr>
+            <w:tcW w:type="dxa" w:w="6070"/>
+            <w:tcMar>
+              <w:top w:type="dxa" w:w="60"/>
+              <w:left w:type="dxa" w:w="100"/>
+              <w:bottom w:type="dxa" w:w="60"/>
+              <w:right w:type="dxa" w:w="100"/>
+            </w:tcMar>
+            <w:vAlign w:val="center"/>
+          </w:tcPr>
+          <w:p>
+            <w:pPr>
+              <w:spacing w:line="240" w:lineRule="auto"/>
+              <w:jc w:val="left"/>
+            </w:pPr>
+            <w:r>
+              <w:rPr>
+                <w:rFonts w:ascii="Times New Roman" w:cs="Times New Roman" w:eastAsia="Times New Roman" w:hAnsi="Times New Roman"/>
+                <w:b w:val="false"/>
+                <w:bCs w:val="false"/>
+                <w:sz w:val="20"/>
+                <w:szCs w:val="20"/>
+              </w:rPr>
+              <w:t xml:space="preserve">Driver, controlador de dispositivo — camada de software que opera diretamente o hardware (por exemplo, o driver do MPU6050).</w:t>
+            </w:r>
+          </w:p>
+        </w:tc>
+      </w:tr>
+      <w:tr>
+        <w:tc>
+          <w:tcPr>
+            <w:tcW w:type="dxa" w:w="3000"/>
+            <w:tcMar>
+              <w:top w:type="dxa" w:w="60"/>
+              <w:left w:type="dxa" w:w="100"/>
+              <w:bottom w:type="dxa" w:w="60"/>
+              <w:right w:type="dxa" w:w="100"/>
+            </w:tcMar>
+            <w:vAlign w:val="center"/>
+          </w:tcPr>
+          <w:p>
+            <w:pPr>
+              <w:spacing w:line="240" w:lineRule="auto"/>
+              <w:jc w:val="left"/>
+            </w:pPr>
+            <w:r>
+              <w:rPr>
+                <w:rFonts w:ascii="Times New Roman" w:cs="Times New Roman" w:eastAsia="Times New Roman" w:hAnsi="Times New Roman"/>
+                <w:b w:val="false"/>
+                <w:bCs w:val="false"/>
+                <w:sz w:val="20"/>
+                <w:szCs w:val="20"/>
+              </w:rPr>
+              <w:t xml:space="preserve">Firmware</w:t>
+            </w:r>
+          </w:p>
+        </w:tc>
+        <w:tc>
+          <w:tcPr>
+            <w:tcW w:type="dxa" w:w="6070"/>
+            <w:tcMar>
+              <w:top w:type="dxa" w:w="60"/>
+              <w:left w:type="dxa" w:w="100"/>
+              <w:bottom w:type="dxa" w:w="60"/>
+              <w:right w:type="dxa" w:w="100"/>
+            </w:tcMar>
+            <w:vAlign w:val="center"/>
+          </w:tcPr>
+          <w:p>
+            <w:pPr>
+              <w:spacing w:line="240" w:lineRule="auto"/>
+              <w:jc w:val="left"/>
+            </w:pPr>
+            <w:r>
+              <w:rPr>
+                <w:rFonts w:ascii="Times New Roman" w:cs="Times New Roman" w:eastAsia="Times New Roman" w:hAnsi="Times New Roman"/>
+                <w:b w:val="false"/>
+                <w:bCs w:val="false"/>
+                <w:sz w:val="20"/>
+                <w:szCs w:val="20"/>
+              </w:rPr>
+              <w:t xml:space="preserve">Firmware — software embarcado que controla diretamente o hardware do microcontrolador.</w:t>
+            </w:r>
+          </w:p>
+        </w:tc>
+      </w:tr>
+      <w:tr>
+        <w:tc>
+          <w:tcPr>
+            <w:tcW w:type="dxa" w:w="3000"/>
+            <w:tcMar>
+              <w:top w:type="dxa" w:w="60"/>
+              <w:left w:type="dxa" w:w="100"/>
+              <w:bottom w:type="dxa" w:w="60"/>
+              <w:right w:type="dxa" w:w="100"/>
+            </w:tcMar>
+            <w:vAlign w:val="center"/>
+          </w:tcPr>
+          <w:p>
+            <w:pPr>
+              <w:spacing w:line="240" w:lineRule="auto"/>
+              <w:jc w:val="left"/>
+            </w:pPr>
+            <w:r>
+              <w:rPr>
+                <w:rFonts w:ascii="Times New Roman" w:cs="Times New Roman" w:eastAsia="Times New Roman" w:hAnsi="Times New Roman"/>
+                <w:b w:val="false"/>
+                <w:bCs w:val="false"/>
+                <w:sz w:val="20"/>
+                <w:szCs w:val="20"/>
+              </w:rPr>
+              <w:t xml:space="preserve">Framework</w:t>
+            </w:r>
+          </w:p>
+        </w:tc>
+        <w:tc>
+          <w:tcPr>
+            <w:tcW w:type="dxa" w:w="6070"/>
+            <w:tcMar>
+              <w:top w:type="dxa" w:w="60"/>
+              <w:left w:type="dxa" w:w="100"/>
+              <w:bottom w:type="dxa" w:w="60"/>
+              <w:right w:type="dxa" w:w="100"/>
+            </w:tcMar>
+            <w:vAlign w:val="center"/>
+          </w:tcPr>
+          <w:p>
+            <w:pPr>
+              <w:spacing w:line="240" w:lineRule="auto"/>
+              <w:jc w:val="left"/>
+            </w:pPr>
+            <w:r>
+              <w:rPr>
+                <w:rFonts w:ascii="Times New Roman" w:cs="Times New Roman" w:eastAsia="Times New Roman" w:hAnsi="Times New Roman"/>
+                <w:b w:val="false"/>
+                <w:bCs w:val="false"/>
+                <w:sz w:val="20"/>
+                <w:szCs w:val="20"/>
+              </w:rPr>
+              <w:t xml:space="preserve">Arcabouço de desenvolvimento — conjunto de bibliotecas e convenções que estrutura o código (neste projeto, o framework Arduino).</w:t>
+            </w:r>
+          </w:p>
+        </w:tc>
+      </w:tr>
+      <w:tr>
+        <w:tc>
+          <w:tcPr>
+            <w:tcW w:type="dxa" w:w="3000"/>
+            <w:tcMar>
+              <w:top w:type="dxa" w:w="60"/>
+              <w:left w:type="dxa" w:w="100"/>
+              <w:bottom w:type="dxa" w:w="60"/>
+              <w:right w:type="dxa" w:w="100"/>
+            </w:tcMar>
+            <w:vAlign w:val="center"/>
+          </w:tcPr>
+          <w:p>
+            <w:pPr>
+              <w:spacing w:line="240" w:lineRule="auto"/>
+              <w:jc w:val="left"/>
+            </w:pPr>
+            <w:r>
+              <w:rPr>
+                <w:rFonts w:ascii="Times New Roman" w:cs="Times New Roman" w:eastAsia="Times New Roman" w:hAnsi="Times New Roman"/>
+                <w:b w:val="false"/>
+                <w:bCs w:val="false"/>
+                <w:sz w:val="20"/>
+                <w:szCs w:val="20"/>
+              </w:rPr>
+              <w:t xml:space="preserve">Hardware</w:t>
+            </w:r>
+          </w:p>
+        </w:tc>
+        <w:tc>
+          <w:tcPr>
+            <w:tcW w:type="dxa" w:w="6070"/>
+            <w:tcMar>
+              <w:top w:type="dxa" w:w="60"/>
+              <w:left w:type="dxa" w:w="100"/>
+              <w:bottom w:type="dxa" w:w="60"/>
+              <w:right w:type="dxa" w:w="100"/>
+            </w:tcMar>
+            <w:vAlign w:val="center"/>
+          </w:tcPr>
+          <w:p>
+            <w:pPr>
+              <w:spacing w:line="240" w:lineRule="auto"/>
+              <w:jc w:val="left"/>
+            </w:pPr>
+            <w:r>
+              <w:rPr>
+                <w:rFonts w:ascii="Times New Roman" w:cs="Times New Roman" w:eastAsia="Times New Roman" w:hAnsi="Times New Roman"/>
+                <w:b w:val="false"/>
+                <w:bCs w:val="false"/>
+                <w:sz w:val="20"/>
+                <w:szCs w:val="20"/>
+              </w:rPr>
+              <w:t xml:space="preserve">Hardware — componentes físicos do sistema (placa, sensor, fiação).</w:t>
+            </w:r>
+          </w:p>
+        </w:tc>
+      </w:tr>
+      <w:tr>
+        <w:tc>
+          <w:tcPr>
+            <w:tcW w:type="dxa" w:w="3000"/>
+            <w:tcMar>
+              <w:top w:type="dxa" w:w="60"/>
+              <w:left w:type="dxa" w:w="100"/>
+              <w:bottom w:type="dxa" w:w="60"/>
+              <w:right w:type="dxa" w:w="100"/>
+            </w:tcMar>
+            <w:vAlign w:val="center"/>
+          </w:tcPr>
+          <w:p>
+            <w:pPr>
+              <w:spacing w:line="240" w:lineRule="auto"/>
+              <w:jc w:val="left"/>
+            </w:pPr>
+            <w:r>
+              <w:rPr>
+                <w:rFonts w:ascii="Times New Roman" w:cs="Times New Roman" w:eastAsia="Times New Roman" w:hAnsi="Times New Roman"/>
+                <w:b w:val="false"/>
+                <w:bCs w:val="false"/>
+                <w:sz w:val="20"/>
+                <w:szCs w:val="20"/>
+              </w:rPr>
+              <w:t xml:space="preserve">Notify (notificação BLE)</w:t>
+            </w:r>
+          </w:p>
+        </w:tc>
+        <w:tc>
+          <w:tcPr>
+            <w:tcW w:type="dxa" w:w="6070"/>
+            <w:tcMar>
+              <w:top w:type="dxa" w:w="60"/>
+              <w:left w:type="dxa" w:w="100"/>
+              <w:bottom w:type="dxa" w:w="60"/>
+              <w:right w:type="dxa" w:w="100"/>
+            </w:tcMar>
+            <w:vAlign w:val="center"/>
+          </w:tcPr>
+          <w:p>
+            <w:pPr>
+              <w:spacing w:line="240" w:lineRule="auto"/>
+              <w:jc w:val="left"/>
+            </w:pPr>
+            <w:r>
+              <w:rPr>
+                <w:rFonts w:ascii="Times New Roman" w:cs="Times New Roman" w:eastAsia="Times New Roman" w:hAnsi="Times New Roman"/>
+                <w:b w:val="false"/>
+                <w:bCs w:val="false"/>
+                <w:sz w:val="20"/>
+                <w:szCs w:val="20"/>
+              </w:rPr>
+              <w:t xml:space="preserve">Notificação — envio assíncrono de dado pelo servidor BLE ao cliente, sem que este solicite explicitamente cada leitura.</w:t>
+            </w:r>
+          </w:p>
+        </w:tc>
+      </w:tr>
+      <w:tr>
+        <w:tc>
+          <w:tcPr>
+            <w:tcW w:type="dxa" w:w="3000"/>
+            <w:tcMar>
+              <w:top w:type="dxa" w:w="60"/>
+              <w:left w:type="dxa" w:w="100"/>
+              <w:bottom w:type="dxa" w:w="60"/>
+              <w:right w:type="dxa" w:w="100"/>
+            </w:tcMar>
+            <w:vAlign w:val="center"/>
+          </w:tcPr>
+          <w:p>
+            <w:pPr>
+              <w:spacing w:line="240" w:lineRule="auto"/>
+              <w:jc w:val="left"/>
+            </w:pPr>
+            <w:r>
+              <w:rPr>
+                <w:rFonts w:ascii="Times New Roman" w:cs="Times New Roman" w:eastAsia="Times New Roman" w:hAnsi="Times New Roman"/>
+                <w:b w:val="false"/>
+                <w:bCs w:val="false"/>
+                <w:sz w:val="20"/>
+                <w:szCs w:val="20"/>
+              </w:rPr>
+              <w:t xml:space="preserve">Offset</w:t>
+            </w:r>
+          </w:p>
+        </w:tc>
+        <w:tc>
+          <w:tcPr>
+            <w:tcW w:type="dxa" w:w="6070"/>
+            <w:tcMar>
+              <w:top w:type="dxa" w:w="60"/>
+              <w:left w:type="dxa" w:w="100"/>
+              <w:bottom w:type="dxa" w:w="60"/>
+              <w:right w:type="dxa" w:w="100"/>
+            </w:tcMar>
+            <w:vAlign w:val="center"/>
+          </w:tcPr>
+          <w:p>
+            <w:pPr>
+              <w:spacing w:line="240" w:lineRule="auto"/>
+              <w:jc w:val="left"/>
+            </w:pPr>
+            <w:r>
+              <w:rPr>
+                <w:rFonts w:ascii="Times New Roman" w:cs="Times New Roman" w:eastAsia="Times New Roman" w:hAnsi="Times New Roman"/>
+                <w:b w:val="false"/>
+                <w:bCs w:val="false"/>
+                <w:sz w:val="20"/>
+                <w:szCs w:val="20"/>
+              </w:rPr>
+              <w:t xml:space="preserve">Deslocamento, desvio de referência — valor somado ou subtraído a uma leitura para calibrar o zero de uma medição.</w:t>
+            </w:r>
+          </w:p>
+        </w:tc>
+      </w:tr>
+      <w:tr>
+        <w:tc>
+          <w:tcPr>
+            <w:tcW w:type="dxa" w:w="3000"/>
+            <w:tcMar>
+              <w:top w:type="dxa" w:w="60"/>
+              <w:left w:type="dxa" w:w="100"/>
+              <w:bottom w:type="dxa" w:w="60"/>
+              <w:right w:type="dxa" w:w="100"/>
+            </w:tcMar>
+            <w:vAlign w:val="center"/>
+          </w:tcPr>
+          <w:p>
+            <w:pPr>
+              <w:spacing w:line="240" w:lineRule="auto"/>
+              <w:jc w:val="left"/>
+            </w:pPr>
+            <w:r>
+              <w:rPr>
+                <w:rFonts w:ascii="Times New Roman" w:cs="Times New Roman" w:eastAsia="Times New Roman" w:hAnsi="Times New Roman"/>
+                <w:b w:val="false"/>
+                <w:bCs w:val="false"/>
+                <w:sz w:val="20"/>
+                <w:szCs w:val="20"/>
+              </w:rPr>
+              <w:t xml:space="preserve">Pan</w:t>
+            </w:r>
+          </w:p>
+        </w:tc>
+        <w:tc>
+          <w:tcPr>
+            <w:tcW w:type="dxa" w:w="6070"/>
+            <w:tcMar>
+              <w:top w:type="dxa" w:w="60"/>
+              <w:left w:type="dxa" w:w="100"/>
+              <w:bottom w:type="dxa" w:w="60"/>
+              <w:right w:type="dxa" w:w="100"/>
+            </w:tcMar>
+            <w:vAlign w:val="center"/>
+          </w:tcPr>
+          <w:p>
+            <w:pPr>
+              <w:spacing w:line="240" w:lineRule="auto"/>
+              <w:jc w:val="left"/>
+            </w:pPr>
+            <w:r>
+              <w:rPr>
+                <w:rFonts w:ascii="Times New Roman" w:cs="Times New Roman" w:eastAsia="Times New Roman" w:hAnsi="Times New Roman"/>
+                <w:b w:val="false"/>
+                <w:bCs w:val="false"/>
+                <w:sz w:val="20"/>
+                <w:szCs w:val="20"/>
+              </w:rPr>
+              <w:t xml:space="preserve">Pan, azimute — rotação em torno do eixo vertical.</w:t>
+            </w:r>
+          </w:p>
+        </w:tc>
+      </w:tr>
+      <w:tr>
+        <w:tc>
+          <w:tcPr>
+            <w:tcW w:type="dxa" w:w="3000"/>
+            <w:tcMar>
+              <w:top w:type="dxa" w:w="60"/>
+              <w:left w:type="dxa" w:w="100"/>
+              <w:bottom w:type="dxa" w:w="60"/>
+              <w:right w:type="dxa" w:w="100"/>
+            </w:tcMar>
+            <w:vAlign w:val="center"/>
+          </w:tcPr>
+          <w:p>
+            <w:pPr>
+              <w:spacing w:line="240" w:lineRule="auto"/>
+              <w:jc w:val="left"/>
+            </w:pPr>
+            <w:r>
+              <w:rPr>
+                <w:rFonts w:ascii="Times New Roman" w:cs="Times New Roman" w:eastAsia="Times New Roman" w:hAnsi="Times New Roman"/>
+                <w:b w:val="false"/>
+                <w:bCs w:val="false"/>
+                <w:sz w:val="20"/>
+                <w:szCs w:val="20"/>
+              </w:rPr>
+              <w:t xml:space="preserve">Peripheral (BLE)</w:t>
+            </w:r>
+          </w:p>
+        </w:tc>
+        <w:tc>
+          <w:tcPr>
+            <w:tcW w:type="dxa" w:w="6070"/>
+            <w:tcMar>
+              <w:top w:type="dxa" w:w="60"/>
+              <w:left w:type="dxa" w:w="100"/>
+              <w:bottom w:type="dxa" w:w="60"/>
+              <w:right w:type="dxa" w:w="100"/>
+            </w:tcMar>
+            <w:vAlign w:val="center"/>
+          </w:tcPr>
+          <w:p>
+            <w:pPr>
+              <w:spacing w:line="240" w:lineRule="auto"/>
+              <w:jc w:val="left"/>
+            </w:pPr>
+            <w:r>
+              <w:rPr>
+                <w:rFonts w:ascii="Times New Roman" w:cs="Times New Roman" w:eastAsia="Times New Roman" w:hAnsi="Times New Roman"/>
+                <w:b w:val="false"/>
+                <w:bCs w:val="false"/>
+                <w:sz w:val="20"/>
+                <w:szCs w:val="20"/>
+              </w:rPr>
+              <w:t xml:space="preserve">Periférico — papel do dispositivo que anuncia sua presença e aceita conexões BLE (neste projeto, o ESP32).</w:t>
+            </w:r>
+          </w:p>
+        </w:tc>
+      </w:tr>
+      <w:tr>
+        <w:tc>
+          <w:tcPr>
+            <w:tcW w:type="dxa" w:w="3000"/>
+            <w:tcMar>
+              <w:top w:type="dxa" w:w="60"/>
+              <w:left w:type="dxa" w:w="100"/>
+              <w:bottom w:type="dxa" w:w="60"/>
+              <w:right w:type="dxa" w:w="100"/>
+            </w:tcMar>
+            <w:vAlign w:val="center"/>
+          </w:tcPr>
+          <w:p>
+            <w:pPr>
+              <w:spacing w:line="240" w:lineRule="auto"/>
+              <w:jc w:val="left"/>
+            </w:pPr>
+            <w:r>
+              <w:rPr>
+                <w:rFonts w:ascii="Times New Roman" w:cs="Times New Roman" w:eastAsia="Times New Roman" w:hAnsi="Times New Roman"/>
+                <w:b w:val="false"/>
+                <w:bCs w:val="false"/>
+                <w:sz w:val="20"/>
+                <w:szCs w:val="20"/>
+              </w:rPr>
+              <w:t xml:space="preserve">Polling</w:t>
+            </w:r>
+          </w:p>
+        </w:tc>
+        <w:tc>
+          <w:tcPr>
+            <w:tcW w:type="dxa" w:w="6070"/>
+            <w:tcMar>
+              <w:top w:type="dxa" w:w="60"/>
+              <w:left w:type="dxa" w:w="100"/>
+              <w:bottom w:type="dxa" w:w="60"/>
+              <w:right w:type="dxa" w:w="100"/>
+            </w:tcMar>
+            <w:vAlign w:val="center"/>
+          </w:tcPr>
+          <w:p>
+            <w:pPr>
+              <w:spacing w:line="240" w:lineRule="auto"/>
+              <w:jc w:val="left"/>
+            </w:pPr>
+            <w:r>
+              <w:rPr>
+                <w:rFonts w:ascii="Times New Roman" w:cs="Times New Roman" w:eastAsia="Times New Roman" w:hAnsi="Times New Roman"/>
+                <w:b w:val="false"/>
+                <w:bCs w:val="false"/>
+                <w:sz w:val="20"/>
+                <w:szCs w:val="20"/>
+              </w:rPr>
+              <w:t xml:space="preserve">Sondagem — consulta periódica e repetida a uma fonte de dados, em vez de aguardar um evento assíncrono.</w:t>
+            </w:r>
+          </w:p>
+        </w:tc>
+      </w:tr>
+      <w:tr>
+        <w:tc>
+          <w:tcPr>
+            <w:tcW w:type="dxa" w:w="3000"/>
+            <w:tcMar>
+              <w:top w:type="dxa" w:w="60"/>
+              <w:left w:type="dxa" w:w="100"/>
+              <w:bottom w:type="dxa" w:w="60"/>
+              <w:right w:type="dxa" w:w="100"/>
+            </w:tcMar>
+            <w:vAlign w:val="center"/>
+          </w:tcPr>
+          <w:p>
+            <w:pPr>
+              <w:spacing w:line="240" w:lineRule="auto"/>
+              <w:jc w:val="left"/>
+            </w:pPr>
+            <w:r>
+              <w:rPr>
+                <w:rFonts w:ascii="Times New Roman" w:cs="Times New Roman" w:eastAsia="Times New Roman" w:hAnsi="Times New Roman"/>
+                <w:b w:val="false"/>
+                <w:bCs w:val="false"/>
+                <w:sz w:val="20"/>
+                <w:szCs w:val="20"/>
+              </w:rPr>
+              <w:t xml:space="preserve">Power bank</w:t>
+            </w:r>
+          </w:p>
+        </w:tc>
+        <w:tc>
+          <w:tcPr>
+            <w:tcW w:type="dxa" w:w="6070"/>
+            <w:tcMar>
+              <w:top w:type="dxa" w:w="60"/>
+              <w:left w:type="dxa" w:w="100"/>
+              <w:bottom w:type="dxa" w:w="60"/>
+              <w:right w:type="dxa" w:w="100"/>
+            </w:tcMar>
+            <w:vAlign w:val="center"/>
+          </w:tcPr>
+          <w:p>
+            <w:pPr>
+              <w:spacing w:line="240" w:lineRule="auto"/>
+              <w:jc w:val="left"/>
+            </w:pPr>
+            <w:r>
+              <w:rPr>
+                <w:rFonts w:ascii="Times New Roman" w:cs="Times New Roman" w:eastAsia="Times New Roman" w:hAnsi="Times New Roman"/>
+                <w:b w:val="false"/>
+                <w:bCs w:val="false"/>
+                <w:sz w:val="20"/>
+                <w:szCs w:val="20"/>
+              </w:rPr>
+              <w:t xml:space="preserve">Bateria portátil — carregador externo recarregável, usado aqui como fonte alternativa de alimentação.</w:t>
+            </w:r>
+          </w:p>
+        </w:tc>
+      </w:tr>
+      <w:tr>
+        <w:tc>
+          <w:tcPr>
+            <w:tcW w:type="dxa" w:w="3000"/>
+            <w:tcMar>
+              <w:top w:type="dxa" w:w="60"/>
+              <w:left w:type="dxa" w:w="100"/>
+              <w:bottom w:type="dxa" w:w="60"/>
+              <w:right w:type="dxa" w:w="100"/>
+            </w:tcMar>
+            <w:vAlign w:val="center"/>
+          </w:tcPr>
+          <w:p>
+            <w:pPr>
+              <w:spacing w:line="240" w:lineRule="auto"/>
+              <w:jc w:val="left"/>
+            </w:pPr>
+            <w:r>
+              <w:rPr>
+                <w:rFonts w:ascii="Times New Roman" w:cs="Times New Roman" w:eastAsia="Times New Roman" w:hAnsi="Times New Roman"/>
+                <w:b w:val="false"/>
+                <w:bCs w:val="false"/>
+                <w:sz w:val="20"/>
+                <w:szCs w:val="20"/>
+              </w:rPr>
+              <w:t xml:space="preserve">Random walk</w:t>
+            </w:r>
+          </w:p>
+        </w:tc>
+        <w:tc>
+          <w:tcPr>
+            <w:tcW w:type="dxa" w:w="6070"/>
+            <w:tcMar>
+              <w:top w:type="dxa" w:w="60"/>
+              <w:left w:type="dxa" w:w="100"/>
+              <w:bottom w:type="dxa" w:w="60"/>
+              <w:right w:type="dxa" w:w="100"/>
+            </w:tcMar>
+            <w:vAlign w:val="center"/>
+          </w:tcPr>
+          <w:p>
+            <w:pPr>
+              <w:spacing w:line="240" w:lineRule="auto"/>
+              <w:jc w:val="left"/>
+            </w:pPr>
+            <w:r>
+              <w:rPr>
+                <w:rFonts w:ascii="Times New Roman" w:cs="Times New Roman" w:eastAsia="Times New Roman" w:hAnsi="Times New Roman"/>
+                <w:b w:val="false"/>
+                <w:bCs w:val="false"/>
+                <w:sz w:val="20"/>
+                <w:szCs w:val="20"/>
+              </w:rPr>
+              <w:t xml:space="preserve">Passeio aleatório — processo estocástico cujo desvio típico cresce com a raiz do tempo; resultado da integração de ruído branco.</w:t>
+            </w:r>
+          </w:p>
+        </w:tc>
+      </w:tr>
+      <w:tr>
+        <w:tc>
+          <w:tcPr>
+            <w:tcW w:type="dxa" w:w="3000"/>
+            <w:tcMar>
+              <w:top w:type="dxa" w:w="60"/>
+              <w:left w:type="dxa" w:w="100"/>
+              <w:bottom w:type="dxa" w:w="60"/>
+              <w:right w:type="dxa" w:w="100"/>
+            </w:tcMar>
+            <w:vAlign w:val="center"/>
+          </w:tcPr>
+          <w:p>
+            <w:pPr>
+              <w:spacing w:line="240" w:lineRule="auto"/>
+              <w:jc w:val="left"/>
+            </w:pPr>
+            <w:r>
+              <w:rPr>
+                <w:rFonts w:ascii="Times New Roman" w:cs="Times New Roman" w:eastAsia="Times New Roman" w:hAnsi="Times New Roman"/>
+                <w:b w:val="false"/>
+                <w:bCs w:val="false"/>
+                <w:sz w:val="20"/>
+                <w:szCs w:val="20"/>
+              </w:rPr>
+              <w:t xml:space="preserve">Scan (varredura BLE)</w:t>
+            </w:r>
+          </w:p>
+        </w:tc>
+        <w:tc>
+          <w:tcPr>
+            <w:tcW w:type="dxa" w:w="6070"/>
+            <w:tcMar>
+              <w:top w:type="dxa" w:w="60"/>
+              <w:left w:type="dxa" w:w="100"/>
+              <w:bottom w:type="dxa" w:w="60"/>
+              <w:right w:type="dxa" w:w="100"/>
+            </w:tcMar>
+            <w:vAlign w:val="center"/>
+          </w:tcPr>
+          <w:p>
+            <w:pPr>
+              <w:spacing w:line="240" w:lineRule="auto"/>
+              <w:jc w:val="left"/>
+            </w:pPr>
+            <w:r>
+              <w:rPr>
+                <w:rFonts w:ascii="Times New Roman" w:cs="Times New Roman" w:eastAsia="Times New Roman" w:hAnsi="Times New Roman"/>
+                <w:b w:val="false"/>
+                <w:bCs w:val="false"/>
+                <w:sz w:val="20"/>
+                <w:szCs w:val="20"/>
+              </w:rPr>
+              <w:t xml:space="preserve">Varredura — busca por dispositivos que estão anunciando via BLE nas proximidades.</w:t>
+            </w:r>
+          </w:p>
+        </w:tc>
+      </w:tr>
+      <w:tr>
+        <w:tc>
+          <w:tcPr>
+            <w:tcW w:type="dxa" w:w="3000"/>
+            <w:tcMar>
+              <w:top w:type="dxa" w:w="60"/>
+              <w:left w:type="dxa" w:w="100"/>
+              <w:bottom w:type="dxa" w:w="60"/>
+              <w:right w:type="dxa" w:w="100"/>
+            </w:tcMar>
+            <w:vAlign w:val="center"/>
+          </w:tcPr>
+          <w:p>
+            <w:pPr>
+              <w:spacing w:line="240" w:lineRule="auto"/>
+              <w:jc w:val="left"/>
+            </w:pPr>
+            <w:r>
+              <w:rPr>
+                <w:rFonts w:ascii="Times New Roman" w:cs="Times New Roman" w:eastAsia="Times New Roman" w:hAnsi="Times New Roman"/>
+                <w:b w:val="false"/>
+                <w:bCs w:val="false"/>
+                <w:sz w:val="20"/>
+                <w:szCs w:val="20"/>
+              </w:rPr>
+              <w:t xml:space="preserve">Service (BLE)</w:t>
+            </w:r>
+          </w:p>
+        </w:tc>
+        <w:tc>
+          <w:tcPr>
+            <w:tcW w:type="dxa" w:w="6070"/>
+            <w:tcMar>
+              <w:top w:type="dxa" w:w="60"/>
+              <w:left w:type="dxa" w:w="100"/>
+              <w:bottom w:type="dxa" w:w="60"/>
+              <w:right w:type="dxa" w:w="100"/>
+            </w:tcMar>
+            <w:vAlign w:val="center"/>
+          </w:tcPr>
+          <w:p>
+            <w:pPr>
+              <w:spacing w:line="240" w:lineRule="auto"/>
+              <w:jc w:val="left"/>
+            </w:pPr>
+            <w:r>
+              <w:rPr>
+                <w:rFonts w:ascii="Times New Roman" w:cs="Times New Roman" w:eastAsia="Times New Roman" w:hAnsi="Times New Roman"/>
+                <w:b w:val="false"/>
+                <w:bCs w:val="false"/>
+                <w:sz w:val="20"/>
+                <w:szCs w:val="20"/>
+              </w:rPr>
+              <w:t xml:space="preserve">Serviço — agrupamento lógico de características em um servidor BLE.</w:t>
+            </w:r>
+          </w:p>
+        </w:tc>
+      </w:tr>
+      <w:tr>
+        <w:tc>
+          <w:tcPr>
+            <w:tcW w:type="dxa" w:w="3000"/>
+            <w:tcMar>
+              <w:top w:type="dxa" w:w="60"/>
+              <w:left w:type="dxa" w:w="100"/>
+              <w:bottom w:type="dxa" w:w="60"/>
+              <w:right w:type="dxa" w:w="100"/>
+            </w:tcMar>
+            <w:vAlign w:val="center"/>
+          </w:tcPr>
+          <w:p>
+            <w:pPr>
+              <w:spacing w:line="240" w:lineRule="auto"/>
+              <w:jc w:val="left"/>
+            </w:pPr>
+            <w:r>
+              <w:rPr>
+                <w:rFonts w:ascii="Times New Roman" w:cs="Times New Roman" w:eastAsia="Times New Roman" w:hAnsi="Times New Roman"/>
+                <w:b w:val="false"/>
+                <w:bCs w:val="false"/>
+                <w:sz w:val="20"/>
+                <w:szCs w:val="20"/>
+              </w:rPr>
+              <w:t xml:space="preserve">Software</w:t>
+            </w:r>
+          </w:p>
+        </w:tc>
+        <w:tc>
+          <w:tcPr>
+            <w:tcW w:type="dxa" w:w="6070"/>
+            <w:tcMar>
+              <w:top w:type="dxa" w:w="60"/>
+              <w:left w:type="dxa" w:w="100"/>
+              <w:bottom w:type="dxa" w:w="60"/>
+              <w:right w:type="dxa" w:w="100"/>
+            </w:tcMar>
+            <w:vAlign w:val="center"/>
+          </w:tcPr>
+          <w:p>
+            <w:pPr>
+              <w:spacing w:line="240" w:lineRule="auto"/>
+              <w:jc w:val="left"/>
+            </w:pPr>
+            <w:r>
+              <w:rPr>
+                <w:rFonts w:ascii="Times New Roman" w:cs="Times New Roman" w:eastAsia="Times New Roman" w:hAnsi="Times New Roman"/>
+                <w:b w:val="false"/>
+                <w:bCs w:val="false"/>
+                <w:sz w:val="20"/>
+                <w:szCs w:val="20"/>
+              </w:rPr>
+              <w:t xml:space="preserve">Software — programas de computador, em oposição aos componentes físicos (hardware).</w:t>
+            </w:r>
+          </w:p>
+        </w:tc>
+      </w:tr>
+      <w:tr>
+        <w:tc>
+          <w:tcPr>
+            <w:tcW w:type="dxa" w:w="3000"/>
+            <w:tcMar>
+              <w:top w:type="dxa" w:w="60"/>
+              <w:left w:type="dxa" w:w="100"/>
+              <w:bottom w:type="dxa" w:w="60"/>
+              <w:right w:type="dxa" w:w="100"/>
+            </w:tcMar>
+            <w:vAlign w:val="center"/>
+          </w:tcPr>
+          <w:p>
+            <w:pPr>
+              <w:spacing w:line="240" w:lineRule="auto"/>
+              <w:jc w:val="left"/>
+            </w:pPr>
+            <w:r>
+              <w:rPr>
+                <w:rFonts w:ascii="Times New Roman" w:cs="Times New Roman" w:eastAsia="Times New Roman" w:hAnsi="Times New Roman"/>
+                <w:b w:val="false"/>
+                <w:bCs w:val="false"/>
+                <w:sz w:val="20"/>
+                <w:szCs w:val="20"/>
+              </w:rPr>
+              <w:t xml:space="preserve">Tilt</w:t>
+            </w:r>
+          </w:p>
+        </w:tc>
+        <w:tc>
+          <w:tcPr>
+            <w:tcW w:type="dxa" w:w="6070"/>
+            <w:tcMar>
+              <w:top w:type="dxa" w:w="60"/>
+              <w:left w:type="dxa" w:w="100"/>
+              <w:bottom w:type="dxa" w:w="60"/>
+              <w:right w:type="dxa" w:w="100"/>
+            </w:tcMar>
+            <w:vAlign w:val="center"/>
+          </w:tcPr>
+          <w:p>
+            <w:pPr>
+              <w:spacing w:line="240" w:lineRule="auto"/>
+              <w:jc w:val="left"/>
+            </w:pPr>
+            <w:r>
+              <w:rPr>
+                <w:rFonts w:ascii="Times New Roman" w:cs="Times New Roman" w:eastAsia="Times New Roman" w:hAnsi="Times New Roman"/>
+                <w:b w:val="false"/>
+                <w:bCs w:val="false"/>
+                <w:sz w:val="20"/>
+                <w:szCs w:val="20"/>
+              </w:rPr>
+              <w:t xml:space="preserve">Tilt, inclinação — rotação em torno do eixo horizontal, medida pelo acelerômetro.</w:t>
+            </w:r>
+          </w:p>
+        </w:tc>
+      </w:tr>
+      <w:tr>
+        <w:tc>
+          <w:tcPr>
+            <w:tcW w:type="dxa" w:w="3000"/>
+            <w:tcMar>
+              <w:top w:type="dxa" w:w="60"/>
+              <w:left w:type="dxa" w:w="100"/>
+              <w:bottom w:type="dxa" w:w="60"/>
+              <w:right w:type="dxa" w:w="100"/>
+            </w:tcMar>
+            <w:vAlign w:val="center"/>
+          </w:tcPr>
+          <w:p>
+            <w:pPr>
+              <w:spacing w:line="240" w:lineRule="auto"/>
+              <w:jc w:val="left"/>
+            </w:pPr>
+            <w:r>
+              <w:rPr>
+                <w:rFonts w:ascii="Times New Roman" w:cs="Times New Roman" w:eastAsia="Times New Roman" w:hAnsi="Times New Roman"/>
+                <w:b w:val="false"/>
+                <w:bCs w:val="false"/>
+                <w:sz w:val="20"/>
+                <w:szCs w:val="20"/>
+              </w:rPr>
+              <w:t xml:space="preserve">Timeout</w:t>
+            </w:r>
+          </w:p>
+        </w:tc>
+        <w:tc>
+          <w:tcPr>
+            <w:tcW w:type="dxa" w:w="6070"/>
+            <w:tcMar>
+              <w:top w:type="dxa" w:w="60"/>
+              <w:left w:type="dxa" w:w="100"/>
+              <w:bottom w:type="dxa" w:w="60"/>
+              <w:right w:type="dxa" w:w="100"/>
+            </w:tcMar>
+            <w:vAlign w:val="center"/>
+          </w:tcPr>
+          <w:p>
+            <w:pPr>
+              <w:spacing w:line="240" w:lineRule="auto"/>
+              <w:jc w:val="left"/>
+            </w:pPr>
+            <w:r>
+              <w:rPr>
+                <w:rFonts w:ascii="Times New Roman" w:cs="Times New Roman" w:eastAsia="Times New Roman" w:hAnsi="Times New Roman"/>
+                <w:b w:val="false"/>
+                <w:bCs w:val="false"/>
+                <w:sz w:val="20"/>
+                <w:szCs w:val="20"/>
+              </w:rPr>
+              <w:t xml:space="preserve">Tempo limite — intervalo máximo de espera antes de uma operação ser considerada como falha.</w:t>
+            </w:r>
+          </w:p>
+        </w:tc>
+      </w:tr>
+      <w:tr>
+        <w:tc>
+          <w:tcPr>
+            <w:tcW w:type="dxa" w:w="3000"/>
+            <w:tcMar>
+              <w:top w:type="dxa" w:w="60"/>
+              <w:left w:type="dxa" w:w="100"/>
+              <w:bottom w:type="dxa" w:w="60"/>
+              <w:right w:type="dxa" w:w="100"/>
+            </w:tcMar>
+            <w:vAlign w:val="center"/>
+          </w:tcPr>
+          <w:p>
+            <w:pPr>
+              <w:spacing w:line="240" w:lineRule="auto"/>
+              <w:jc w:val="left"/>
+            </w:pPr>
+            <w:r>
+              <w:rPr>
+                <w:rFonts w:ascii="Times New Roman" w:cs="Times New Roman" w:eastAsia="Times New Roman" w:hAnsi="Times New Roman"/>
+                <w:b w:val="false"/>
+                <w:bCs w:val="false"/>
+                <w:sz w:val="20"/>
+                <w:szCs w:val="20"/>
+              </w:rPr>
+              <w:t xml:space="preserve">Toolchain</w:t>
+            </w:r>
+          </w:p>
+        </w:tc>
+        <w:tc>
+          <w:tcPr>
+            <w:tcW w:type="dxa" w:w="6070"/>
+            <w:tcMar>
+              <w:top w:type="dxa" w:w="60"/>
+              <w:left w:type="dxa" w:w="100"/>
+              <w:bottom w:type="dxa" w:w="60"/>
+              <w:right w:type="dxa" w:w="100"/>
+            </w:tcMar>
+            <w:vAlign w:val="center"/>
+          </w:tcPr>
+          <w:p>
+            <w:pPr>
+              <w:spacing w:line="240" w:lineRule="auto"/>
+              <w:jc w:val="left"/>
+            </w:pPr>
+            <w:r>
+              <w:rPr>
+                <w:rFonts w:ascii="Times New Roman" w:cs="Times New Roman" w:eastAsia="Times New Roman" w:hAnsi="Times New Roman"/>
+                <w:b w:val="false"/>
+                <w:bCs w:val="false"/>
+                <w:sz w:val="20"/>
+                <w:szCs w:val="20"/>
+              </w:rPr>
+              <w:t xml:space="preserve">Cadeia de ferramentas — conjunto de compilador, ligador (linker) e utilitários usado para compilar o firmware.</w:t>
+            </w:r>
+          </w:p>
+        </w:tc>
+      </w:tr>
+      <w:tr>
+        <w:tc>
+          <w:tcPr>
+            <w:tcW w:type="dxa" w:w="3000"/>
+            <w:tcMar>
+              <w:top w:type="dxa" w:w="60"/>
+              <w:left w:type="dxa" w:w="100"/>
+              <w:bottom w:type="dxa" w:w="60"/>
+              <w:right w:type="dxa" w:w="100"/>
+            </w:tcMar>
+            <w:vAlign w:val="center"/>
+          </w:tcPr>
+          <w:p>
+            <w:pPr>
+              <w:spacing w:line="240" w:lineRule="auto"/>
+              <w:jc w:val="left"/>
+            </w:pPr>
+            <w:r>
+              <w:rPr>
+                <w:rFonts w:ascii="Times New Roman" w:cs="Times New Roman" w:eastAsia="Times New Roman" w:hAnsi="Times New Roman"/>
+                <w:b w:val="false"/>
+                <w:bCs w:val="false"/>
+                <w:sz w:val="20"/>
+                <w:szCs w:val="20"/>
+              </w:rPr>
+              <w:t xml:space="preserve">Upload (gravação de firmware)</w:t>
+            </w:r>
+          </w:p>
+        </w:tc>
+        <w:tc>
+          <w:tcPr>
+            <w:tcW w:type="dxa" w:w="6070"/>
+            <w:tcMar>
+              <w:top w:type="dxa" w:w="60"/>
+              <w:left w:type="dxa" w:w="100"/>
+              <w:bottom w:type="dxa" w:w="60"/>
+              <w:right w:type="dxa" w:w="100"/>
+            </w:tcMar>
+            <w:vAlign w:val="center"/>
+          </w:tcPr>
+          <w:p>
+            <w:pPr>
+              <w:spacing w:line="240" w:lineRule="auto"/>
+              <w:jc w:val="left"/>
+            </w:pPr>
+            <w:r>
+              <w:rPr>
+                <w:rFonts w:ascii="Times New Roman" w:cs="Times New Roman" w:eastAsia="Times New Roman" w:hAnsi="Times New Roman"/>
+                <w:b w:val="false"/>
+                <w:bCs w:val="false"/>
+                <w:sz w:val="20"/>
+                <w:szCs w:val="20"/>
+              </w:rPr>
+              <w:t xml:space="preserve">Gravação — transferência do firmware já compilado para a memória do microcontrolador.</w:t>
+            </w:r>
+          </w:p>
+        </w:tc>
+      </w:tr>
+      <w:tr>
+        <w:tc>
+          <w:tcPr>
+            <w:tcW w:type="dxa" w:w="3000"/>
+            <w:tcMar>
+              <w:top w:type="dxa" w:w="60"/>
+              <w:left w:type="dxa" w:w="100"/>
+              <w:bottom w:type="dxa" w:w="60"/>
+              <w:right w:type="dxa" w:w="100"/>
+            </w:tcMar>
+            <w:vAlign w:val="center"/>
+          </w:tcPr>
+          <w:p>
+            <w:pPr>
+              <w:spacing w:line="240" w:lineRule="auto"/>
+              <w:jc w:val="left"/>
+            </w:pPr>
+            <w:r>
+              <w:rPr>
+                <w:rFonts w:ascii="Times New Roman" w:cs="Times New Roman" w:eastAsia="Times New Roman" w:hAnsi="Times New Roman"/>
+                <w:b w:val="false"/>
+                <w:bCs w:val="false"/>
+                <w:sz w:val="20"/>
+                <w:szCs w:val="20"/>
+              </w:rPr>
+              <w:t xml:space="preserve">ZUPT</w:t>
+            </w:r>
+          </w:p>
+        </w:tc>
+        <w:tc>
+          <w:tcPr>
+            <w:tcW w:type="dxa" w:w="6070"/>
+            <w:tcMar>
+              <w:top w:type="dxa" w:w="60"/>
+              <w:left w:type="dxa" w:w="100"/>
+              <w:bottom w:type="dxa" w:w="60"/>
+              <w:right w:type="dxa" w:w="100"/>
+            </w:tcMar>
+            <w:vAlign w:val="center"/>
+          </w:tcPr>
+          <w:p>
+            <w:pPr>
+              <w:spacing w:line="240" w:lineRule="auto"/>
+              <w:jc w:val="left"/>
+            </w:pPr>
+            <w:r>
+              <w:rPr>
+                <w:rFonts w:ascii="Times New Roman" w:cs="Times New Roman" w:eastAsia="Times New Roman" w:hAnsi="Times New Roman"/>
+                <w:b w:val="false"/>
+                <w:bCs w:val="false"/>
+                <w:sz w:val="20"/>
+                <w:szCs w:val="20"/>
+              </w:rPr>
+              <w:t xml:space="preserve">Atualização de Taxa/Velocidade Zero — ver Lista de Abreviaturas e Siglas e a seção 4.2.1.</w:t>
+            </w:r>
+          </w:p>
+        </w:tc>
+      </w:tr>
+    </w:tbl>
+    <w:p>
+      <w:pPr>
+        <w:spacing w:after="240" w:before="120"/>
+        <w:jc w:val="left"/>
+      </w:pPr>
+      <w:r>
+        <w:rPr>
+          <w:rFonts w:ascii="Times New Roman" w:cs="Times New Roman" w:eastAsia="Times New Roman" w:hAnsi="Times New Roman"/>
+          <w:sz w:val="20"/>
+          <w:szCs w:val="20"/>
+        </w:rPr>
+        <w:t xml:space="preserve">Tabela — Glossário de termos em inglês empregados neste relatório. Fonte: elaborado pelo autor.</w:t>
       </w:r>
     </w:p>
     <w:p>
@@ -1109,6 +3209,483 @@
           <w:szCs w:val="24"/>
         </w:rPr>
         <w:t xml:space="preserve">— Atualização de Taxa/Velocidade Zero (Zero Velocity/Rate Update)</w:t>
+      </w:r>
+    </w:p>
+    <w:p>
+      <w:r>
+        <w:br w:type="page"/>
+      </w:r>
+    </w:p>
+    <w:p>
+      <w:pPr>
+        <w:pStyle w:val="Heading1"/>
+        <w:spacing w:after="240" w:before="0"/>
+      </w:pPr>
+      <w:r>
+        <w:rPr>
+          <w:rFonts w:ascii="Times New Roman" w:cs="Times New Roman" w:eastAsia="Times New Roman" w:hAnsi="Times New Roman"/>
+          <w:b/>
+          <w:bCs/>
+          <w:sz w:val="24"/>
+          <w:szCs w:val="24"/>
+        </w:rPr>
+        <w:t xml:space="preserve">DOCUMENTOS DE REFERÊNCIA</w:t>
+      </w:r>
+    </w:p>
+    <w:p>
+      <w:pPr>
+        <w:spacing w:after="200" w:before="0" w:line="360" w:lineRule="auto"/>
+        <w:jc w:val="both"/>
+      </w:pPr>
+      <w:r>
+        <w:rPr>
+          <w:rFonts w:ascii="Times New Roman" w:cs="Times New Roman" w:eastAsia="Times New Roman" w:hAnsi="Times New Roman"/>
+          <w:sz w:val="24"/>
+          <w:szCs w:val="24"/>
+        </w:rPr>
+        <w:t xml:space="preserve">Além das referências bibliográficas externas listadas ao final deste relatório (normas, especificações de protocolo e datasheets de componentes), este documento se baseia diretamente nos documentos técnicos a seguir, versionados no mesmo repositório do projeto e mantidos atualizados junto ao código-fonte. Recomenda-se consultá-los para o detalhamento que excede o escopo deste relatório.</w:t>
+      </w:r>
+    </w:p>
+    <w:tbl>
+      <w:tblPr>
+        <w:tblW w:type="dxa" w:w="9070"/>
+        <w:tblBorders>
+          <w:top w:val="single" w:color="444444" w:sz="4"/>
+          <w:left w:val="single" w:color="444444" w:sz="4"/>
+          <w:bottom w:val="single" w:color="444444" w:sz="4"/>
+          <w:right w:val="single" w:color="444444" w:sz="4"/>
+          <w:insideH w:val="single" w:color="888888" w:sz="2"/>
+          <w:insideV w:val="single" w:color="888888" w:sz="2"/>
+        </w:tblBorders>
+      </w:tblPr>
+      <w:tblGrid>
+        <w:gridCol w:w="2900"/>
+        <w:gridCol w:w="6170"/>
+      </w:tblGrid>
+      <w:tr>
+        <w:trPr>
+          <w:tblHeader/>
+        </w:trPr>
+        <w:tc>
+          <w:tcPr>
+            <w:tcW w:type="dxa" w:w="2900"/>
+            <w:shd w:fill="D9D9D9" w:val="clear"/>
+            <w:tcMar>
+              <w:top w:type="dxa" w:w="60"/>
+              <w:left w:type="dxa" w:w="100"/>
+              <w:bottom w:type="dxa" w:w="60"/>
+              <w:right w:type="dxa" w:w="100"/>
+            </w:tcMar>
+            <w:vAlign w:val="center"/>
+          </w:tcPr>
+          <w:p>
+            <w:pPr>
+              <w:spacing w:line="240" w:lineRule="auto"/>
+              <w:jc w:val="center"/>
+            </w:pPr>
+            <w:r>
+              <w:rPr>
+                <w:rFonts w:ascii="Times New Roman" w:cs="Times New Roman" w:eastAsia="Times New Roman" w:hAnsi="Times New Roman"/>
+                <w:b/>
+                <w:bCs/>
+                <w:sz w:val="20"/>
+                <w:szCs w:val="20"/>
+              </w:rPr>
+              <w:t xml:space="preserve">Documento</w:t>
+            </w:r>
+          </w:p>
+        </w:tc>
+        <w:tc>
+          <w:tcPr>
+            <w:tcW w:type="dxa" w:w="6170"/>
+            <w:shd w:fill="D9D9D9" w:val="clear"/>
+            <w:tcMar>
+              <w:top w:type="dxa" w:w="60"/>
+              <w:left w:type="dxa" w:w="100"/>
+              <w:bottom w:type="dxa" w:w="60"/>
+              <w:right w:type="dxa" w:w="100"/>
+            </w:tcMar>
+            <w:vAlign w:val="center"/>
+          </w:tcPr>
+          <w:p>
+            <w:pPr>
+              <w:spacing w:line="240" w:lineRule="auto"/>
+              <w:jc w:val="center"/>
+            </w:pPr>
+            <w:r>
+              <w:rPr>
+                <w:rFonts w:ascii="Times New Roman" w:cs="Times New Roman" w:eastAsia="Times New Roman" w:hAnsi="Times New Roman"/>
+                <w:b/>
+                <w:bCs/>
+                <w:sz w:val="20"/>
+                <w:szCs w:val="20"/>
+              </w:rPr>
+              <w:t xml:space="preserve">Descrição</w:t>
+            </w:r>
+          </w:p>
+        </w:tc>
+      </w:tr>
+      <w:tr>
+        <w:tc>
+          <w:tcPr>
+            <w:tcW w:type="dxa" w:w="2900"/>
+            <w:tcMar>
+              <w:top w:type="dxa" w:w="60"/>
+              <w:left w:type="dxa" w:w="100"/>
+              <w:bottom w:type="dxa" w:w="60"/>
+              <w:right w:type="dxa" w:w="100"/>
+            </w:tcMar>
+            <w:vAlign w:val="center"/>
+          </w:tcPr>
+          <w:p>
+            <w:pPr>
+              <w:spacing w:line="240" w:lineRule="auto"/>
+              <w:jc w:val="left"/>
+            </w:pPr>
+            <w:r>
+              <w:rPr>
+                <w:rFonts w:ascii="Times New Roman" w:cs="Times New Roman" w:eastAsia="Times New Roman" w:hAnsi="Times New Roman"/>
+                <w:b w:val="false"/>
+                <w:bCs w:val="false"/>
+                <w:sz w:val="20"/>
+                <w:szCs w:val="20"/>
+              </w:rPr>
+              <w:t xml:space="preserve">firmware/README.md</w:t>
+            </w:r>
+          </w:p>
+        </w:tc>
+        <w:tc>
+          <w:tcPr>
+            <w:tcW w:type="dxa" w:w="6170"/>
+            <w:tcMar>
+              <w:top w:type="dxa" w:w="60"/>
+              <w:left w:type="dxa" w:w="100"/>
+              <w:bottom w:type="dxa" w:w="60"/>
+              <w:right w:type="dxa" w:w="100"/>
+            </w:tcMar>
+            <w:vAlign w:val="center"/>
+          </w:tcPr>
+          <w:p>
+            <w:pPr>
+              <w:spacing w:line="240" w:lineRule="auto"/>
+              <w:jc w:val="left"/>
+            </w:pPr>
+            <w:r>
+              <w:rPr>
+                <w:rFonts w:ascii="Times New Roman" w:cs="Times New Roman" w:eastAsia="Times New Roman" w:hAnsi="Times New Roman"/>
+                <w:b w:val="false"/>
+                <w:bCs w:val="false"/>
+                <w:sz w:val="20"/>
+                <w:szCs w:val="20"/>
+              </w:rPr>
+              <w:t xml:space="preserve">Documentação do firmware do ESP32: estrutura de módulos, contrato Modbus RTU/BLE e histórico de versões.</w:t>
+            </w:r>
+          </w:p>
+        </w:tc>
+      </w:tr>
+      <w:tr>
+        <w:tc>
+          <w:tcPr>
+            <w:tcW w:type="dxa" w:w="2900"/>
+            <w:tcMar>
+              <w:top w:type="dxa" w:w="60"/>
+              <w:left w:type="dxa" w:w="100"/>
+              <w:bottom w:type="dxa" w:w="60"/>
+              <w:right w:type="dxa" w:w="100"/>
+            </w:tcMar>
+            <w:vAlign w:val="center"/>
+          </w:tcPr>
+          <w:p>
+            <w:pPr>
+              <w:spacing w:line="240" w:lineRule="auto"/>
+              <w:jc w:val="left"/>
+            </w:pPr>
+            <w:r>
+              <w:rPr>
+                <w:rFonts w:ascii="Times New Roman" w:cs="Times New Roman" w:eastAsia="Times New Roman" w:hAnsi="Times New Roman"/>
+                <w:b w:val="false"/>
+                <w:bCs w:val="false"/>
+                <w:sz w:val="20"/>
+                <w:szCs w:val="20"/>
+              </w:rPr>
+              <w:t xml:space="preserve">firmware/src/Config.h</w:t>
+            </w:r>
+          </w:p>
+        </w:tc>
+        <w:tc>
+          <w:tcPr>
+            <w:tcW w:type="dxa" w:w="6170"/>
+            <w:tcMar>
+              <w:top w:type="dxa" w:w="60"/>
+              <w:left w:type="dxa" w:w="100"/>
+              <w:bottom w:type="dxa" w:w="60"/>
+              <w:right w:type="dxa" w:w="100"/>
+            </w:tcMar>
+            <w:vAlign w:val="center"/>
+          </w:tcPr>
+          <w:p>
+            <w:pPr>
+              <w:spacing w:line="240" w:lineRule="auto"/>
+              <w:jc w:val="left"/>
+            </w:pPr>
+            <w:r>
+              <w:rPr>
+                <w:rFonts w:ascii="Times New Roman" w:cs="Times New Roman" w:eastAsia="Times New Roman" w:hAnsi="Times New Roman"/>
+                <w:b w:val="false"/>
+                <w:bCs w:val="false"/>
+                <w:sz w:val="20"/>
+                <w:szCs w:val="20"/>
+              </w:rPr>
+              <w:t xml:space="preserve">Código-fonte com a pinagem e as constantes de protocolo e de calibração — fonte primária dos valores numéricos citados neste relatório.</w:t>
+            </w:r>
+          </w:p>
+        </w:tc>
+      </w:tr>
+      <w:tr>
+        <w:tc>
+          <w:tcPr>
+            <w:tcW w:type="dxa" w:w="2900"/>
+            <w:tcMar>
+              <w:top w:type="dxa" w:w="60"/>
+              <w:left w:type="dxa" w:w="100"/>
+              <w:bottom w:type="dxa" w:w="60"/>
+              <w:right w:type="dxa" w:w="100"/>
+            </w:tcMar>
+            <w:vAlign w:val="center"/>
+          </w:tcPr>
+          <w:p>
+            <w:pPr>
+              <w:spacing w:line="240" w:lineRule="auto"/>
+              <w:jc w:val="left"/>
+            </w:pPr>
+            <w:r>
+              <w:rPr>
+                <w:rFonts w:ascii="Times New Roman" w:cs="Times New Roman" w:eastAsia="Times New Roman" w:hAnsi="Times New Roman"/>
+                <w:b w:val="false"/>
+                <w:bCs w:val="false"/>
+                <w:sz w:val="20"/>
+                <w:szCs w:val="20"/>
+              </w:rPr>
+              <w:t xml:space="preserve">docs/pinout.md</w:t>
+            </w:r>
+          </w:p>
+        </w:tc>
+        <w:tc>
+          <w:tcPr>
+            <w:tcW w:type="dxa" w:w="6170"/>
+            <w:tcMar>
+              <w:top w:type="dxa" w:w="60"/>
+              <w:left w:type="dxa" w:w="100"/>
+              <w:bottom w:type="dxa" w:w="60"/>
+              <w:right w:type="dxa" w:w="100"/>
+            </w:tcMar>
+            <w:vAlign w:val="center"/>
+          </w:tcPr>
+          <w:p>
+            <w:pPr>
+              <w:spacing w:line="240" w:lineRule="auto"/>
+              <w:jc w:val="left"/>
+            </w:pPr>
+            <w:r>
+              <w:rPr>
+                <w:rFonts w:ascii="Times New Roman" w:cs="Times New Roman" w:eastAsia="Times New Roman" w:hAnsi="Times New Roman"/>
+                <w:b w:val="false"/>
+                <w:bCs w:val="false"/>
+                <w:sz w:val="20"/>
+                <w:szCs w:val="20"/>
+              </w:rPr>
+              <w:t xml:space="preserve">Mapeamento completo de pinos do ESP32 e da montagem do sensor MPU6050.</w:t>
+            </w:r>
+          </w:p>
+        </w:tc>
+      </w:tr>
+      <w:tr>
+        <w:tc>
+          <w:tcPr>
+            <w:tcW w:type="dxa" w:w="2900"/>
+            <w:tcMar>
+              <w:top w:type="dxa" w:w="60"/>
+              <w:left w:type="dxa" w:w="100"/>
+              <w:bottom w:type="dxa" w:w="60"/>
+              <w:right w:type="dxa" w:w="100"/>
+            </w:tcMar>
+            <w:vAlign w:val="center"/>
+          </w:tcPr>
+          <w:p>
+            <w:pPr>
+              <w:spacing w:line="240" w:lineRule="auto"/>
+              <w:jc w:val="left"/>
+            </w:pPr>
+            <w:r>
+              <w:rPr>
+                <w:rFonts w:ascii="Times New Roman" w:cs="Times New Roman" w:eastAsia="Times New Roman" w:hAnsi="Times New Roman"/>
+                <w:b w:val="false"/>
+                <w:bCs w:val="false"/>
+                <w:sz w:val="20"/>
+                <w:szCs w:val="20"/>
+              </w:rPr>
+              <w:t xml:space="preserve">docs/fluxograma-python-app.md</w:t>
+            </w:r>
+          </w:p>
+        </w:tc>
+        <w:tc>
+          <w:tcPr>
+            <w:tcW w:type="dxa" w:w="6170"/>
+            <w:tcMar>
+              <w:top w:type="dxa" w:w="60"/>
+              <w:left w:type="dxa" w:w="100"/>
+              <w:bottom w:type="dxa" w:w="60"/>
+              <w:right w:type="dxa" w:w="100"/>
+            </w:tcMar>
+            <w:vAlign w:val="center"/>
+          </w:tcPr>
+          <w:p>
+            <w:pPr>
+              <w:spacing w:line="240" w:lineRule="auto"/>
+              <w:jc w:val="left"/>
+            </w:pPr>
+            <w:r>
+              <w:rPr>
+                <w:rFonts w:ascii="Times New Roman" w:cs="Times New Roman" w:eastAsia="Times New Roman" w:hAnsi="Times New Roman"/>
+                <w:b w:val="false"/>
+                <w:bCs w:val="false"/>
+                <w:sz w:val="20"/>
+                <w:szCs w:val="20"/>
+              </w:rPr>
+              <w:t xml:space="preserve">Fluxograma de funcionamento do software desktop.</w:t>
+            </w:r>
+          </w:p>
+        </w:tc>
+      </w:tr>
+      <w:tr>
+        <w:tc>
+          <w:tcPr>
+            <w:tcW w:type="dxa" w:w="2900"/>
+            <w:tcMar>
+              <w:top w:type="dxa" w:w="60"/>
+              <w:left w:type="dxa" w:w="100"/>
+              <w:bottom w:type="dxa" w:w="60"/>
+              <w:right w:type="dxa" w:w="100"/>
+            </w:tcMar>
+            <w:vAlign w:val="center"/>
+          </w:tcPr>
+          <w:p>
+            <w:pPr>
+              <w:spacing w:line="240" w:lineRule="auto"/>
+              <w:jc w:val="left"/>
+            </w:pPr>
+            <w:r>
+              <w:rPr>
+                <w:rFonts w:ascii="Times New Roman" w:cs="Times New Roman" w:eastAsia="Times New Roman" w:hAnsi="Times New Roman"/>
+                <w:b w:val="false"/>
+                <w:bCs w:val="false"/>
+                <w:sz w:val="20"/>
+                <w:szCs w:val="20"/>
+              </w:rPr>
+              <w:t xml:space="preserve">python-app/README.md</w:t>
+            </w:r>
+          </w:p>
+        </w:tc>
+        <w:tc>
+          <w:tcPr>
+            <w:tcW w:type="dxa" w:w="6170"/>
+            <w:tcMar>
+              <w:top w:type="dxa" w:w="60"/>
+              <w:left w:type="dxa" w:w="100"/>
+              <w:bottom w:type="dxa" w:w="60"/>
+              <w:right w:type="dxa" w:w="100"/>
+            </w:tcMar>
+            <w:vAlign w:val="center"/>
+          </w:tcPr>
+          <w:p>
+            <w:pPr>
+              <w:spacing w:line="240" w:lineRule="auto"/>
+              <w:jc w:val="left"/>
+            </w:pPr>
+            <w:r>
+              <w:rPr>
+                <w:rFonts w:ascii="Times New Roman" w:cs="Times New Roman" w:eastAsia="Times New Roman" w:hAnsi="Times New Roman"/>
+                <w:b w:val="false"/>
+                <w:bCs w:val="false"/>
+                <w:sz w:val="20"/>
+                <w:szCs w:val="20"/>
+              </w:rPr>
+              <w:t xml:space="preserve">Documentação de instalação e uso do software desktop (Python/PyQt5).</w:t>
+            </w:r>
+          </w:p>
+        </w:tc>
+      </w:tr>
+      <w:tr>
+        <w:tc>
+          <w:tcPr>
+            <w:tcW w:type="dxa" w:w="2900"/>
+            <w:tcMar>
+              <w:top w:type="dxa" w:w="60"/>
+              <w:left w:type="dxa" w:w="100"/>
+              <w:bottom w:type="dxa" w:w="60"/>
+              <w:right w:type="dxa" w:w="100"/>
+            </w:tcMar>
+            <w:vAlign w:val="center"/>
+          </w:tcPr>
+          <w:p>
+            <w:pPr>
+              <w:spacing w:line="240" w:lineRule="auto"/>
+              <w:jc w:val="left"/>
+            </w:pPr>
+            <w:r>
+              <w:rPr>
+                <w:rFonts w:ascii="Times New Roman" w:cs="Times New Roman" w:eastAsia="Times New Roman" w:hAnsi="Times New Roman"/>
+                <w:b w:val="false"/>
+                <w:bCs w:val="false"/>
+                <w:sz w:val="20"/>
+                <w:szCs w:val="20"/>
+              </w:rPr>
+              <w:t xml:space="preserve">android-app/README.md</w:t>
+            </w:r>
+          </w:p>
+        </w:tc>
+        <w:tc>
+          <w:tcPr>
+            <w:tcW w:type="dxa" w:w="6170"/>
+            <w:tcMar>
+              <w:top w:type="dxa" w:w="60"/>
+              <w:left w:type="dxa" w:w="100"/>
+              <w:bottom w:type="dxa" w:w="60"/>
+              <w:right w:type="dxa" w:w="100"/>
+            </w:tcMar>
+            <w:vAlign w:val="center"/>
+          </w:tcPr>
+          <w:p>
+            <w:pPr>
+              <w:spacing w:line="240" w:lineRule="auto"/>
+              <w:jc w:val="left"/>
+            </w:pPr>
+            <w:r>
+              <w:rPr>
+                <w:rFonts w:ascii="Times New Roman" w:cs="Times New Roman" w:eastAsia="Times New Roman" w:hAnsi="Times New Roman"/>
+                <w:b w:val="false"/>
+                <w:bCs w:val="false"/>
+                <w:sz w:val="20"/>
+                <w:szCs w:val="20"/>
+              </w:rPr>
+              <w:t xml:space="preserve">Documentação de instalação e uso do aplicativo Android (Kotlin).</w:t>
+            </w:r>
+          </w:p>
+        </w:tc>
+      </w:tr>
+    </w:tbl>
+    <w:p>
+      <w:pPr>
+        <w:spacing w:after="240" w:before="120"/>
+        <w:jc w:val="left"/>
+      </w:pPr>
+      <w:r>
+        <w:rPr>
+          <w:rFonts w:ascii="Times New Roman" w:cs="Times New Roman" w:eastAsia="Times New Roman" w:hAnsi="Times New Roman"/>
+          <w:sz w:val="20"/>
+          <w:szCs w:val="20"/>
+        </w:rPr>
+        <w:t xml:space="preserve">Tabela — Documentos de referência internos ao projeto. Fonte: elaborado pelo autor, com base no repositório do projeto.</w:t>
       </w:r>
     </w:p>
     <w:p>

</xml_diff>

<commit_message>
Atualiza o relatório técnico para a rev. 02, acompanhando o firmware 1.6.0
Reflete as duas mudanças do firmware 1.6.0 que tornavam o relatório
desatualizado: o filtro adaptativo "1-euro" na leitura contínua exibida
na tela (seção 4.3, substituindo a descrição da EMA de constante fixa)
e os extremos (mín./máx.) agora medidos no próprio firmware a 100 Hz,
em caminho de filtragem separado do caminho de exibição (seções 4.3 e
6.2) — com os novos registradores Modbus (2-5, coil 2) e características
BLE (6e6e000b/000c) documentados nas Tabelas 6 e 7. Acrescenta as duas
novas limitações pendentes de confirmação em hardware físico (seção
7.3) e uma linha na tabela de histórico de revisões.

Co-Authored-By: Claude Sonnet 5 <noreply@anthropic.com>
Claude-Session: https://claude.ai/code/session_01VvvtJDPvh4mDoSVpkHza1d
</commit_message>
<xml_diff>
--- a/docs/relatorio-tecnico-inclinometro.docx
+++ b/docs/relatorio-tecnico-inclinometro.docx
@@ -935,6 +935,120 @@
           </w:p>
         </w:tc>
       </w:tr>
+      <w:tr>
+        <w:tc>
+          <w:tcPr>
+            <w:tcW w:type="dxa" w:w="1400"/>
+            <w:tcMar>
+              <w:top w:type="dxa" w:w="60"/>
+              <w:left w:type="dxa" w:w="100"/>
+              <w:bottom w:type="dxa" w:w="60"/>
+              <w:right w:type="dxa" w:w="100"/>
+            </w:tcMar>
+            <w:vAlign w:val="center"/>
+          </w:tcPr>
+          <w:p>
+            <w:pPr>
+              <w:spacing w:line="240" w:lineRule="auto"/>
+              <w:jc w:val="left"/>
+            </w:pPr>
+            <w:r>
+              <w:rPr>
+                <w:rFonts w:ascii="Times New Roman" w:cs="Times New Roman" w:eastAsia="Times New Roman" w:hAnsi="Times New Roman"/>
+                <w:b w:val="false"/>
+                <w:bCs w:val="false"/>
+                <w:sz w:val="20"/>
+                <w:szCs w:val="20"/>
+              </w:rPr>
+              <w:t xml:space="preserve">02</w:t>
+            </w:r>
+          </w:p>
+        </w:tc>
+        <w:tc>
+          <w:tcPr>
+            <w:tcW w:type="dxa" w:w="1600"/>
+            <w:tcMar>
+              <w:top w:type="dxa" w:w="60"/>
+              <w:left w:type="dxa" w:w="100"/>
+              <w:bottom w:type="dxa" w:w="60"/>
+              <w:right w:type="dxa" w:w="100"/>
+            </w:tcMar>
+            <w:vAlign w:val="center"/>
+          </w:tcPr>
+          <w:p>
+            <w:pPr>
+              <w:spacing w:line="240" w:lineRule="auto"/>
+              <w:jc w:val="left"/>
+            </w:pPr>
+            <w:r>
+              <w:rPr>
+                <w:rFonts w:ascii="Times New Roman" w:cs="Times New Roman" w:eastAsia="Times New Roman" w:hAnsi="Times New Roman"/>
+                <w:b w:val="false"/>
+                <w:bCs w:val="false"/>
+                <w:sz w:val="20"/>
+                <w:szCs w:val="20"/>
+              </w:rPr>
+              <w:t xml:space="preserve">18/09/2026</w:t>
+            </w:r>
+          </w:p>
+        </w:tc>
+        <w:tc>
+          <w:tcPr>
+            <w:tcW w:type="dxa" w:w="4670"/>
+            <w:tcMar>
+              <w:top w:type="dxa" w:w="60"/>
+              <w:left w:type="dxa" w:w="100"/>
+              <w:bottom w:type="dxa" w:w="60"/>
+              <w:right w:type="dxa" w:w="100"/>
+            </w:tcMar>
+            <w:vAlign w:val="center"/>
+          </w:tcPr>
+          <w:p>
+            <w:pPr>
+              <w:spacing w:line="240" w:lineRule="auto"/>
+              <w:jc w:val="left"/>
+            </w:pPr>
+            <w:r>
+              <w:rPr>
+                <w:rFonts w:ascii="Times New Roman" w:cs="Times New Roman" w:eastAsia="Times New Roman" w:hAnsi="Times New Roman"/>
+                <w:b w:val="false"/>
+                <w:bCs w:val="false"/>
+                <w:sz w:val="20"/>
+                <w:szCs w:val="20"/>
+              </w:rPr>
+              <w:t xml:space="preserve">Atualização para o firmware 1.6.0: filtro adaptativo "1-euro" na leitura contínua exibida na tela (seção 4.3), e extremos (mín./máx.) passam a ser medidos pelo próprio firmware a 100 Hz, em caminho de filtragem separado do caminho de exibição (seções 4.3, 5.1, 5.2 e 6.2), com os novos registradores/característica de reset de extremos.</w:t>
+            </w:r>
+          </w:p>
+        </w:tc>
+        <w:tc>
+          <w:tcPr>
+            <w:tcW w:type="dxa" w:w="1400"/>
+            <w:tcMar>
+              <w:top w:type="dxa" w:w="60"/>
+              <w:left w:type="dxa" w:w="100"/>
+              <w:bottom w:type="dxa" w:w="60"/>
+              <w:right w:type="dxa" w:w="100"/>
+            </w:tcMar>
+            <w:vAlign w:val="center"/>
+          </w:tcPr>
+          <w:p>
+            <w:pPr>
+              <w:spacing w:line="240" w:lineRule="auto"/>
+              <w:jc w:val="left"/>
+            </w:pPr>
+            <w:r>
+              <w:rPr>
+                <w:rFonts w:ascii="Times New Roman" w:cs="Times New Roman" w:eastAsia="Times New Roman" w:hAnsi="Times New Roman"/>
+                <w:b w:val="false"/>
+                <w:bCs w:val="false"/>
+                <w:sz w:val="20"/>
+                <w:szCs w:val="20"/>
+              </w:rPr>
+              <w:t xml:space="preserve">[NOME DO AUTOR]</w:t>
+            </w:r>
+          </w:p>
+        </w:tc>
+      </w:tr>
     </w:tbl>
     <w:p>
       <w:pPr>
@@ -2095,6 +2209,64 @@
                 <w:szCs w:val="20"/>
               </w:rPr>
               <w:t xml:space="preserve">Pan, azimute — rotação em torno do eixo vertical.</w:t>
+            </w:r>
+          </w:p>
+        </w:tc>
+      </w:tr>
+      <w:tr>
+        <w:tc>
+          <w:tcPr>
+            <w:tcW w:type="dxa" w:w="3000"/>
+            <w:tcMar>
+              <w:top w:type="dxa" w:w="60"/>
+              <w:left w:type="dxa" w:w="100"/>
+              <w:bottom w:type="dxa" w:w="60"/>
+              <w:right w:type="dxa" w:w="100"/>
+            </w:tcMar>
+            <w:vAlign w:val="center"/>
+          </w:tcPr>
+          <w:p>
+            <w:pPr>
+              <w:spacing w:line="240" w:lineRule="auto"/>
+              <w:jc w:val="left"/>
+            </w:pPr>
+            <w:r>
+              <w:rPr>
+                <w:rFonts w:ascii="Times New Roman" w:cs="Times New Roman" w:eastAsia="Times New Roman" w:hAnsi="Times New Roman"/>
+                <w:b w:val="false"/>
+                <w:bCs w:val="false"/>
+                <w:sz w:val="20"/>
+                <w:szCs w:val="20"/>
+              </w:rPr>
+              <w:t xml:space="preserve">Peak-hold</w:t>
+            </w:r>
+          </w:p>
+        </w:tc>
+        <w:tc>
+          <w:tcPr>
+            <w:tcW w:type="dxa" w:w="6070"/>
+            <w:tcMar>
+              <w:top w:type="dxa" w:w="60"/>
+              <w:left w:type="dxa" w:w="100"/>
+              <w:bottom w:type="dxa" w:w="60"/>
+              <w:right w:type="dxa" w:w="100"/>
+            </w:tcMar>
+            <w:vAlign w:val="center"/>
+          </w:tcPr>
+          <w:p>
+            <w:pPr>
+              <w:spacing w:line="240" w:lineRule="auto"/>
+              <w:jc w:val="left"/>
+            </w:pPr>
+            <w:r>
+              <w:rPr>
+                <w:rFonts w:ascii="Times New Roman" w:cs="Times New Roman" w:eastAsia="Times New Roman" w:hAnsi="Times New Roman"/>
+                <w:b w:val="false"/>
+                <w:bCs w:val="false"/>
+                <w:sz w:val="20"/>
+                <w:szCs w:val="20"/>
+              </w:rPr>
+              <w:t xml:space="preserve">Retenção de pico — técnica que registra o maior (ou menor) valor de um sinal observado ao longo do tempo, independentemente do valor instantâneo atual.</w:t>
             </w:r>
           </w:p>
         </w:tc>
@@ -7347,7 +7519,22 @@
           <w:sz w:val="24"/>
           <w:szCs w:val="24"/>
         </w:rPr>
-        <w:t xml:space="preserve">A segunda camada é uma média móvel exponencial (EMA) em software, aplicada à leitura contínua de inclinação (não à captura de vibração, que usa a amostra instantânea, sem filtro, por definição). A cada amostra a 100 Hz, o valor filtrado é atualizado por:</w:t>
+        <w:t xml:space="preserve">A segunda camada é uma média móvel exponencial (EMA) em software, aplicada à mesma amostra de 100 Hz, mas dividida em **dois caminhos independentes** a partir da versão 1.6.0 do firmware — um para a leitura exibida na tela, outro para o rastreamento de extremos (mín./máx.) — porque as duas finalidades têm exigências opostas: a tela precisa de um filtro pesado, para não tremular no degrau de exibição de 0,25°; já o extremo precisa preservar o pico de uma rajada breve, que um filtro pesado achataria. Até a versão 1.4.0, um único filtro (EMA de constante de tempo fixa, τ = 0,5 s) alimentava as duas finalidades, o que subestimava sistematicamente os extremos de eventos curtos — ver seção 6.2.</w:t>
+      </w:r>
+    </w:p>
+    <w:p>
+      <w:pPr>
+        <w:spacing w:after="200" w:before="0" w:line="360" w:lineRule="auto"/>
+        <w:ind w:firstLine="709"/>
+        <w:jc w:val="both"/>
+      </w:pPr>
+      <w:r>
+        <w:rPr>
+          <w:rFonts w:ascii="Times New Roman" w:cs="Times New Roman" w:eastAsia="Times New Roman" w:hAnsi="Times New Roman"/>
+          <w:sz w:val="24"/>
+          <w:szCs w:val="24"/>
+        </w:rPr>
+        <w:t xml:space="preserve">O caminho da tela passou de uma EMA de constante de tempo fixa para um filtro adaptativo "1-euro" (Casiez et al.), cuja frequência de corte sobe quando o ângulo está variando de fato e desce quando o eixo está parado — em vez do compromisso fixo entre estabilidade e velocidade de acomodação da EMA simples:</w:t>
       </w:r>
     </w:p>
     <w:p>
@@ -7361,7 +7548,7 @@
           <w:sz w:val="20"/>
           <w:szCs w:val="20"/>
         </w:rPr>
-        <w:t xml:space="preserve">filtrado_i = filtrado_(i-1) + α · (bruto_i − filtrado_(i-1)),   com   α = Δt / (Δt + τ)</w:t>
+        <w:t xml:space="preserve">filtrado_i = filtrado_(i-1) + α_i · (bruto_i − filtrado_(i-1)),   com   α_i = Δt / (Δt + τ(|dθ/dt|))</w:t>
       </w:r>
     </w:p>
     <w:p>
@@ -7376,7 +7563,22 @@
           <w:sz w:val="24"/>
           <w:szCs w:val="24"/>
         </w:rPr>
-        <w:t xml:space="preserve">em que τ é a constante de tempo do filtro (0,5 s) e Δt é o intervalo de amostragem (10 ms). Com esses valores, o ruído branco de alta frequência é atenuado em aproximadamente dez vezes, com um tempo de acomodação de aproximadamente 0,5 s para acompanhar uma variação real de ângulo — um compromisso entre estabilidade da leitura exibida e responsividade a eventos reais.</w:t>
+        <w:t xml:space="preserve">em que a constante de tempo τ não é mais fixa, e sim função da velocidade angular estimada (ela própria filtrada, com corte de 0,3 Hz, para o ruído não inflar a estimativa e degradar o próprio ganho do filtro). Em simulação da cadeia completa (ruído do MPU6050 → DLPF de 21 Hz → atan2 → filtro), o ruído com o eixo parado caiu de 0,016° para 0,005° RMS, e o tempo para acompanhar 90% de um movimento real caiu de 0,63 s para 0,21 s — uma melhora nos dois eixos ao mesmo tempo, e não uma troca entre eles, precisamente porque os dois regimes (parado/em movimento) passaram a ser tratados separadamente.</w:t>
+      </w:r>
+    </w:p>
+    <w:p>
+      <w:pPr>
+        <w:spacing w:after="200" w:before="0" w:line="360" w:lineRule="auto"/>
+        <w:ind w:firstLine="709"/>
+        <w:jc w:val="both"/>
+      </w:pPr>
+      <w:r>
+        <w:rPr>
+          <w:rFonts w:ascii="Times New Roman" w:cs="Times New Roman" w:eastAsia="Times New Roman" w:hAnsi="Times New Roman"/>
+          <w:sz w:val="24"/>
+          <w:szCs w:val="24"/>
+        </w:rPr>
+        <w:t xml:space="preserve">O caminho do extremo usa, em vez disso, um único polo de corte fixo em 3 Hz (banda física do balanço do mastro, tipicamente 1 a 5 Hz) seguido de um teste de persistência: um novo extremo só é aceito se o sinal filtrado permanecer acima (ou abaixo) do extremo anterior por pelo menos 100 ms (10 amostras a 100 Hz) — o que rejeita o ruído residual do próprio filtro sem descartar uma rajada real. Este caminho é detalhado na seção 6.2, junto com o impacto que a mudança tem no valor final registrado no relatório.</w:t>
       </w:r>
     </w:p>
     <w:p>
@@ -8363,7 +8565,7 @@
                 <w:sz w:val="20"/>
                 <w:szCs w:val="20"/>
               </w:rPr>
-              <w:t xml:space="preserve">Coil 0</w:t>
+              <w:t xml:space="preserve">Input registers 2–5</w:t>
             </w:r>
           </w:p>
         </w:tc>
@@ -8391,7 +8593,7 @@
                 <w:sz w:val="20"/>
                 <w:szCs w:val="20"/>
               </w:rPr>
-              <w:t xml:space="preserve">escrita</w:t>
+              <w:t xml:space="preserve">leitura</w:t>
             </w:r>
           </w:p>
         </w:tc>
@@ -8419,7 +8621,7 @@
                 <w:sz w:val="20"/>
                 <w:szCs w:val="20"/>
               </w:rPr>
-              <w:t xml:space="preserve">true → calibra (zera os dois eixos na posição atual)</w:t>
+              <w:t xml:space="preserve">Extremos medidos pelo firmware (peak-hold), na mesma codificação: tilt mín., tilt máx., pan mín., pan máx. (v1.5.0+)</w:t>
             </w:r>
           </w:p>
         </w:tc>
@@ -8449,6 +8651,92 @@
                 <w:sz w:val="20"/>
                 <w:szCs w:val="20"/>
               </w:rPr>
+              <w:t xml:space="preserve">Coil 0</w:t>
+            </w:r>
+          </w:p>
+        </w:tc>
+        <w:tc>
+          <w:tcPr>
+            <w:tcW w:type="dxa" w:w="1400"/>
+            <w:tcMar>
+              <w:top w:type="dxa" w:w="60"/>
+              <w:left w:type="dxa" w:w="100"/>
+              <w:bottom w:type="dxa" w:w="60"/>
+              <w:right w:type="dxa" w:w="100"/>
+            </w:tcMar>
+            <w:vAlign w:val="center"/>
+          </w:tcPr>
+          <w:p>
+            <w:pPr>
+              <w:spacing w:line="240" w:lineRule="auto"/>
+              <w:jc w:val="left"/>
+            </w:pPr>
+            <w:r>
+              <w:rPr>
+                <w:rFonts w:ascii="Times New Roman" w:cs="Times New Roman" w:eastAsia="Times New Roman" w:hAnsi="Times New Roman"/>
+                <w:b w:val="false"/>
+                <w:bCs w:val="false"/>
+                <w:sz w:val="20"/>
+                <w:szCs w:val="20"/>
+              </w:rPr>
+              <w:t xml:space="preserve">escrita</w:t>
+            </w:r>
+          </w:p>
+        </w:tc>
+        <w:tc>
+          <w:tcPr>
+            <w:tcW w:type="dxa" w:w="5400"/>
+            <w:tcMar>
+              <w:top w:type="dxa" w:w="60"/>
+              <w:left w:type="dxa" w:w="100"/>
+              <w:bottom w:type="dxa" w:w="60"/>
+              <w:right w:type="dxa" w:w="100"/>
+            </w:tcMar>
+            <w:vAlign w:val="center"/>
+          </w:tcPr>
+          <w:p>
+            <w:pPr>
+              <w:spacing w:line="240" w:lineRule="auto"/>
+              <w:jc w:val="left"/>
+            </w:pPr>
+            <w:r>
+              <w:rPr>
+                <w:rFonts w:ascii="Times New Roman" w:cs="Times New Roman" w:eastAsia="Times New Roman" w:hAnsi="Times New Roman"/>
+                <w:b w:val="false"/>
+                <w:bCs w:val="false"/>
+                <w:sz w:val="20"/>
+                <w:szCs w:val="20"/>
+              </w:rPr>
+              <w:t xml:space="preserve">true → calibra (zera os dois eixos e os extremos na posição atual)</w:t>
+            </w:r>
+          </w:p>
+        </w:tc>
+      </w:tr>
+      <w:tr>
+        <w:tc>
+          <w:tcPr>
+            <w:tcW w:type="dxa" w:w="2400"/>
+            <w:tcMar>
+              <w:top w:type="dxa" w:w="60"/>
+              <w:left w:type="dxa" w:w="100"/>
+              <w:bottom w:type="dxa" w:w="60"/>
+              <w:right w:type="dxa" w:w="100"/>
+            </w:tcMar>
+            <w:vAlign w:val="center"/>
+          </w:tcPr>
+          <w:p>
+            <w:pPr>
+              <w:spacing w:line="240" w:lineRule="auto"/>
+              <w:jc w:val="left"/>
+            </w:pPr>
+            <w:r>
+              <w:rPr>
+                <w:rFonts w:ascii="Times New Roman" w:cs="Times New Roman" w:eastAsia="Times New Roman" w:hAnsi="Times New Roman"/>
+                <w:b w:val="false"/>
+                <w:bCs w:val="false"/>
+                <w:sz w:val="20"/>
+                <w:szCs w:val="20"/>
+              </w:rPr>
               <w:t xml:space="preserve">Coil 1</w:t>
             </w:r>
           </w:p>
@@ -8506,6 +8794,92 @@
                 <w:szCs w:val="20"/>
               </w:rPr>
               <w:t xml:space="preserve">true → inicia captura de vibração</w:t>
+            </w:r>
+          </w:p>
+        </w:tc>
+      </w:tr>
+      <w:tr>
+        <w:tc>
+          <w:tcPr>
+            <w:tcW w:type="dxa" w:w="2400"/>
+            <w:tcMar>
+              <w:top w:type="dxa" w:w="60"/>
+              <w:left w:type="dxa" w:w="100"/>
+              <w:bottom w:type="dxa" w:w="60"/>
+              <w:right w:type="dxa" w:w="100"/>
+            </w:tcMar>
+            <w:vAlign w:val="center"/>
+          </w:tcPr>
+          <w:p>
+            <w:pPr>
+              <w:spacing w:line="240" w:lineRule="auto"/>
+              <w:jc w:val="left"/>
+            </w:pPr>
+            <w:r>
+              <w:rPr>
+                <w:rFonts w:ascii="Times New Roman" w:cs="Times New Roman" w:eastAsia="Times New Roman" w:hAnsi="Times New Roman"/>
+                <w:b w:val="false"/>
+                <w:bCs w:val="false"/>
+                <w:sz w:val="20"/>
+                <w:szCs w:val="20"/>
+              </w:rPr>
+              <w:t xml:space="preserve">Coil 2</w:t>
+            </w:r>
+          </w:p>
+        </w:tc>
+        <w:tc>
+          <w:tcPr>
+            <w:tcW w:type="dxa" w:w="1400"/>
+            <w:tcMar>
+              <w:top w:type="dxa" w:w="60"/>
+              <w:left w:type="dxa" w:w="100"/>
+              <w:bottom w:type="dxa" w:w="60"/>
+              <w:right w:type="dxa" w:w="100"/>
+            </w:tcMar>
+            <w:vAlign w:val="center"/>
+          </w:tcPr>
+          <w:p>
+            <w:pPr>
+              <w:spacing w:line="240" w:lineRule="auto"/>
+              <w:jc w:val="left"/>
+            </w:pPr>
+            <w:r>
+              <w:rPr>
+                <w:rFonts w:ascii="Times New Roman" w:cs="Times New Roman" w:eastAsia="Times New Roman" w:hAnsi="Times New Roman"/>
+                <w:b w:val="false"/>
+                <w:bCs w:val="false"/>
+                <w:sz w:val="20"/>
+                <w:szCs w:val="20"/>
+              </w:rPr>
+              <w:t xml:space="preserve">escrita</w:t>
+            </w:r>
+          </w:p>
+        </w:tc>
+        <w:tc>
+          <w:tcPr>
+            <w:tcW w:type="dxa" w:w="5400"/>
+            <w:tcMar>
+              <w:top w:type="dxa" w:w="60"/>
+              <w:left w:type="dxa" w:w="100"/>
+              <w:bottom w:type="dxa" w:w="60"/>
+              <w:right w:type="dxa" w:w="100"/>
+            </w:tcMar>
+            <w:vAlign w:val="center"/>
+          </w:tcPr>
+          <w:p>
+            <w:pPr>
+              <w:spacing w:line="240" w:lineRule="auto"/>
+              <w:jc w:val="left"/>
+            </w:pPr>
+            <w:r>
+              <w:rPr>
+                <w:rFonts w:ascii="Times New Roman" w:cs="Times New Roman" w:eastAsia="Times New Roman" w:hAnsi="Times New Roman"/>
+                <w:b w:val="false"/>
+                <w:bCs w:val="false"/>
+                <w:sz w:val="20"/>
+                <w:szCs w:val="20"/>
+              </w:rPr>
+              <w:t xml:space="preserve">true → esquece os extremos, sem alterar o zero (v1.5.0+)</w:t>
             </w:r>
           </w:p>
         </w:tc>
@@ -9955,6 +10329,264 @@
           </w:p>
         </w:tc>
       </w:tr>
+      <w:tr>
+        <w:tc>
+          <w:tcPr>
+            <w:tcW w:type="dxa" w:w="3600"/>
+            <w:tcMar>
+              <w:top w:type="dxa" w:w="60"/>
+              <w:left w:type="dxa" w:w="100"/>
+              <w:bottom w:type="dxa" w:w="60"/>
+              <w:right w:type="dxa" w:w="100"/>
+            </w:tcMar>
+            <w:vAlign w:val="center"/>
+          </w:tcPr>
+          <w:p>
+            <w:pPr>
+              <w:spacing w:line="240" w:lineRule="auto"/>
+              <w:jc w:val="left"/>
+            </w:pPr>
+            <w:r>
+              <w:rPr>
+                <w:rFonts w:ascii="Times New Roman" w:cs="Times New Roman" w:eastAsia="Times New Roman" w:hAnsi="Times New Roman"/>
+                <w:b w:val="false"/>
+                <w:bCs w:val="false"/>
+                <w:sz w:val="20"/>
+                <w:szCs w:val="20"/>
+              </w:rPr>
+              <w:t xml:space="preserve">6e6e000a-... (retransmissão vibração)</w:t>
+            </w:r>
+          </w:p>
+        </w:tc>
+        <w:tc>
+          <w:tcPr>
+            <w:tcW w:type="dxa" w:w="2200"/>
+            <w:tcMar>
+              <w:top w:type="dxa" w:w="60"/>
+              <w:left w:type="dxa" w:w="100"/>
+              <w:bottom w:type="dxa" w:w="60"/>
+              <w:right w:type="dxa" w:w="100"/>
+            </w:tcMar>
+            <w:vAlign w:val="center"/>
+          </w:tcPr>
+          <w:p>
+            <w:pPr>
+              <w:spacing w:line="240" w:lineRule="auto"/>
+              <w:jc w:val="left"/>
+            </w:pPr>
+            <w:r>
+              <w:rPr>
+                <w:rFonts w:ascii="Times New Roman" w:cs="Times New Roman" w:eastAsia="Times New Roman" w:hAnsi="Times New Roman"/>
+                <w:b w:val="false"/>
+                <w:bCs w:val="false"/>
+                <w:sz w:val="20"/>
+                <w:szCs w:val="20"/>
+              </w:rPr>
+              <w:t xml:space="preserve">escrita</w:t>
+            </w:r>
+          </w:p>
+        </w:tc>
+        <w:tc>
+          <w:tcPr>
+            <w:tcW w:type="dxa" w:w="3400"/>
+            <w:tcMar>
+              <w:top w:type="dxa" w:w="60"/>
+              <w:left w:type="dxa" w:w="100"/>
+              <w:bottom w:type="dxa" w:w="60"/>
+              <w:right w:type="dxa" w:w="100"/>
+            </w:tcMar>
+            <w:vAlign w:val="center"/>
+          </w:tcPr>
+          <w:p>
+            <w:pPr>
+              <w:spacing w:line="240" w:lineRule="auto"/>
+              <w:jc w:val="left"/>
+            </w:pPr>
+            <w:r>
+              <w:rPr>
+                <w:rFonts w:ascii="Times New Roman" w:cs="Times New Roman" w:eastAsia="Times New Roman" w:hAnsi="Times New Roman"/>
+                <w:b w:val="false"/>
+                <w:bCs w:val="false"/>
+                <w:sz w:val="20"/>
+                <w:szCs w:val="20"/>
+              </w:rPr>
+              <w:t xml:space="preserve">3 bytes: índice inicial + eixo (0=tilt, 1=pan) → reenvia amostras a partir dali (v1.4.0+)</w:t>
+            </w:r>
+          </w:p>
+        </w:tc>
+      </w:tr>
+      <w:tr>
+        <w:tc>
+          <w:tcPr>
+            <w:tcW w:type="dxa" w:w="3600"/>
+            <w:tcMar>
+              <w:top w:type="dxa" w:w="60"/>
+              <w:left w:type="dxa" w:w="100"/>
+              <w:bottom w:type="dxa" w:w="60"/>
+              <w:right w:type="dxa" w:w="100"/>
+            </w:tcMar>
+            <w:vAlign w:val="center"/>
+          </w:tcPr>
+          <w:p>
+            <w:pPr>
+              <w:spacing w:line="240" w:lineRule="auto"/>
+              <w:jc w:val="left"/>
+            </w:pPr>
+            <w:r>
+              <w:rPr>
+                <w:rFonts w:ascii="Times New Roman" w:cs="Times New Roman" w:eastAsia="Times New Roman" w:hAnsi="Times New Roman"/>
+                <w:b w:val="false"/>
+                <w:bCs w:val="false"/>
+                <w:sz w:val="20"/>
+                <w:szCs w:val="20"/>
+              </w:rPr>
+              <w:t xml:space="preserve">6e6e000b-... (resetar extremos)</w:t>
+            </w:r>
+          </w:p>
+        </w:tc>
+        <w:tc>
+          <w:tcPr>
+            <w:tcW w:type="dxa" w:w="2200"/>
+            <w:tcMar>
+              <w:top w:type="dxa" w:w="60"/>
+              <w:left w:type="dxa" w:w="100"/>
+              <w:bottom w:type="dxa" w:w="60"/>
+              <w:right w:type="dxa" w:w="100"/>
+            </w:tcMar>
+            <w:vAlign w:val="center"/>
+          </w:tcPr>
+          <w:p>
+            <w:pPr>
+              <w:spacing w:line="240" w:lineRule="auto"/>
+              <w:jc w:val="left"/>
+            </w:pPr>
+            <w:r>
+              <w:rPr>
+                <w:rFonts w:ascii="Times New Roman" w:cs="Times New Roman" w:eastAsia="Times New Roman" w:hAnsi="Times New Roman"/>
+                <w:b w:val="false"/>
+                <w:bCs w:val="false"/>
+                <w:sz w:val="20"/>
+                <w:szCs w:val="20"/>
+              </w:rPr>
+              <w:t xml:space="preserve">escrita</w:t>
+            </w:r>
+          </w:p>
+        </w:tc>
+        <w:tc>
+          <w:tcPr>
+            <w:tcW w:type="dxa" w:w="3400"/>
+            <w:tcMar>
+              <w:top w:type="dxa" w:w="60"/>
+              <w:left w:type="dxa" w:w="100"/>
+              <w:bottom w:type="dxa" w:w="60"/>
+              <w:right w:type="dxa" w:w="100"/>
+            </w:tcMar>
+            <w:vAlign w:val="center"/>
+          </w:tcPr>
+          <w:p>
+            <w:pPr>
+              <w:spacing w:line="240" w:lineRule="auto"/>
+              <w:jc w:val="left"/>
+            </w:pPr>
+            <w:r>
+              <w:rPr>
+                <w:rFonts w:ascii="Times New Roman" w:cs="Times New Roman" w:eastAsia="Times New Roman" w:hAnsi="Times New Roman"/>
+                <w:b w:val="false"/>
+                <w:bCs w:val="false"/>
+                <w:sz w:val="20"/>
+                <w:szCs w:val="20"/>
+              </w:rPr>
+              <w:t xml:space="preserve">Byte 0x01 → esquece os extremos, sem alterar o zero (v1.5.0+)</w:t>
+            </w:r>
+          </w:p>
+        </w:tc>
+      </w:tr>
+      <w:tr>
+        <w:tc>
+          <w:tcPr>
+            <w:tcW w:type="dxa" w:w="3600"/>
+            <w:tcMar>
+              <w:top w:type="dxa" w:w="60"/>
+              <w:left w:type="dxa" w:w="100"/>
+              <w:bottom w:type="dxa" w:w="60"/>
+              <w:right w:type="dxa" w:w="100"/>
+            </w:tcMar>
+            <w:vAlign w:val="center"/>
+          </w:tcPr>
+          <w:p>
+            <w:pPr>
+              <w:spacing w:line="240" w:lineRule="auto"/>
+              <w:jc w:val="left"/>
+            </w:pPr>
+            <w:r>
+              <w:rPr>
+                <w:rFonts w:ascii="Times New Roman" w:cs="Times New Roman" w:eastAsia="Times New Roman" w:hAnsi="Times New Roman"/>
+                <w:b w:val="false"/>
+                <w:bCs w:val="false"/>
+                <w:sz w:val="20"/>
+                <w:szCs w:val="20"/>
+              </w:rPr>
+              <w:t xml:space="preserve">6e6e000c-... (extremos)</w:t>
+            </w:r>
+          </w:p>
+        </w:tc>
+        <w:tc>
+          <w:tcPr>
+            <w:tcW w:type="dxa" w:w="2200"/>
+            <w:tcMar>
+              <w:top w:type="dxa" w:w="60"/>
+              <w:left w:type="dxa" w:w="100"/>
+              <w:bottom w:type="dxa" w:w="60"/>
+              <w:right w:type="dxa" w:w="100"/>
+            </w:tcMar>
+            <w:vAlign w:val="center"/>
+          </w:tcPr>
+          <w:p>
+            <w:pPr>
+              <w:spacing w:line="240" w:lineRule="auto"/>
+              <w:jc w:val="left"/>
+            </w:pPr>
+            <w:r>
+              <w:rPr>
+                <w:rFonts w:ascii="Times New Roman" w:cs="Times New Roman" w:eastAsia="Times New Roman" w:hAnsi="Times New Roman"/>
+                <w:b w:val="false"/>
+                <w:bCs w:val="false"/>
+                <w:sz w:val="20"/>
+                <w:szCs w:val="20"/>
+              </w:rPr>
+              <w:t xml:space="preserve">leitura/notificação</w:t>
+            </w:r>
+          </w:p>
+        </w:tc>
+        <w:tc>
+          <w:tcPr>
+            <w:tcW w:type="dxa" w:w="3400"/>
+            <w:tcMar>
+              <w:top w:type="dxa" w:w="60"/>
+              <w:left w:type="dxa" w:w="100"/>
+              <w:bottom w:type="dxa" w:w="60"/>
+              <w:right w:type="dxa" w:w="100"/>
+            </w:tcMar>
+            <w:vAlign w:val="center"/>
+          </w:tcPr>
+          <w:p>
+            <w:pPr>
+              <w:spacing w:line="240" w:lineRule="auto"/>
+              <w:jc w:val="left"/>
+            </w:pPr>
+            <w:r>
+              <w:rPr>
+                <w:rFonts w:ascii="Times New Roman" w:cs="Times New Roman" w:eastAsia="Times New Roman" w:hAnsi="Times New Roman"/>
+                <w:b w:val="false"/>
+                <w:bCs w:val="false"/>
+                <w:sz w:val="20"/>
+                <w:szCs w:val="20"/>
+              </w:rPr>
+              <w:t xml:space="preserve">8 bytes = 4 inteiros de 16 bits × 100: tilt mín., tilt máx., pan mín., pan máx.; notifica só quando o valor muda (v1.5.0+)</w:t>
+            </w:r>
+          </w:p>
+        </w:tc>
+      </w:tr>
     </w:tbl>
     <w:p>
       <w:pPr>
@@ -10013,7 +10645,7 @@
           <w:sz w:val="24"/>
           <w:szCs w:val="24"/>
         </w:rPr>
-        <w:t xml:space="preserve">Ambos os aplicativos de supervisão detectam automaticamente a ausência do eixo de azimute em um firmware anterior à versão 1.2.0 — por exceção Modbus de endereço inválido, no caso do Modbus RTU, ou pela ausência da característica correspondente, no caso do BLE — e continuam operando apenas com a inclinação, sem registrar valores nulos como se fossem medições válidas. A versão do firmware, codificada como um único inteiro (por exemplo, "1.4.0" como 10400), é exposta em ambos os transportes especificamente para permitir essa detecção e para diagnóstico em campo pelo botão de teste de conexão. O mesmo mecanismo passou a ser usado pela retransmissão de amostras do Modo Vibração via BLE (seção 6.4), disponível apenas a partir da versão 1.4.0: contra um firmware anterior, o aplicativo informa explicitamente a limitação em vez de entregar uma captura incompleta.</w:t>
+        <w:t xml:space="preserve">Ambos os aplicativos de supervisão detectam automaticamente a ausência do eixo de azimute em um firmware anterior à versão 1.2.0 — por exceção Modbus de endereço inválido, no caso do Modbus RTU, ou pela ausência da característica correspondente, no caso do BLE — e continuam operando apenas com a inclinação, sem registrar valores nulos como se fossem medições válidas. A versão do firmware, codificada como um único inteiro (por exemplo, "1.6.0" como 10600), é exposta em ambos os transportes especificamente para permitir essa detecção e para diagnóstico em campo pelo botão de teste de conexão. O mesmo mecanismo passou a ser usado pela retransmissão de amostras do Modo Vibração via BLE (seção 6.4), disponível apenas a partir da versão 1.4.0, e pelos extremos medidos no firmware (seção 6.2), disponíveis a partir da versão 1.5.0: contra um firmware anterior a cada uma dessas versões, o aplicativo detecta a exceção Modbus (ou a ausência da característica BLE) e volta ao comportamento anterior — informa explicitamente a limitação no caso da retransmissão, ou passa a calcular os extremos a partir das próprias leituras recebidas, no caso dos extremos — em vez de travar ou entregar um resultado incompleto sem aviso.</w:t>
       </w:r>
     </w:p>
     <w:p>
@@ -10091,7 +10723,37 @@
           <w:sz w:val="24"/>
           <w:szCs w:val="24"/>
         </w:rPr>
-        <w:t xml:space="preserve">É o modo de operação principal: os aplicativos fazem sondagem (polling) periódica da leitura de ângulo (aproximadamente a cada 250 ms no software desktop via Modbus/BLE, ou a cada notificação BLE de 200 ms), exibem o valor em tempo real para os dois eixos, atualizam o rastreamento de mínimo e máximo por eixo, e persistem cada leitura no histórico local. O botão Calibrar zera os dois eixos simultaneamente na posição atual, tanto no modo real (enviando um único comando ao ESP32) quanto no modo simulação (aplicando um deslocamento equivalente aos dados sintéticos).</w:t>
+        <w:t xml:space="preserve">É o modo de operação principal: os aplicativos fazem sondagem (polling) periódica da leitura de ângulo (aproximadamente a cada 250 ms no software desktop via Modbus/BLE, ou a cada notificação BLE de 200 ms), exibem o valor em tempo real para os dois eixos, e persistem cada leitura no histórico local. O botão Calibrar zera os dois eixos simultaneamente na posição atual (e os extremos, ver abaixo), tanto no modo real (enviando um único comando ao ESP32) quanto no modo simulação (aplicando um deslocamento equivalente aos dados sintéticos).</w:t>
+      </w:r>
+    </w:p>
+    <w:p>
+      <w:pPr>
+        <w:spacing w:after="200" w:before="0" w:line="360" w:lineRule="auto"/>
+        <w:ind w:firstLine="709"/>
+        <w:jc w:val="both"/>
+      </w:pPr>
+      <w:r>
+        <w:rPr>
+          <w:rFonts w:ascii="Times New Roman" w:cs="Times New Roman" w:eastAsia="Times New Roman" w:hAnsi="Times New Roman"/>
+          <w:sz w:val="24"/>
+          <w:szCs w:val="24"/>
+        </w:rPr>
+        <w:t xml:space="preserve">Até a versão 1.4.0 do firmware, o rastreamento de mínimo/máximo por eixo era calculado inteiramente nos aplicativos, a partir do mesmo valor filtrado exibido na tela — o que compunha dois problemas: o filtro pesado da tela (necessário para não tremular) achatava o pico de uma rajada breve, e o próprio ritmo de sondagem (4–5 Hz) deixava passar entre duas leituras o que sobrava do pico depois do filtro. Numa rajada real de 2,0° durando meio segundo, apenas 39% da amplitude chegava a ser registrada como extremo. A partir da versão 1.5.0, o extremo passou a ser medido dentro do próprio firmware, a 100 Hz, pelo caminho de filtragem descrito na seção 4.3, e transmitido pronto pelo protocolo (registradores Modbus 2–5, característica BLE 6e6e000c-...) — a mesma rajada passou a registrar 88% da amplitude real. Contra um firmware anterior à v1.5.0, o aplicativo detecta a ausência do recurso e volta a calcular os extremos por conta própria, como antes.</w:t>
+      </w:r>
+    </w:p>
+    <w:p>
+      <w:pPr>
+        <w:spacing w:after="200" w:before="0" w:line="360" w:lineRule="auto"/>
+        <w:ind w:firstLine="709"/>
+        <w:jc w:val="both"/>
+      </w:pPr>
+      <w:r>
+        <w:rPr>
+          <w:rFonts w:ascii="Times New Roman" w:cs="Times New Roman" w:eastAsia="Times New Roman" w:hAnsi="Times New Roman"/>
+          <w:sz w:val="24"/>
+          <w:szCs w:val="24"/>
+        </w:rPr>
+        <w:t xml:space="preserve">Uma consequência visível dessa separação é que o gráfico da sessão, no relatório em PDF, continua traçando o valor exibido na tela (mais filtrado), enquanto o resumo numérico de mínimo/máximo e os marcadores de extremo no próprio gráfico vêm do caminho de medida — de modo que um marcador de extremo pode aparecer graficamente acima ou abaixo da própria curva: a curva mostra o que a tela mostrou, o marcador mostra o que de fato ocorreu no eixo.</w:t>
       </w:r>
     </w:p>
     <w:p>
@@ -10879,6 +11541,34 @@
           <w:szCs w:val="24"/>
         </w:rPr>
         <w:t xml:space="preserve">• Persistência da calibração: o deslocamento (offset) de calibração dos dois eixos é mantido apenas em memória volátil (RAM), sendo perdido a cada reinicialização do ESP32.</w:t>
+      </w:r>
+    </w:p>
+    <w:p>
+      <w:pPr>
+        <w:spacing w:after="140" w:line="360" w:lineRule="auto"/>
+        <w:ind w:left="700" w:hanging="300"/>
+      </w:pPr>
+      <w:r>
+        <w:rPr>
+          <w:rFonts w:ascii="Times New Roman" w:cs="Times New Roman" w:eastAsia="Times New Roman" w:hAnsi="Times New Roman"/>
+          <w:sz w:val="24"/>
+          <w:szCs w:val="24"/>
+        </w:rPr>
+        <w:t xml:space="preserve">• Filtro adaptativo "1-euro" e extremos medidos no firmware (v1.6.0 — seções 4.3 e 6.2): os números apresentados vêm de simulação da cadeia completa (ruído do MPU6050 → DLPF → atan2 → filtro), e o código foi conferido contra essa mesma simulação, mas ainda não foi exercitado contra o sensor físico — ruído real inclui vibração mecânica, montagem e temperatura, que a simulação não modela.</w:t>
+      </w:r>
+    </w:p>
+    <w:p>
+      <w:pPr>
+        <w:spacing w:after="140" w:line="360" w:lineRule="auto"/>
+        <w:ind w:left="700" w:hanging="300"/>
+      </w:pPr>
+      <w:r>
+        <w:rPr>
+          <w:rFonts w:ascii="Times New Roman" w:cs="Times New Roman" w:eastAsia="Times New Roman" w:hAnsi="Times New Roman"/>
+          <w:sz w:val="24"/>
+          <w:szCs w:val="24"/>
+        </w:rPr>
+        <w:t xml:space="preserve">• Retransmissão de amostras perdidas do Modo Vibração via BLE (v1.4.0 — seção 6.4): a lógica de detecção de lacuna e resolicitação foi validada com simulação de perda de pacote, mas não contra uma conexão BLE real sujeita a interferência de rádio.</w:t>
       </w:r>
     </w:p>
     <w:p>

</xml_diff>

<commit_message>
Atualiza o relatório técnico para a rev. 02, acompanhando o firmware 1.6.0 (#25)
Reflete as duas mudanças do firmware 1.6.0 que tornavam o relatório
desatualizado: o filtro adaptativo "1-euro" na leitura contínua exibida
na tela (seção 4.3, substituindo a descrição da EMA de constante fixa)
e os extremos (mín./máx.) agora medidos no próprio firmware a 100 Hz,
em caminho de filtragem separado do caminho de exibição (seções 4.3 e
6.2) — com os novos registradores Modbus (2-5, coil 2) e características
BLE (6e6e000b/000c) documentados nas Tabelas 6 e 7. Acrescenta as duas
novas limitações pendentes de confirmação em hardware físico (seção
7.3) e uma linha na tabela de histórico de revisões.


Claude-Session: https://claude.ai/code/session_01VvvtJDPvh4mDoSVpkHza1d

Co-authored-by: Claude <noreply@anthropic.com>
</commit_message>
<xml_diff>
--- a/docs/relatorio-tecnico-inclinometro.docx
+++ b/docs/relatorio-tecnico-inclinometro.docx
@@ -935,6 +935,120 @@
           </w:p>
         </w:tc>
       </w:tr>
+      <w:tr>
+        <w:tc>
+          <w:tcPr>
+            <w:tcW w:type="dxa" w:w="1400"/>
+            <w:tcMar>
+              <w:top w:type="dxa" w:w="60"/>
+              <w:left w:type="dxa" w:w="100"/>
+              <w:bottom w:type="dxa" w:w="60"/>
+              <w:right w:type="dxa" w:w="100"/>
+            </w:tcMar>
+            <w:vAlign w:val="center"/>
+          </w:tcPr>
+          <w:p>
+            <w:pPr>
+              <w:spacing w:line="240" w:lineRule="auto"/>
+              <w:jc w:val="left"/>
+            </w:pPr>
+            <w:r>
+              <w:rPr>
+                <w:rFonts w:ascii="Times New Roman" w:cs="Times New Roman" w:eastAsia="Times New Roman" w:hAnsi="Times New Roman"/>
+                <w:b w:val="false"/>
+                <w:bCs w:val="false"/>
+                <w:sz w:val="20"/>
+                <w:szCs w:val="20"/>
+              </w:rPr>
+              <w:t xml:space="preserve">02</w:t>
+            </w:r>
+          </w:p>
+        </w:tc>
+        <w:tc>
+          <w:tcPr>
+            <w:tcW w:type="dxa" w:w="1600"/>
+            <w:tcMar>
+              <w:top w:type="dxa" w:w="60"/>
+              <w:left w:type="dxa" w:w="100"/>
+              <w:bottom w:type="dxa" w:w="60"/>
+              <w:right w:type="dxa" w:w="100"/>
+            </w:tcMar>
+            <w:vAlign w:val="center"/>
+          </w:tcPr>
+          <w:p>
+            <w:pPr>
+              <w:spacing w:line="240" w:lineRule="auto"/>
+              <w:jc w:val="left"/>
+            </w:pPr>
+            <w:r>
+              <w:rPr>
+                <w:rFonts w:ascii="Times New Roman" w:cs="Times New Roman" w:eastAsia="Times New Roman" w:hAnsi="Times New Roman"/>
+                <w:b w:val="false"/>
+                <w:bCs w:val="false"/>
+                <w:sz w:val="20"/>
+                <w:szCs w:val="20"/>
+              </w:rPr>
+              <w:t xml:space="preserve">18/09/2026</w:t>
+            </w:r>
+          </w:p>
+        </w:tc>
+        <w:tc>
+          <w:tcPr>
+            <w:tcW w:type="dxa" w:w="4670"/>
+            <w:tcMar>
+              <w:top w:type="dxa" w:w="60"/>
+              <w:left w:type="dxa" w:w="100"/>
+              <w:bottom w:type="dxa" w:w="60"/>
+              <w:right w:type="dxa" w:w="100"/>
+            </w:tcMar>
+            <w:vAlign w:val="center"/>
+          </w:tcPr>
+          <w:p>
+            <w:pPr>
+              <w:spacing w:line="240" w:lineRule="auto"/>
+              <w:jc w:val="left"/>
+            </w:pPr>
+            <w:r>
+              <w:rPr>
+                <w:rFonts w:ascii="Times New Roman" w:cs="Times New Roman" w:eastAsia="Times New Roman" w:hAnsi="Times New Roman"/>
+                <w:b w:val="false"/>
+                <w:bCs w:val="false"/>
+                <w:sz w:val="20"/>
+                <w:szCs w:val="20"/>
+              </w:rPr>
+              <w:t xml:space="preserve">Atualização para o firmware 1.6.0: filtro adaptativo "1-euro" na leitura contínua exibida na tela (seção 4.3), e extremos (mín./máx.) passam a ser medidos pelo próprio firmware a 100 Hz, em caminho de filtragem separado do caminho de exibição (seções 4.3, 5.1, 5.2 e 6.2), com os novos registradores/característica de reset de extremos.</w:t>
+            </w:r>
+          </w:p>
+        </w:tc>
+        <w:tc>
+          <w:tcPr>
+            <w:tcW w:type="dxa" w:w="1400"/>
+            <w:tcMar>
+              <w:top w:type="dxa" w:w="60"/>
+              <w:left w:type="dxa" w:w="100"/>
+              <w:bottom w:type="dxa" w:w="60"/>
+              <w:right w:type="dxa" w:w="100"/>
+            </w:tcMar>
+            <w:vAlign w:val="center"/>
+          </w:tcPr>
+          <w:p>
+            <w:pPr>
+              <w:spacing w:line="240" w:lineRule="auto"/>
+              <w:jc w:val="left"/>
+            </w:pPr>
+            <w:r>
+              <w:rPr>
+                <w:rFonts w:ascii="Times New Roman" w:cs="Times New Roman" w:eastAsia="Times New Roman" w:hAnsi="Times New Roman"/>
+                <w:b w:val="false"/>
+                <w:bCs w:val="false"/>
+                <w:sz w:val="20"/>
+                <w:szCs w:val="20"/>
+              </w:rPr>
+              <w:t xml:space="preserve">[NOME DO AUTOR]</w:t>
+            </w:r>
+          </w:p>
+        </w:tc>
+      </w:tr>
     </w:tbl>
     <w:p>
       <w:pPr>
@@ -2095,6 +2209,64 @@
                 <w:szCs w:val="20"/>
               </w:rPr>
               <w:t xml:space="preserve">Pan, azimute — rotação em torno do eixo vertical.</w:t>
+            </w:r>
+          </w:p>
+        </w:tc>
+      </w:tr>
+      <w:tr>
+        <w:tc>
+          <w:tcPr>
+            <w:tcW w:type="dxa" w:w="3000"/>
+            <w:tcMar>
+              <w:top w:type="dxa" w:w="60"/>
+              <w:left w:type="dxa" w:w="100"/>
+              <w:bottom w:type="dxa" w:w="60"/>
+              <w:right w:type="dxa" w:w="100"/>
+            </w:tcMar>
+            <w:vAlign w:val="center"/>
+          </w:tcPr>
+          <w:p>
+            <w:pPr>
+              <w:spacing w:line="240" w:lineRule="auto"/>
+              <w:jc w:val="left"/>
+            </w:pPr>
+            <w:r>
+              <w:rPr>
+                <w:rFonts w:ascii="Times New Roman" w:cs="Times New Roman" w:eastAsia="Times New Roman" w:hAnsi="Times New Roman"/>
+                <w:b w:val="false"/>
+                <w:bCs w:val="false"/>
+                <w:sz w:val="20"/>
+                <w:szCs w:val="20"/>
+              </w:rPr>
+              <w:t xml:space="preserve">Peak-hold</w:t>
+            </w:r>
+          </w:p>
+        </w:tc>
+        <w:tc>
+          <w:tcPr>
+            <w:tcW w:type="dxa" w:w="6070"/>
+            <w:tcMar>
+              <w:top w:type="dxa" w:w="60"/>
+              <w:left w:type="dxa" w:w="100"/>
+              <w:bottom w:type="dxa" w:w="60"/>
+              <w:right w:type="dxa" w:w="100"/>
+            </w:tcMar>
+            <w:vAlign w:val="center"/>
+          </w:tcPr>
+          <w:p>
+            <w:pPr>
+              <w:spacing w:line="240" w:lineRule="auto"/>
+              <w:jc w:val="left"/>
+            </w:pPr>
+            <w:r>
+              <w:rPr>
+                <w:rFonts w:ascii="Times New Roman" w:cs="Times New Roman" w:eastAsia="Times New Roman" w:hAnsi="Times New Roman"/>
+                <w:b w:val="false"/>
+                <w:bCs w:val="false"/>
+                <w:sz w:val="20"/>
+                <w:szCs w:val="20"/>
+              </w:rPr>
+              <w:t xml:space="preserve">Retenção de pico — técnica que registra o maior (ou menor) valor de um sinal observado ao longo do tempo, independentemente do valor instantâneo atual.</w:t>
             </w:r>
           </w:p>
         </w:tc>
@@ -7347,7 +7519,22 @@
           <w:sz w:val="24"/>
           <w:szCs w:val="24"/>
         </w:rPr>
-        <w:t xml:space="preserve">A segunda camada é uma média móvel exponencial (EMA) em software, aplicada à leitura contínua de inclinação (não à captura de vibração, que usa a amostra instantânea, sem filtro, por definição). A cada amostra a 100 Hz, o valor filtrado é atualizado por:</w:t>
+        <w:t xml:space="preserve">A segunda camada é uma média móvel exponencial (EMA) em software, aplicada à mesma amostra de 100 Hz, mas dividida em **dois caminhos independentes** a partir da versão 1.6.0 do firmware — um para a leitura exibida na tela, outro para o rastreamento de extremos (mín./máx.) — porque as duas finalidades têm exigências opostas: a tela precisa de um filtro pesado, para não tremular no degrau de exibição de 0,25°; já o extremo precisa preservar o pico de uma rajada breve, que um filtro pesado achataria. Até a versão 1.4.0, um único filtro (EMA de constante de tempo fixa, τ = 0,5 s) alimentava as duas finalidades, o que subestimava sistematicamente os extremos de eventos curtos — ver seção 6.2.</w:t>
+      </w:r>
+    </w:p>
+    <w:p>
+      <w:pPr>
+        <w:spacing w:after="200" w:before="0" w:line="360" w:lineRule="auto"/>
+        <w:ind w:firstLine="709"/>
+        <w:jc w:val="both"/>
+      </w:pPr>
+      <w:r>
+        <w:rPr>
+          <w:rFonts w:ascii="Times New Roman" w:cs="Times New Roman" w:eastAsia="Times New Roman" w:hAnsi="Times New Roman"/>
+          <w:sz w:val="24"/>
+          <w:szCs w:val="24"/>
+        </w:rPr>
+        <w:t xml:space="preserve">O caminho da tela passou de uma EMA de constante de tempo fixa para um filtro adaptativo "1-euro" (Casiez et al.), cuja frequência de corte sobe quando o ângulo está variando de fato e desce quando o eixo está parado — em vez do compromisso fixo entre estabilidade e velocidade de acomodação da EMA simples:</w:t>
       </w:r>
     </w:p>
     <w:p>
@@ -7361,7 +7548,7 @@
           <w:sz w:val="20"/>
           <w:szCs w:val="20"/>
         </w:rPr>
-        <w:t xml:space="preserve">filtrado_i = filtrado_(i-1) + α · (bruto_i − filtrado_(i-1)),   com   α = Δt / (Δt + τ)</w:t>
+        <w:t xml:space="preserve">filtrado_i = filtrado_(i-1) + α_i · (bruto_i − filtrado_(i-1)),   com   α_i = Δt / (Δt + τ(|dθ/dt|))</w:t>
       </w:r>
     </w:p>
     <w:p>
@@ -7376,7 +7563,22 @@
           <w:sz w:val="24"/>
           <w:szCs w:val="24"/>
         </w:rPr>
-        <w:t xml:space="preserve">em que τ é a constante de tempo do filtro (0,5 s) e Δt é o intervalo de amostragem (10 ms). Com esses valores, o ruído branco de alta frequência é atenuado em aproximadamente dez vezes, com um tempo de acomodação de aproximadamente 0,5 s para acompanhar uma variação real de ângulo — um compromisso entre estabilidade da leitura exibida e responsividade a eventos reais.</w:t>
+        <w:t xml:space="preserve">em que a constante de tempo τ não é mais fixa, e sim função da velocidade angular estimada (ela própria filtrada, com corte de 0,3 Hz, para o ruído não inflar a estimativa e degradar o próprio ganho do filtro). Em simulação da cadeia completa (ruído do MPU6050 → DLPF de 21 Hz → atan2 → filtro), o ruído com o eixo parado caiu de 0,016° para 0,005° RMS, e o tempo para acompanhar 90% de um movimento real caiu de 0,63 s para 0,21 s — uma melhora nos dois eixos ao mesmo tempo, e não uma troca entre eles, precisamente porque os dois regimes (parado/em movimento) passaram a ser tratados separadamente.</w:t>
+      </w:r>
+    </w:p>
+    <w:p>
+      <w:pPr>
+        <w:spacing w:after="200" w:before="0" w:line="360" w:lineRule="auto"/>
+        <w:ind w:firstLine="709"/>
+        <w:jc w:val="both"/>
+      </w:pPr>
+      <w:r>
+        <w:rPr>
+          <w:rFonts w:ascii="Times New Roman" w:cs="Times New Roman" w:eastAsia="Times New Roman" w:hAnsi="Times New Roman"/>
+          <w:sz w:val="24"/>
+          <w:szCs w:val="24"/>
+        </w:rPr>
+        <w:t xml:space="preserve">O caminho do extremo usa, em vez disso, um único polo de corte fixo em 3 Hz (banda física do balanço do mastro, tipicamente 1 a 5 Hz) seguido de um teste de persistência: um novo extremo só é aceito se o sinal filtrado permanecer acima (ou abaixo) do extremo anterior por pelo menos 100 ms (10 amostras a 100 Hz) — o que rejeita o ruído residual do próprio filtro sem descartar uma rajada real. Este caminho é detalhado na seção 6.2, junto com o impacto que a mudança tem no valor final registrado no relatório.</w:t>
       </w:r>
     </w:p>
     <w:p>
@@ -8363,7 +8565,7 @@
                 <w:sz w:val="20"/>
                 <w:szCs w:val="20"/>
               </w:rPr>
-              <w:t xml:space="preserve">Coil 0</w:t>
+              <w:t xml:space="preserve">Input registers 2–5</w:t>
             </w:r>
           </w:p>
         </w:tc>
@@ -8391,7 +8593,7 @@
                 <w:sz w:val="20"/>
                 <w:szCs w:val="20"/>
               </w:rPr>
-              <w:t xml:space="preserve">escrita</w:t>
+              <w:t xml:space="preserve">leitura</w:t>
             </w:r>
           </w:p>
         </w:tc>
@@ -8419,7 +8621,7 @@
                 <w:sz w:val="20"/>
                 <w:szCs w:val="20"/>
               </w:rPr>
-              <w:t xml:space="preserve">true → calibra (zera os dois eixos na posição atual)</w:t>
+              <w:t xml:space="preserve">Extremos medidos pelo firmware (peak-hold), na mesma codificação: tilt mín., tilt máx., pan mín., pan máx. (v1.5.0+)</w:t>
             </w:r>
           </w:p>
         </w:tc>
@@ -8449,6 +8651,92 @@
                 <w:sz w:val="20"/>
                 <w:szCs w:val="20"/>
               </w:rPr>
+              <w:t xml:space="preserve">Coil 0</w:t>
+            </w:r>
+          </w:p>
+        </w:tc>
+        <w:tc>
+          <w:tcPr>
+            <w:tcW w:type="dxa" w:w="1400"/>
+            <w:tcMar>
+              <w:top w:type="dxa" w:w="60"/>
+              <w:left w:type="dxa" w:w="100"/>
+              <w:bottom w:type="dxa" w:w="60"/>
+              <w:right w:type="dxa" w:w="100"/>
+            </w:tcMar>
+            <w:vAlign w:val="center"/>
+          </w:tcPr>
+          <w:p>
+            <w:pPr>
+              <w:spacing w:line="240" w:lineRule="auto"/>
+              <w:jc w:val="left"/>
+            </w:pPr>
+            <w:r>
+              <w:rPr>
+                <w:rFonts w:ascii="Times New Roman" w:cs="Times New Roman" w:eastAsia="Times New Roman" w:hAnsi="Times New Roman"/>
+                <w:b w:val="false"/>
+                <w:bCs w:val="false"/>
+                <w:sz w:val="20"/>
+                <w:szCs w:val="20"/>
+              </w:rPr>
+              <w:t xml:space="preserve">escrita</w:t>
+            </w:r>
+          </w:p>
+        </w:tc>
+        <w:tc>
+          <w:tcPr>
+            <w:tcW w:type="dxa" w:w="5400"/>
+            <w:tcMar>
+              <w:top w:type="dxa" w:w="60"/>
+              <w:left w:type="dxa" w:w="100"/>
+              <w:bottom w:type="dxa" w:w="60"/>
+              <w:right w:type="dxa" w:w="100"/>
+            </w:tcMar>
+            <w:vAlign w:val="center"/>
+          </w:tcPr>
+          <w:p>
+            <w:pPr>
+              <w:spacing w:line="240" w:lineRule="auto"/>
+              <w:jc w:val="left"/>
+            </w:pPr>
+            <w:r>
+              <w:rPr>
+                <w:rFonts w:ascii="Times New Roman" w:cs="Times New Roman" w:eastAsia="Times New Roman" w:hAnsi="Times New Roman"/>
+                <w:b w:val="false"/>
+                <w:bCs w:val="false"/>
+                <w:sz w:val="20"/>
+                <w:szCs w:val="20"/>
+              </w:rPr>
+              <w:t xml:space="preserve">true → calibra (zera os dois eixos e os extremos na posição atual)</w:t>
+            </w:r>
+          </w:p>
+        </w:tc>
+      </w:tr>
+      <w:tr>
+        <w:tc>
+          <w:tcPr>
+            <w:tcW w:type="dxa" w:w="2400"/>
+            <w:tcMar>
+              <w:top w:type="dxa" w:w="60"/>
+              <w:left w:type="dxa" w:w="100"/>
+              <w:bottom w:type="dxa" w:w="60"/>
+              <w:right w:type="dxa" w:w="100"/>
+            </w:tcMar>
+            <w:vAlign w:val="center"/>
+          </w:tcPr>
+          <w:p>
+            <w:pPr>
+              <w:spacing w:line="240" w:lineRule="auto"/>
+              <w:jc w:val="left"/>
+            </w:pPr>
+            <w:r>
+              <w:rPr>
+                <w:rFonts w:ascii="Times New Roman" w:cs="Times New Roman" w:eastAsia="Times New Roman" w:hAnsi="Times New Roman"/>
+                <w:b w:val="false"/>
+                <w:bCs w:val="false"/>
+                <w:sz w:val="20"/>
+                <w:szCs w:val="20"/>
+              </w:rPr>
               <w:t xml:space="preserve">Coil 1</w:t>
             </w:r>
           </w:p>
@@ -8506,6 +8794,92 @@
                 <w:szCs w:val="20"/>
               </w:rPr>
               <w:t xml:space="preserve">true → inicia captura de vibração</w:t>
+            </w:r>
+          </w:p>
+        </w:tc>
+      </w:tr>
+      <w:tr>
+        <w:tc>
+          <w:tcPr>
+            <w:tcW w:type="dxa" w:w="2400"/>
+            <w:tcMar>
+              <w:top w:type="dxa" w:w="60"/>
+              <w:left w:type="dxa" w:w="100"/>
+              <w:bottom w:type="dxa" w:w="60"/>
+              <w:right w:type="dxa" w:w="100"/>
+            </w:tcMar>
+            <w:vAlign w:val="center"/>
+          </w:tcPr>
+          <w:p>
+            <w:pPr>
+              <w:spacing w:line="240" w:lineRule="auto"/>
+              <w:jc w:val="left"/>
+            </w:pPr>
+            <w:r>
+              <w:rPr>
+                <w:rFonts w:ascii="Times New Roman" w:cs="Times New Roman" w:eastAsia="Times New Roman" w:hAnsi="Times New Roman"/>
+                <w:b w:val="false"/>
+                <w:bCs w:val="false"/>
+                <w:sz w:val="20"/>
+                <w:szCs w:val="20"/>
+              </w:rPr>
+              <w:t xml:space="preserve">Coil 2</w:t>
+            </w:r>
+          </w:p>
+        </w:tc>
+        <w:tc>
+          <w:tcPr>
+            <w:tcW w:type="dxa" w:w="1400"/>
+            <w:tcMar>
+              <w:top w:type="dxa" w:w="60"/>
+              <w:left w:type="dxa" w:w="100"/>
+              <w:bottom w:type="dxa" w:w="60"/>
+              <w:right w:type="dxa" w:w="100"/>
+            </w:tcMar>
+            <w:vAlign w:val="center"/>
+          </w:tcPr>
+          <w:p>
+            <w:pPr>
+              <w:spacing w:line="240" w:lineRule="auto"/>
+              <w:jc w:val="left"/>
+            </w:pPr>
+            <w:r>
+              <w:rPr>
+                <w:rFonts w:ascii="Times New Roman" w:cs="Times New Roman" w:eastAsia="Times New Roman" w:hAnsi="Times New Roman"/>
+                <w:b w:val="false"/>
+                <w:bCs w:val="false"/>
+                <w:sz w:val="20"/>
+                <w:szCs w:val="20"/>
+              </w:rPr>
+              <w:t xml:space="preserve">escrita</w:t>
+            </w:r>
+          </w:p>
+        </w:tc>
+        <w:tc>
+          <w:tcPr>
+            <w:tcW w:type="dxa" w:w="5400"/>
+            <w:tcMar>
+              <w:top w:type="dxa" w:w="60"/>
+              <w:left w:type="dxa" w:w="100"/>
+              <w:bottom w:type="dxa" w:w="60"/>
+              <w:right w:type="dxa" w:w="100"/>
+            </w:tcMar>
+            <w:vAlign w:val="center"/>
+          </w:tcPr>
+          <w:p>
+            <w:pPr>
+              <w:spacing w:line="240" w:lineRule="auto"/>
+              <w:jc w:val="left"/>
+            </w:pPr>
+            <w:r>
+              <w:rPr>
+                <w:rFonts w:ascii="Times New Roman" w:cs="Times New Roman" w:eastAsia="Times New Roman" w:hAnsi="Times New Roman"/>
+                <w:b w:val="false"/>
+                <w:bCs w:val="false"/>
+                <w:sz w:val="20"/>
+                <w:szCs w:val="20"/>
+              </w:rPr>
+              <w:t xml:space="preserve">true → esquece os extremos, sem alterar o zero (v1.5.0+)</w:t>
             </w:r>
           </w:p>
         </w:tc>
@@ -9955,6 +10329,264 @@
           </w:p>
         </w:tc>
       </w:tr>
+      <w:tr>
+        <w:tc>
+          <w:tcPr>
+            <w:tcW w:type="dxa" w:w="3600"/>
+            <w:tcMar>
+              <w:top w:type="dxa" w:w="60"/>
+              <w:left w:type="dxa" w:w="100"/>
+              <w:bottom w:type="dxa" w:w="60"/>
+              <w:right w:type="dxa" w:w="100"/>
+            </w:tcMar>
+            <w:vAlign w:val="center"/>
+          </w:tcPr>
+          <w:p>
+            <w:pPr>
+              <w:spacing w:line="240" w:lineRule="auto"/>
+              <w:jc w:val="left"/>
+            </w:pPr>
+            <w:r>
+              <w:rPr>
+                <w:rFonts w:ascii="Times New Roman" w:cs="Times New Roman" w:eastAsia="Times New Roman" w:hAnsi="Times New Roman"/>
+                <w:b w:val="false"/>
+                <w:bCs w:val="false"/>
+                <w:sz w:val="20"/>
+                <w:szCs w:val="20"/>
+              </w:rPr>
+              <w:t xml:space="preserve">6e6e000a-... (retransmissão vibração)</w:t>
+            </w:r>
+          </w:p>
+        </w:tc>
+        <w:tc>
+          <w:tcPr>
+            <w:tcW w:type="dxa" w:w="2200"/>
+            <w:tcMar>
+              <w:top w:type="dxa" w:w="60"/>
+              <w:left w:type="dxa" w:w="100"/>
+              <w:bottom w:type="dxa" w:w="60"/>
+              <w:right w:type="dxa" w:w="100"/>
+            </w:tcMar>
+            <w:vAlign w:val="center"/>
+          </w:tcPr>
+          <w:p>
+            <w:pPr>
+              <w:spacing w:line="240" w:lineRule="auto"/>
+              <w:jc w:val="left"/>
+            </w:pPr>
+            <w:r>
+              <w:rPr>
+                <w:rFonts w:ascii="Times New Roman" w:cs="Times New Roman" w:eastAsia="Times New Roman" w:hAnsi="Times New Roman"/>
+                <w:b w:val="false"/>
+                <w:bCs w:val="false"/>
+                <w:sz w:val="20"/>
+                <w:szCs w:val="20"/>
+              </w:rPr>
+              <w:t xml:space="preserve">escrita</w:t>
+            </w:r>
+          </w:p>
+        </w:tc>
+        <w:tc>
+          <w:tcPr>
+            <w:tcW w:type="dxa" w:w="3400"/>
+            <w:tcMar>
+              <w:top w:type="dxa" w:w="60"/>
+              <w:left w:type="dxa" w:w="100"/>
+              <w:bottom w:type="dxa" w:w="60"/>
+              <w:right w:type="dxa" w:w="100"/>
+            </w:tcMar>
+            <w:vAlign w:val="center"/>
+          </w:tcPr>
+          <w:p>
+            <w:pPr>
+              <w:spacing w:line="240" w:lineRule="auto"/>
+              <w:jc w:val="left"/>
+            </w:pPr>
+            <w:r>
+              <w:rPr>
+                <w:rFonts w:ascii="Times New Roman" w:cs="Times New Roman" w:eastAsia="Times New Roman" w:hAnsi="Times New Roman"/>
+                <w:b w:val="false"/>
+                <w:bCs w:val="false"/>
+                <w:sz w:val="20"/>
+                <w:szCs w:val="20"/>
+              </w:rPr>
+              <w:t xml:space="preserve">3 bytes: índice inicial + eixo (0=tilt, 1=pan) → reenvia amostras a partir dali (v1.4.0+)</w:t>
+            </w:r>
+          </w:p>
+        </w:tc>
+      </w:tr>
+      <w:tr>
+        <w:tc>
+          <w:tcPr>
+            <w:tcW w:type="dxa" w:w="3600"/>
+            <w:tcMar>
+              <w:top w:type="dxa" w:w="60"/>
+              <w:left w:type="dxa" w:w="100"/>
+              <w:bottom w:type="dxa" w:w="60"/>
+              <w:right w:type="dxa" w:w="100"/>
+            </w:tcMar>
+            <w:vAlign w:val="center"/>
+          </w:tcPr>
+          <w:p>
+            <w:pPr>
+              <w:spacing w:line="240" w:lineRule="auto"/>
+              <w:jc w:val="left"/>
+            </w:pPr>
+            <w:r>
+              <w:rPr>
+                <w:rFonts w:ascii="Times New Roman" w:cs="Times New Roman" w:eastAsia="Times New Roman" w:hAnsi="Times New Roman"/>
+                <w:b w:val="false"/>
+                <w:bCs w:val="false"/>
+                <w:sz w:val="20"/>
+                <w:szCs w:val="20"/>
+              </w:rPr>
+              <w:t xml:space="preserve">6e6e000b-... (resetar extremos)</w:t>
+            </w:r>
+          </w:p>
+        </w:tc>
+        <w:tc>
+          <w:tcPr>
+            <w:tcW w:type="dxa" w:w="2200"/>
+            <w:tcMar>
+              <w:top w:type="dxa" w:w="60"/>
+              <w:left w:type="dxa" w:w="100"/>
+              <w:bottom w:type="dxa" w:w="60"/>
+              <w:right w:type="dxa" w:w="100"/>
+            </w:tcMar>
+            <w:vAlign w:val="center"/>
+          </w:tcPr>
+          <w:p>
+            <w:pPr>
+              <w:spacing w:line="240" w:lineRule="auto"/>
+              <w:jc w:val="left"/>
+            </w:pPr>
+            <w:r>
+              <w:rPr>
+                <w:rFonts w:ascii="Times New Roman" w:cs="Times New Roman" w:eastAsia="Times New Roman" w:hAnsi="Times New Roman"/>
+                <w:b w:val="false"/>
+                <w:bCs w:val="false"/>
+                <w:sz w:val="20"/>
+                <w:szCs w:val="20"/>
+              </w:rPr>
+              <w:t xml:space="preserve">escrita</w:t>
+            </w:r>
+          </w:p>
+        </w:tc>
+        <w:tc>
+          <w:tcPr>
+            <w:tcW w:type="dxa" w:w="3400"/>
+            <w:tcMar>
+              <w:top w:type="dxa" w:w="60"/>
+              <w:left w:type="dxa" w:w="100"/>
+              <w:bottom w:type="dxa" w:w="60"/>
+              <w:right w:type="dxa" w:w="100"/>
+            </w:tcMar>
+            <w:vAlign w:val="center"/>
+          </w:tcPr>
+          <w:p>
+            <w:pPr>
+              <w:spacing w:line="240" w:lineRule="auto"/>
+              <w:jc w:val="left"/>
+            </w:pPr>
+            <w:r>
+              <w:rPr>
+                <w:rFonts w:ascii="Times New Roman" w:cs="Times New Roman" w:eastAsia="Times New Roman" w:hAnsi="Times New Roman"/>
+                <w:b w:val="false"/>
+                <w:bCs w:val="false"/>
+                <w:sz w:val="20"/>
+                <w:szCs w:val="20"/>
+              </w:rPr>
+              <w:t xml:space="preserve">Byte 0x01 → esquece os extremos, sem alterar o zero (v1.5.0+)</w:t>
+            </w:r>
+          </w:p>
+        </w:tc>
+      </w:tr>
+      <w:tr>
+        <w:tc>
+          <w:tcPr>
+            <w:tcW w:type="dxa" w:w="3600"/>
+            <w:tcMar>
+              <w:top w:type="dxa" w:w="60"/>
+              <w:left w:type="dxa" w:w="100"/>
+              <w:bottom w:type="dxa" w:w="60"/>
+              <w:right w:type="dxa" w:w="100"/>
+            </w:tcMar>
+            <w:vAlign w:val="center"/>
+          </w:tcPr>
+          <w:p>
+            <w:pPr>
+              <w:spacing w:line="240" w:lineRule="auto"/>
+              <w:jc w:val="left"/>
+            </w:pPr>
+            <w:r>
+              <w:rPr>
+                <w:rFonts w:ascii="Times New Roman" w:cs="Times New Roman" w:eastAsia="Times New Roman" w:hAnsi="Times New Roman"/>
+                <w:b w:val="false"/>
+                <w:bCs w:val="false"/>
+                <w:sz w:val="20"/>
+                <w:szCs w:val="20"/>
+              </w:rPr>
+              <w:t xml:space="preserve">6e6e000c-... (extremos)</w:t>
+            </w:r>
+          </w:p>
+        </w:tc>
+        <w:tc>
+          <w:tcPr>
+            <w:tcW w:type="dxa" w:w="2200"/>
+            <w:tcMar>
+              <w:top w:type="dxa" w:w="60"/>
+              <w:left w:type="dxa" w:w="100"/>
+              <w:bottom w:type="dxa" w:w="60"/>
+              <w:right w:type="dxa" w:w="100"/>
+            </w:tcMar>
+            <w:vAlign w:val="center"/>
+          </w:tcPr>
+          <w:p>
+            <w:pPr>
+              <w:spacing w:line="240" w:lineRule="auto"/>
+              <w:jc w:val="left"/>
+            </w:pPr>
+            <w:r>
+              <w:rPr>
+                <w:rFonts w:ascii="Times New Roman" w:cs="Times New Roman" w:eastAsia="Times New Roman" w:hAnsi="Times New Roman"/>
+                <w:b w:val="false"/>
+                <w:bCs w:val="false"/>
+                <w:sz w:val="20"/>
+                <w:szCs w:val="20"/>
+              </w:rPr>
+              <w:t xml:space="preserve">leitura/notificação</w:t>
+            </w:r>
+          </w:p>
+        </w:tc>
+        <w:tc>
+          <w:tcPr>
+            <w:tcW w:type="dxa" w:w="3400"/>
+            <w:tcMar>
+              <w:top w:type="dxa" w:w="60"/>
+              <w:left w:type="dxa" w:w="100"/>
+              <w:bottom w:type="dxa" w:w="60"/>
+              <w:right w:type="dxa" w:w="100"/>
+            </w:tcMar>
+            <w:vAlign w:val="center"/>
+          </w:tcPr>
+          <w:p>
+            <w:pPr>
+              <w:spacing w:line="240" w:lineRule="auto"/>
+              <w:jc w:val="left"/>
+            </w:pPr>
+            <w:r>
+              <w:rPr>
+                <w:rFonts w:ascii="Times New Roman" w:cs="Times New Roman" w:eastAsia="Times New Roman" w:hAnsi="Times New Roman"/>
+                <w:b w:val="false"/>
+                <w:bCs w:val="false"/>
+                <w:sz w:val="20"/>
+                <w:szCs w:val="20"/>
+              </w:rPr>
+              <w:t xml:space="preserve">8 bytes = 4 inteiros de 16 bits × 100: tilt mín., tilt máx., pan mín., pan máx.; notifica só quando o valor muda (v1.5.0+)</w:t>
+            </w:r>
+          </w:p>
+        </w:tc>
+      </w:tr>
     </w:tbl>
     <w:p>
       <w:pPr>
@@ -10013,7 +10645,7 @@
           <w:sz w:val="24"/>
           <w:szCs w:val="24"/>
         </w:rPr>
-        <w:t xml:space="preserve">Ambos os aplicativos de supervisão detectam automaticamente a ausência do eixo de azimute em um firmware anterior à versão 1.2.0 — por exceção Modbus de endereço inválido, no caso do Modbus RTU, ou pela ausência da característica correspondente, no caso do BLE — e continuam operando apenas com a inclinação, sem registrar valores nulos como se fossem medições válidas. A versão do firmware, codificada como um único inteiro (por exemplo, "1.4.0" como 10400), é exposta em ambos os transportes especificamente para permitir essa detecção e para diagnóstico em campo pelo botão de teste de conexão. O mesmo mecanismo passou a ser usado pela retransmissão de amostras do Modo Vibração via BLE (seção 6.4), disponível apenas a partir da versão 1.4.0: contra um firmware anterior, o aplicativo informa explicitamente a limitação em vez de entregar uma captura incompleta.</w:t>
+        <w:t xml:space="preserve">Ambos os aplicativos de supervisão detectam automaticamente a ausência do eixo de azimute em um firmware anterior à versão 1.2.0 — por exceção Modbus de endereço inválido, no caso do Modbus RTU, ou pela ausência da característica correspondente, no caso do BLE — e continuam operando apenas com a inclinação, sem registrar valores nulos como se fossem medições válidas. A versão do firmware, codificada como um único inteiro (por exemplo, "1.6.0" como 10600), é exposta em ambos os transportes especificamente para permitir essa detecção e para diagnóstico em campo pelo botão de teste de conexão. O mesmo mecanismo passou a ser usado pela retransmissão de amostras do Modo Vibração via BLE (seção 6.4), disponível apenas a partir da versão 1.4.0, e pelos extremos medidos no firmware (seção 6.2), disponíveis a partir da versão 1.5.0: contra um firmware anterior a cada uma dessas versões, o aplicativo detecta a exceção Modbus (ou a ausência da característica BLE) e volta ao comportamento anterior — informa explicitamente a limitação no caso da retransmissão, ou passa a calcular os extremos a partir das próprias leituras recebidas, no caso dos extremos — em vez de travar ou entregar um resultado incompleto sem aviso.</w:t>
       </w:r>
     </w:p>
     <w:p>
@@ -10091,7 +10723,37 @@
           <w:sz w:val="24"/>
           <w:szCs w:val="24"/>
         </w:rPr>
-        <w:t xml:space="preserve">É o modo de operação principal: os aplicativos fazem sondagem (polling) periódica da leitura de ângulo (aproximadamente a cada 250 ms no software desktop via Modbus/BLE, ou a cada notificação BLE de 200 ms), exibem o valor em tempo real para os dois eixos, atualizam o rastreamento de mínimo e máximo por eixo, e persistem cada leitura no histórico local. O botão Calibrar zera os dois eixos simultaneamente na posição atual, tanto no modo real (enviando um único comando ao ESP32) quanto no modo simulação (aplicando um deslocamento equivalente aos dados sintéticos).</w:t>
+        <w:t xml:space="preserve">É o modo de operação principal: os aplicativos fazem sondagem (polling) periódica da leitura de ângulo (aproximadamente a cada 250 ms no software desktop via Modbus/BLE, ou a cada notificação BLE de 200 ms), exibem o valor em tempo real para os dois eixos, e persistem cada leitura no histórico local. O botão Calibrar zera os dois eixos simultaneamente na posição atual (e os extremos, ver abaixo), tanto no modo real (enviando um único comando ao ESP32) quanto no modo simulação (aplicando um deslocamento equivalente aos dados sintéticos).</w:t>
+      </w:r>
+    </w:p>
+    <w:p>
+      <w:pPr>
+        <w:spacing w:after="200" w:before="0" w:line="360" w:lineRule="auto"/>
+        <w:ind w:firstLine="709"/>
+        <w:jc w:val="both"/>
+      </w:pPr>
+      <w:r>
+        <w:rPr>
+          <w:rFonts w:ascii="Times New Roman" w:cs="Times New Roman" w:eastAsia="Times New Roman" w:hAnsi="Times New Roman"/>
+          <w:sz w:val="24"/>
+          <w:szCs w:val="24"/>
+        </w:rPr>
+        <w:t xml:space="preserve">Até a versão 1.4.0 do firmware, o rastreamento de mínimo/máximo por eixo era calculado inteiramente nos aplicativos, a partir do mesmo valor filtrado exibido na tela — o que compunha dois problemas: o filtro pesado da tela (necessário para não tremular) achatava o pico de uma rajada breve, e o próprio ritmo de sondagem (4–5 Hz) deixava passar entre duas leituras o que sobrava do pico depois do filtro. Numa rajada real de 2,0° durando meio segundo, apenas 39% da amplitude chegava a ser registrada como extremo. A partir da versão 1.5.0, o extremo passou a ser medido dentro do próprio firmware, a 100 Hz, pelo caminho de filtragem descrito na seção 4.3, e transmitido pronto pelo protocolo (registradores Modbus 2–5, característica BLE 6e6e000c-...) — a mesma rajada passou a registrar 88% da amplitude real. Contra um firmware anterior à v1.5.0, o aplicativo detecta a ausência do recurso e volta a calcular os extremos por conta própria, como antes.</w:t>
+      </w:r>
+    </w:p>
+    <w:p>
+      <w:pPr>
+        <w:spacing w:after="200" w:before="0" w:line="360" w:lineRule="auto"/>
+        <w:ind w:firstLine="709"/>
+        <w:jc w:val="both"/>
+      </w:pPr>
+      <w:r>
+        <w:rPr>
+          <w:rFonts w:ascii="Times New Roman" w:cs="Times New Roman" w:eastAsia="Times New Roman" w:hAnsi="Times New Roman"/>
+          <w:sz w:val="24"/>
+          <w:szCs w:val="24"/>
+        </w:rPr>
+        <w:t xml:space="preserve">Uma consequência visível dessa separação é que o gráfico da sessão, no relatório em PDF, continua traçando o valor exibido na tela (mais filtrado), enquanto o resumo numérico de mínimo/máximo e os marcadores de extremo no próprio gráfico vêm do caminho de medida — de modo que um marcador de extremo pode aparecer graficamente acima ou abaixo da própria curva: a curva mostra o que a tela mostrou, o marcador mostra o que de fato ocorreu no eixo.</w:t>
       </w:r>
     </w:p>
     <w:p>
@@ -10879,6 +11541,34 @@
           <w:szCs w:val="24"/>
         </w:rPr>
         <w:t xml:space="preserve">• Persistência da calibração: o deslocamento (offset) de calibração dos dois eixos é mantido apenas em memória volátil (RAM), sendo perdido a cada reinicialização do ESP32.</w:t>
+      </w:r>
+    </w:p>
+    <w:p>
+      <w:pPr>
+        <w:spacing w:after="140" w:line="360" w:lineRule="auto"/>
+        <w:ind w:left="700" w:hanging="300"/>
+      </w:pPr>
+      <w:r>
+        <w:rPr>
+          <w:rFonts w:ascii="Times New Roman" w:cs="Times New Roman" w:eastAsia="Times New Roman" w:hAnsi="Times New Roman"/>
+          <w:sz w:val="24"/>
+          <w:szCs w:val="24"/>
+        </w:rPr>
+        <w:t xml:space="preserve">• Filtro adaptativo "1-euro" e extremos medidos no firmware (v1.6.0 — seções 4.3 e 6.2): os números apresentados vêm de simulação da cadeia completa (ruído do MPU6050 → DLPF → atan2 → filtro), e o código foi conferido contra essa mesma simulação, mas ainda não foi exercitado contra o sensor físico — ruído real inclui vibração mecânica, montagem e temperatura, que a simulação não modela.</w:t>
+      </w:r>
+    </w:p>
+    <w:p>
+      <w:pPr>
+        <w:spacing w:after="140" w:line="360" w:lineRule="auto"/>
+        <w:ind w:left="700" w:hanging="300"/>
+      </w:pPr>
+      <w:r>
+        <w:rPr>
+          <w:rFonts w:ascii="Times New Roman" w:cs="Times New Roman" w:eastAsia="Times New Roman" w:hAnsi="Times New Roman"/>
+          <w:sz w:val="24"/>
+          <w:szCs w:val="24"/>
+        </w:rPr>
+        <w:t xml:space="preserve">• Retransmissão de amostras perdidas do Modo Vibração via BLE (v1.4.0 — seção 6.4): a lógica de detecção de lacuna e resolicitação foi validada com simulação de perda de pacote, mas não contra uma conexão BLE real sujeita a interferência de rádio.</w:t>
       </w:r>
     </w:p>
     <w:p>

</xml_diff>

<commit_message>
Relatório técnico rev. 03: atualização para o firmware 1.6.1
Documenta as correções feitas após o primeiro ensaio em bancada: viés do
giroscópio estimado por eixo (azimute travava em ±90° ao mudar a
inclinação — seções 4.2.1 e 7.1), orçamento de handles do serviço BLE e
tratamento das escritas BLE e do cliente Windows (seção 5.2),
retransmissão adaptativa (seção 6.4), resultados de bancada (capítulo 7)
e a nova seção 7.3 com a validação de ponta a ponta do Modo Vibração via
BLE (sim/run.sh). Limitações (agora 7.4) e considerações finais
atualizadas; o firmware deixou de constar como "nunca executado em
hardware".

Corrige também o tempo até o travamento na tabela de validação do
firmware/README.md (~1 min, conforme a simulação).

Co-Authored-By: Claude Opus 5.5 <noreply@anthropic.com>
Claude-Session: https://claude.ai/code/session_01VvvtJDPvh4mDoSVpkHza1d
</commit_message>
<xml_diff>
--- a/docs/relatorio-tecnico-inclinometro.docx
+++ b/docs/relatorio-tecnico-inclinometro.docx
@@ -1049,6 +1049,120 @@
           </w:p>
         </w:tc>
       </w:tr>
+      <w:tr>
+        <w:tc>
+          <w:tcPr>
+            <w:tcW w:type="dxa" w:w="1400"/>
+            <w:tcMar>
+              <w:top w:type="dxa" w:w="60"/>
+              <w:left w:type="dxa" w:w="100"/>
+              <w:bottom w:type="dxa" w:w="60"/>
+              <w:right w:type="dxa" w:w="100"/>
+            </w:tcMar>
+            <w:vAlign w:val="center"/>
+          </w:tcPr>
+          <w:p>
+            <w:pPr>
+              <w:spacing w:line="240" w:lineRule="auto"/>
+              <w:jc w:val="left"/>
+            </w:pPr>
+            <w:r>
+              <w:rPr>
+                <w:rFonts w:ascii="Times New Roman" w:cs="Times New Roman" w:eastAsia="Times New Roman" w:hAnsi="Times New Roman"/>
+                <w:b w:val="false"/>
+                <w:bCs w:val="false"/>
+                <w:sz w:val="20"/>
+                <w:szCs w:val="20"/>
+              </w:rPr>
+              <w:t xml:space="preserve">03</w:t>
+            </w:r>
+          </w:p>
+        </w:tc>
+        <w:tc>
+          <w:tcPr>
+            <w:tcW w:type="dxa" w:w="1600"/>
+            <w:tcMar>
+              <w:top w:type="dxa" w:w="60"/>
+              <w:left w:type="dxa" w:w="100"/>
+              <w:bottom w:type="dxa" w:w="60"/>
+              <w:right w:type="dxa" w:w="100"/>
+            </w:tcMar>
+            <w:vAlign w:val="center"/>
+          </w:tcPr>
+          <w:p>
+            <w:pPr>
+              <w:spacing w:line="240" w:lineRule="auto"/>
+              <w:jc w:val="left"/>
+            </w:pPr>
+            <w:r>
+              <w:rPr>
+                <w:rFonts w:ascii="Times New Roman" w:cs="Times New Roman" w:eastAsia="Times New Roman" w:hAnsi="Times New Roman"/>
+                <w:b w:val="false"/>
+                <w:bCs w:val="false"/>
+                <w:sz w:val="20"/>
+                <w:szCs w:val="20"/>
+              </w:rPr>
+              <w:t xml:space="preserve">24/09/2026</w:t>
+            </w:r>
+          </w:p>
+        </w:tc>
+        <w:tc>
+          <w:tcPr>
+            <w:tcW w:type="dxa" w:w="4670"/>
+            <w:tcMar>
+              <w:top w:type="dxa" w:w="60"/>
+              <w:left w:type="dxa" w:w="100"/>
+              <w:bottom w:type="dxa" w:w="60"/>
+              <w:right w:type="dxa" w:w="100"/>
+            </w:tcMar>
+            <w:vAlign w:val="center"/>
+          </w:tcPr>
+          <w:p>
+            <w:pPr>
+              <w:spacing w:line="240" w:lineRule="auto"/>
+              <w:jc w:val="left"/>
+            </w:pPr>
+            <w:r>
+              <w:rPr>
+                <w:rFonts w:ascii="Times New Roman" w:cs="Times New Roman" w:eastAsia="Times New Roman" w:hAnsi="Times New Roman"/>
+                <w:b w:val="false"/>
+                <w:bCs w:val="false"/>
+                <w:sz w:val="20"/>
+                <w:szCs w:val="20"/>
+              </w:rPr>
+              <w:t xml:space="preserve">Atualização para o firmware 1.6.1, após o primeiro ensaio em bancada: viés do giroscópio estimado por eixo, corrigindo o travamento do azimute em ±90° ao mudar a inclinação (seções 4.2.1 e 7.1); orçamento de handles do serviço BLE, corrigindo a ausência das características do Modo Vibração e da versão do firmware, e tratamento das escritas BLE e do cliente Windows (seção 5.2); retransmissão adaptativa (seção 6.4); resultados de bancada e validação de ponta a ponta do Modo Vibração via BLE (capítulo 7 e nova seção 7.3).</w:t>
+            </w:r>
+          </w:p>
+        </w:tc>
+        <w:tc>
+          <w:tcPr>
+            <w:tcW w:type="dxa" w:w="1400"/>
+            <w:tcMar>
+              <w:top w:type="dxa" w:w="60"/>
+              <w:left w:type="dxa" w:w="100"/>
+              <w:bottom w:type="dxa" w:w="60"/>
+              <w:right w:type="dxa" w:w="100"/>
+            </w:tcMar>
+            <w:vAlign w:val="center"/>
+          </w:tcPr>
+          <w:p>
+            <w:pPr>
+              <w:spacing w:line="240" w:lineRule="auto"/>
+              <w:jc w:val="left"/>
+            </w:pPr>
+            <w:r>
+              <w:rPr>
+                <w:rFonts w:ascii="Times New Roman" w:cs="Times New Roman" w:eastAsia="Times New Roman" w:hAnsi="Times New Roman"/>
+                <w:b w:val="false"/>
+                <w:bCs w:val="false"/>
+                <w:sz w:val="20"/>
+                <w:szCs w:val="20"/>
+              </w:rPr>
+              <w:t xml:space="preserve">[NOME DO AUTOR]</w:t>
+            </w:r>
+          </w:p>
+        </w:tc>
+      </w:tr>
     </w:tbl>
     <w:p>
       <w:pPr>
@@ -1096,7 +1210,7 @@
           <w:sz w:val="24"/>
           <w:szCs w:val="24"/>
         </w:rPr>
-        <w:t xml:space="preserve">Este relatório documenta o desenvolvimento de um sistema eletrônico de medição de inclinação (tilt) e azimute (pan) para um pan-tilt instalado no topo de um mastro de aproximadamente 7 m, com o objetivo de quantificar a variação angular induzida por vento. O sistema é composto por três partes: um firmware embarcado em um microcontrolador ESP32, que lê um sensor inercial MPU6050 (acelerômetro e giroscópio de 3 eixos) e expõe as medições por dois protocolos simultâneos — Modbus RTU sobre cabo USB e Bluetooth Low Energy (BLE); um software desktop em Python/PyQt5 para operação em campo via notebook; e um aplicativo Android em Kotlin/Jetpack Compose para operação móvel. A inclinação é obtida por trigonometria direta sobre o vetor de gravidade medido pelo acelerômetro (atan2), enquanto o azimute — grandeza à qual o acelerômetro é fisicamente cego — é obtido pela integração da velocidade angular do giroscópio, com compensação de inclinação e uma técnica de atualização de taxa zero (ZUPT) que elimina o desvio (drift) característico da integração de sinais inerciais. Ambos os aplicativos compartilham um mesmo modelo de dados, um rastreador de limites mínimo/máximo com histórico persistente, um Modo Vibração para caracterização espectral (FFT) da oscilação do mastro sob a ação do vento, e geração de relatórios em PDF. O texto detalha os cálculos envolvidos (conversão de unidades do sensor, filtragem, compensação de inclinação, ZUPT, escalonamento no protocolo), a especificação completa dos protocolos Modbus RTU e BLE, a arquitetura de firmware e software, os modos de operação e teste disponíveis, e as limitações e validações pendentes até a confirmação em hardware físico.</w:t>
+        <w:t xml:space="preserve">Este relatório documenta o desenvolvimento de um sistema eletrônico de medição de inclinação (tilt) e azimute (pan) para um pan-tilt instalado no topo de um mastro de aproximadamente 7 m, com o objetivo de quantificar a variação angular induzida por vento. O sistema é composto por três partes: um firmware embarcado em um microcontrolador ESP32, que lê um sensor inercial MPU6050 (acelerômetro e giroscópio de 3 eixos) e expõe as medições por dois protocolos simultâneos — Modbus RTU sobre cabo USB e Bluetooth Low Energy (BLE); um software desktop em Python/PyQt5 para operação em campo via notebook; e um aplicativo Android em Kotlin/Jetpack Compose para operação móvel. A inclinação é obtida por trigonometria direta sobre o vetor de gravidade medido pelo acelerômetro (atan2), enquanto o azimute — grandeza à qual o acelerômetro é fisicamente cego — é obtido pela integração da velocidade angular do giroscópio, com compensação de inclinação e uma técnica de atualização de taxa zero (ZUPT) que elimina o desvio (drift) característico da integração de sinais inerciais. Ambos os aplicativos compartilham um mesmo modelo de dados, um rastreador de limites mínimo/máximo com histórico persistente, um Modo Vibração para caracterização espectral (FFT) da oscilação do mastro sob a ação do vento, e geração de relatórios em PDF. O texto detalha os cálculos envolvidos (conversão de unidades do sensor, filtragem, compensação de inclinação, ZUPT, escalonamento no protocolo), a especificação completa dos protocolos Modbus RTU e BLE, a arquitetura de firmware e software, os modos de operação e teste disponíveis, os resultados dos ensaios de bancada e de simulação, e as limitações e validações pendentes até a validação do sistema montado em campo.</w:t>
       </w:r>
     </w:p>
     <w:p>
@@ -6815,7 +6929,63 @@
           <w:sz w:val="24"/>
           <w:szCs w:val="24"/>
         </w:rPr>
-        <w:t xml:space="preserve">A cada janela de tempo fixa (1000 ms), calcula-se a média de ω_pan ao longo da janela. Se essa média estiver suficientemente próxima do viés (bias) corrente estimado — dentro de um limiar de 1,0 °/s —, a janela é classificada como "parada" e o viés é atualizado por uma média móvel exponencial em direção ao valor observado, com um fator de suavização de 0,1. O critério utiliza a média da janela, e não sua dispersão (variância), justamente porque vibração mecânica tem média aproximadamente nula: o mastro pode estar balançando sob a ação do vento e a janela ainda ser corretamente reconhecida como parada, sem que a vibração seja confundida com movimento de pan.</w:t>
+        <w:t xml:space="preserve">A cada janela de tempo fixa (1000 ms), calcula-se a média das leituras brutas g_y e g_z ao longo da janela. Se essa média estiver suficientemente próxima do viés (bias) corrente estimado para esses dois eixos — a uma distância inferior a um limiar de 1,0 °/s —, a janela é classificada como "parada" e o viés de cada eixo é atualizado por uma média móvel exponencial em direção ao valor observado, com um fator de suavização de 0,1. O critério utiliza a média da janela, e não sua dispersão (variância), justamente porque vibração mecânica tem média aproximadamente nula: o mastro pode estar balançando sob a ação do vento e a janela ainda ser corretamente reconhecida como parada, sem que a vibração seja confundida com movimento de pan.</w:t>
+      </w:r>
+    </w:p>
+    <w:p>
+      <w:pPr>
+        <w:spacing w:after="200" w:before="0" w:line="360" w:lineRule="auto"/>
+        <w:ind w:firstLine="709"/>
+        <w:jc w:val="both"/>
+      </w:pPr>
+      <w:r>
+        <w:rPr>
+          <w:rFonts w:ascii="Times New Roman" w:cs="Times New Roman" w:eastAsia="Times New Roman" w:hAnsi="Times New Roman"/>
+          <w:sz w:val="24"/>
+          <w:szCs w:val="24"/>
+        </w:rPr>
+        <w:t xml:space="preserve">O viés é estimado por eixo, no referencial do próprio sensor (b_y e b_z), e só então descontado das leituras antes da projeção na vertical:</w:t>
+      </w:r>
+    </w:p>
+    <w:p>
+      <w:pPr>
+        <w:spacing w:after="240" w:before="120" w:line="260" w:lineRule="auto"/>
+        <w:ind w:left="400"/>
+      </w:pPr>
+      <w:r>
+        <w:rPr>
+          <w:rFonts w:ascii="Courier New" w:cs="Courier New" w:eastAsia="Courier New" w:hAnsi="Courier New"/>
+          <w:sz w:val="20"/>
+          <w:szCs w:val="20"/>
+        </w:rPr>
+        <w:t xml:space="preserve">ω_pan = (g_z − b_z) · cos(θ) − (g_y − b_y) · sen(θ)</w:t>
+      </w:r>
+      <w:r>
+        <w:br/>
+        <w:t xml:space="preserve"/>
+      </w:r>
+      <w:r>
+        <w:rPr>
+          <w:rFonts w:ascii="Courier New" w:cs="Courier New" w:eastAsia="Courier New" w:hAnsi="Courier New"/>
+          <w:sz w:val="20"/>
+          <w:szCs w:val="20"/>
+        </w:rPr>
+        <w:t xml:space="preserve">janela parada  ⇔  √[(ḡ_y − b_y)² + (ḡ_z − b_z)²] &lt; 1,0 °/s</w:t>
+      </w:r>
+    </w:p>
+    <w:p>
+      <w:pPr>
+        <w:spacing w:after="200" w:before="0" w:line="360" w:lineRule="auto"/>
+        <w:ind w:firstLine="709"/>
+        <w:jc w:val="both"/>
+      </w:pPr>
+      <w:r>
+        <w:rPr>
+          <w:rFonts w:ascii="Times New Roman" w:cs="Times New Roman" w:eastAsia="Times New Roman" w:hAnsi="Times New Roman"/>
+          <w:sz w:val="24"/>
+          <w:szCs w:val="24"/>
+        </w:rPr>
+        <w:t xml:space="preserve">em que ḡ_y e ḡ_z são as médias da janela. Até a versão 1.6.0, o viés era estimado sobre ω_pan já projetado, o que se mostrou incorreto: o viés de fábrica é fixo nos eixos do chip e, projetado na vertical, vale b_z·cos(θ) − b_y·sen(θ) — ou seja, muda com a inclinação. Uma mudança de posição da placa deslocava o viés aprendido em alguns graus por segundo, acima do limiar; a partir daí toda janela parada era rejeitada, o viés nunca mais se corrigia e o erro residual era integrado indefinidamente, até a leitura cravar no limite da faixa de azimute (±90°), sem recuperação nem com o retorno da placa à posição original. O defeito foi observado em bancada e corrigido na versão 1.6.1 (seção 7.1). A distância usada no teste vale exatamente |ω_pan| para uma rotação de azimute em qualquer inclinação, de modo que o limiar mantém o significado de graus por segundo de azimute; e o movimento de tilt, que ocorre em torno do eixo X, não aparece em g_y nem em g_z e não tira a janela da condição de parada.</w:t>
       </w:r>
     </w:p>
     <w:p>
@@ -7138,7 +7308,7 @@
                 <w:sz w:val="20"/>
                 <w:szCs w:val="20"/>
               </w:rPr>
-              <w:t xml:space="preserve">Comparado à média da janela (não ao pico)</w:t>
+              <w:t xml:space="preserve">Comparado à distância entre a média de g_y/g_z na janela e o viés de cada eixo (não ao pico)</w:t>
             </w:r>
           </w:p>
         </w:tc>
@@ -7224,7 +7394,7 @@
                 <w:sz w:val="20"/>
                 <w:szCs w:val="20"/>
               </w:rPr>
-              <w:t xml:space="preserve">Velocidade com que o viés persegue a média das janelas paradas</w:t>
+              <w:t xml:space="preserve">Velocidade com que o viés de cada eixo persegue a média das janelas paradas</w:t>
             </w:r>
           </w:p>
         </w:tc>
@@ -10619,22 +10789,6 @@
     </w:p>
     <w:p>
       <w:pPr>
-        <w:pStyle w:val="Heading2"/>
-        <w:spacing w:after="200" w:before="360"/>
-      </w:pPr>
-      <w:r>
-        <w:rPr>
-          <w:rFonts w:ascii="Times New Roman" w:cs="Times New Roman" w:eastAsia="Times New Roman" w:hAnsi="Times New Roman"/>
-          <w:b/>
-          <w:bCs/>
-          <w:sz w:val="24"/>
-          <w:szCs w:val="24"/>
-        </w:rPr>
-        <w:t xml:space="preserve">5.3 Compatibilidade entre versões</w:t>
-      </w:r>
-    </w:p>
-    <w:p>
-      <w:pPr>
         <w:spacing w:after="200" w:before="0" w:line="360" w:lineRule="auto"/>
         <w:ind w:firstLine="709"/>
         <w:jc w:val="both"/>
@@ -10645,39 +10799,7 @@
           <w:sz w:val="24"/>
           <w:szCs w:val="24"/>
         </w:rPr>
-        <w:t xml:space="preserve">Ambos os aplicativos de supervisão detectam automaticamente a ausência do eixo de azimute em um firmware anterior à versão 1.2.0 — por exceção Modbus de endereço inválido, no caso do Modbus RTU, ou pela ausência da característica correspondente, no caso do BLE — e continuam operando apenas com a inclinação, sem registrar valores nulos como se fossem medições válidas. A versão do firmware, codificada como um único inteiro (por exemplo, "1.6.0" como 10600), é exposta em ambos os transportes especificamente para permitir essa detecção e para diagnóstico em campo pelo botão de teste de conexão. O mesmo mecanismo passou a ser usado pela retransmissão de amostras do Modo Vibração via BLE (seção 6.4), disponível apenas a partir da versão 1.4.0, e pelos extremos medidos no firmware (seção 6.2), disponíveis a partir da versão 1.5.0: contra um firmware anterior a cada uma dessas versões, o aplicativo detecta a exceção Modbus (ou a ausência da característica BLE) e volta ao comportamento anterior — informa explicitamente a limitação no caso da retransmissão, ou passa a calcular os extremos a partir das próprias leituras recebidas, no caso dos extremos — em vez de travar ou entregar um resultado incompleto sem aviso.</w:t>
-      </w:r>
-    </w:p>
-    <w:p>
-      <w:pPr>
-        <w:pStyle w:val="Heading1"/>
-        <w:spacing w:after="240" w:before="480"/>
-      </w:pPr>
-      <w:r>
-        <w:rPr>
-          <w:rFonts w:ascii="Times New Roman" w:cs="Times New Roman" w:eastAsia="Times New Roman" w:hAnsi="Times New Roman"/>
-          <w:b/>
-          <w:bCs/>
-          <w:sz w:val="24"/>
-          <w:szCs w:val="24"/>
-        </w:rPr>
-        <w:t xml:space="preserve">6 MODOS DE OPERAÇÃO E TESTE</w:t>
-      </w:r>
-    </w:p>
-    <w:p>
-      <w:pPr>
-        <w:pStyle w:val="Heading2"/>
-        <w:spacing w:after="200" w:before="360"/>
-      </w:pPr>
-      <w:r>
-        <w:rPr>
-          <w:rFonts w:ascii="Times New Roman" w:cs="Times New Roman" w:eastAsia="Times New Roman" w:hAnsi="Times New Roman"/>
-          <w:b/>
-          <w:bCs/>
-          <w:sz w:val="24"/>
-          <w:szCs w:val="24"/>
-        </w:rPr>
-        <w:t xml:space="preserve">6.1 Modo de simulação</w:t>
+        <w:t xml:space="preserve">Cada característica ocupa dois identificadores (handles) na tabela de atributos GATT do ESP32 — declaração e valor —, mais um para cada descritor de configuração de notificação (0x2902); com a declaração do próprio serviço, as onze características da Tabela 7 somam 29 handles. A biblioteca BLE do framework Arduino para ESP32 reserva, por padrão, apenas 15 handles por serviço e, ao ultrapassar esse limite, não sinaliza erro: simplesmente deixa de registrar as características que não couberam. Até a versão 1.6.0 o serviço era criado com esse padrão, e as características de configuração, status, dados e retransmissão do Modo Vibração, bem como a de versão do firmware, não chegavam a existir no dispositivo — o aplicativo reportava "característica não encontrada" ao iniciar a captura e exibia "v?" no teste de conexão. Como a ausência de uma característica é justamente o sinal usado pelos aplicativos para reconhecer um firmware mais antigo (seção 5.3), o defeito era indistinguível, do lado do aplicativo, de um firmware sem esses recursos. A versão 1.6.1 cria o serviço com um orçamento explícito de 40 handles.</w:t>
       </w:r>
     </w:p>
     <w:p>
@@ -10692,23 +10814,7 @@
           <w:sz w:val="24"/>
           <w:szCs w:val="24"/>
         </w:rPr>
-        <w:t xml:space="preserve">Disponível em ambos os aplicativos, gera leituras sintéticas sem qualquer hardware conectado, permitindo o desenvolvimento e a validação da interface, do rastreamento de limites, do histórico e da geração de relatórios de forma independente da disponibilidade do ESP32. Os dois eixos são simulados com comportamentos deliberadamente distintos, reproduzindo o padrão de uso esperado em campo: o tilt oscila continuamente com ruído (imitando o balanço do mastro sob vento), enquanto o pan permanece parado na maior parte do tempo e se desloca em rajadas — o mesmo padrão que torna a medição de azimute por giroscópio confiável (seção 2.3).</w:t>
-      </w:r>
-    </w:p>
-    <w:p>
-      <w:pPr>
-        <w:pStyle w:val="Heading2"/>
-        <w:spacing w:after="200" w:before="360"/>
-      </w:pPr>
-      <w:r>
-        <w:rPr>
-          <w:rFonts w:ascii="Times New Roman" w:cs="Times New Roman" w:eastAsia="Times New Roman" w:hAnsi="Times New Roman"/>
-          <w:b/>
-          <w:bCs/>
-          <w:sz w:val="24"/>
-          <w:szCs w:val="24"/>
-        </w:rPr>
-        <w:t xml:space="preserve">6.2 Modo de leitura contínua</w:t>
+        <w:t xml:space="preserve">As escritas recebidas por BLE (calibrar, resetar extremos, configurar a captura, solicitar retransmissão) são entregues pela tarefa (task) da pilha Bluetooth, que executa concorrentemente ao laço principal responsável pela leitura do sensor. Por isso, todas elas apenas registram o pedido, que é executado pelo laço principal — a partir da versão 1.6.1, também a calibração e o reset de extremos, que antes alteravam o estado do integrador de azimute diretamente a partir da tarefa BLE, em condição de corrida com a integração. Os pedidos de retransmissão têm uma vaga pendente por eixo, pois o aplicativo solicita tilt e pan na mesma rodada, e com uma vaga única o segundo pedido podia sobrescrever o primeiro.</w:t>
       </w:r>
     </w:p>
     <w:p>
@@ -10723,7 +10829,23 @@
           <w:sz w:val="24"/>
           <w:szCs w:val="24"/>
         </w:rPr>
-        <w:t xml:space="preserve">É o modo de operação principal: os aplicativos fazem sondagem (polling) periódica da leitura de ângulo (aproximadamente a cada 250 ms no software desktop via Modbus/BLE, ou a cada notificação BLE de 200 ms), exibem o valor em tempo real para os dois eixos, e persistem cada leitura no histórico local. O botão Calibrar zera os dois eixos simultaneamente na posição atual (e os extremos, ver abaixo), tanto no modo real (enviando um único comando ao ESP32) quanto no modo simulação (aplicando um deslocamento equivalente aos dados sintéticos).</w:t>
+        <w:t xml:space="preserve">No aplicativo desktop em Windows, duas particularidades da pilha BLE do sistema operacional (WinRT, acessada pela biblioteca bleak) exigiram tratamento. A primeira é o modelo de threads: a biblioteca precisa operar em MTA (Multi-Threaded Apartment), mas alguma dependência do aplicativo inicializa a thread em modo STA (Single-Threaded Apartment) ao ser importada; como todas as operações BLE do aplicativo rodam em threads próprias, o aplicativo desfaz essa inicialização antes da primeira chamada BLE, conforme a documentação da biblioteca — sem isso, a conexão falhava com a mensagem "Thread is configured for Windows GUI but callbacks are not working". A segunda é o cache de características: o Windows guarda a lista de características de cada dispositivo já conectado, e após a gravação de um firmware com características novas essa lista pode ficar desatualizada; o aplicativo passou a solicitar a descoberta sem cache a cada conexão.</w:t>
+      </w:r>
+    </w:p>
+    <w:p>
+      <w:pPr>
+        <w:pStyle w:val="Heading2"/>
+        <w:spacing w:after="200" w:before="360"/>
+      </w:pPr>
+      <w:r>
+        <w:rPr>
+          <w:rFonts w:ascii="Times New Roman" w:cs="Times New Roman" w:eastAsia="Times New Roman" w:hAnsi="Times New Roman"/>
+          <w:b/>
+          <w:bCs/>
+          <w:sz w:val="24"/>
+          <w:szCs w:val="24"/>
+        </w:rPr>
+        <w:t xml:space="preserve">5.3 Compatibilidade entre versões</w:t>
       </w:r>
     </w:p>
     <w:p>
@@ -10738,7 +10860,39 @@
           <w:sz w:val="24"/>
           <w:szCs w:val="24"/>
         </w:rPr>
-        <w:t xml:space="preserve">Até a versão 1.4.0 do firmware, o rastreamento de mínimo/máximo por eixo era calculado inteiramente nos aplicativos, a partir do mesmo valor filtrado exibido na tela — o que compunha dois problemas: o filtro pesado da tela (necessário para não tremular) achatava o pico de uma rajada breve, e o próprio ritmo de sondagem (4–5 Hz) deixava passar entre duas leituras o que sobrava do pico depois do filtro. Numa rajada real de 2,0° durando meio segundo, apenas 39% da amplitude chegava a ser registrada como extremo. A partir da versão 1.5.0, o extremo passou a ser medido dentro do próprio firmware, a 100 Hz, pelo caminho de filtragem descrito na seção 4.3, e transmitido pronto pelo protocolo (registradores Modbus 2–5, característica BLE 6e6e000c-...) — a mesma rajada passou a registrar 88% da amplitude real. Contra um firmware anterior à v1.5.0, o aplicativo detecta a ausência do recurso e volta a calcular os extremos por conta própria, como antes.</w:t>
+        <w:t xml:space="preserve">Ambos os aplicativos de supervisão detectam automaticamente a ausência do eixo de azimute em um firmware anterior à versão 1.2.0 — por exceção Modbus de endereço inválido, no caso do Modbus RTU, ou pela ausência da característica correspondente, no caso do BLE — e continuam operando apenas com a inclinação, sem registrar valores nulos como se fossem medições válidas. A versão do firmware, codificada como um único inteiro (por exemplo, "1.6.1" como 10601), é exposta em ambos os transportes especificamente para permitir essa detecção e para diagnóstico em campo pelo botão de teste de conexão. O mesmo mecanismo passou a ser usado pela retransmissão de amostras do Modo Vibração via BLE (seção 6.4), disponível apenas a partir da versão 1.4.0, e pelos extremos medidos no firmware (seção 6.2), disponíveis a partir da versão 1.5.0: contra um firmware anterior a cada uma dessas versões, o aplicativo detecta a exceção Modbus (ou a ausência da característica BLE) e volta ao comportamento anterior — informa explicitamente a limitação no caso da retransmissão, ou passa a calcular os extremos a partir das próprias leituras recebidas, no caso dos extremos — em vez de travar ou entregar um resultado incompleto sem aviso.</w:t>
+      </w:r>
+    </w:p>
+    <w:p>
+      <w:pPr>
+        <w:pStyle w:val="Heading1"/>
+        <w:spacing w:after="240" w:before="480"/>
+      </w:pPr>
+      <w:r>
+        <w:rPr>
+          <w:rFonts w:ascii="Times New Roman" w:cs="Times New Roman" w:eastAsia="Times New Roman" w:hAnsi="Times New Roman"/>
+          <w:b/>
+          <w:bCs/>
+          <w:sz w:val="24"/>
+          <w:szCs w:val="24"/>
+        </w:rPr>
+        <w:t xml:space="preserve">6 MODOS DE OPERAÇÃO E TESTE</w:t>
+      </w:r>
+    </w:p>
+    <w:p>
+      <w:pPr>
+        <w:pStyle w:val="Heading2"/>
+        <w:spacing w:after="200" w:before="360"/>
+      </w:pPr>
+      <w:r>
+        <w:rPr>
+          <w:rFonts w:ascii="Times New Roman" w:cs="Times New Roman" w:eastAsia="Times New Roman" w:hAnsi="Times New Roman"/>
+          <w:b/>
+          <w:bCs/>
+          <w:sz w:val="24"/>
+          <w:szCs w:val="24"/>
+        </w:rPr>
+        <w:t xml:space="preserve">6.1 Modo de simulação</w:t>
       </w:r>
     </w:p>
     <w:p>
@@ -10753,7 +10907,7 @@
           <w:sz w:val="24"/>
           <w:szCs w:val="24"/>
         </w:rPr>
-        <w:t xml:space="preserve">Uma consequência visível dessa separação é que o gráfico da sessão, no relatório em PDF, continua traçando o valor exibido na tela (mais filtrado), enquanto o resumo numérico de mínimo/máximo e os marcadores de extremo no próprio gráfico vêm do caminho de medida — de modo que um marcador de extremo pode aparecer graficamente acima ou abaixo da própria curva: a curva mostra o que a tela mostrou, o marcador mostra o que de fato ocorreu no eixo.</w:t>
+        <w:t xml:space="preserve">Disponível em ambos os aplicativos, gera leituras sintéticas sem qualquer hardware conectado, permitindo o desenvolvimento e a validação da interface, do rastreamento de limites, do histórico e da geração de relatórios de forma independente da disponibilidade do ESP32. Os dois eixos são simulados com comportamentos deliberadamente distintos, reproduzindo o padrão de uso esperado em campo: o tilt oscila continuamente com ruído (imitando o balanço do mastro sob vento), enquanto o pan permanece parado na maior parte do tempo e se desloca em rajadas — o mesmo padrão que torna a medição de azimute por giroscópio confiável (seção 2.3).</w:t>
       </w:r>
     </w:p>
     <w:p>
@@ -10769,7 +10923,7 @@
           <w:sz w:val="24"/>
           <w:szCs w:val="24"/>
         </w:rPr>
-        <w:t xml:space="preserve">6.3 Teste de conexão</w:t>
+        <w:t xml:space="preserve">6.2 Modo de leitura contínua</w:t>
       </w:r>
     </w:p>
     <w:p>
@@ -10784,23 +10938,7 @@
           <w:sz w:val="24"/>
           <w:szCs w:val="24"/>
         </w:rPr>
-        <w:t xml:space="preserve">Em qualquer um dos modos reais (Modbus/USB ou BLE), um botão dedicado de teste de conexão realiza uma única leitura para confirmar a comunicação antes de iniciar uma sessão de monitoramento, exibindo o ângulo lido e a versão do firmware conectado em caso de sucesso, ou uma mensagem de erro específica em caso de falha — uma verificação rápida de campo antes de comprometer uma sessão de medição inteira.</w:t>
-      </w:r>
-    </w:p>
-    <w:p>
-      <w:pPr>
-        <w:pStyle w:val="Heading2"/>
-        <w:spacing w:after="200" w:before="360"/>
-      </w:pPr>
-      <w:r>
-        <w:rPr>
-          <w:rFonts w:ascii="Times New Roman" w:cs="Times New Roman" w:eastAsia="Times New Roman" w:hAnsi="Times New Roman"/>
-          <w:b/>
-          <w:bCs/>
-          <w:sz w:val="24"/>
-          <w:szCs w:val="24"/>
-        </w:rPr>
-        <w:t xml:space="preserve">6.4 Modo Vibração</w:t>
+        <w:t xml:space="preserve">É o modo de operação principal: os aplicativos fazem sondagem (polling) periódica da leitura de ângulo (aproximadamente a cada 250 ms no software desktop via Modbus/BLE, ou a cada notificação BLE de 200 ms), exibem o valor em tempo real para os dois eixos, e persistem cada leitura no histórico local. O botão Calibrar zera os dois eixos simultaneamente na posição atual (e os extremos, ver abaixo), tanto no modo real (enviando um único comando ao ESP32) quanto no modo simulação (aplicando um deslocamento equivalente aos dados sintéticos).</w:t>
       </w:r>
     </w:p>
     <w:p>
@@ -10815,7 +10953,7 @@
           <w:sz w:val="24"/>
           <w:szCs w:val="24"/>
         </w:rPr>
-        <w:t xml:space="preserve">Destinado à caracterização de oscilações de curta duração e maior frequência (por exemplo, o comportamento dinâmico do mastro sob rajadas de vento), que a leitura contínua — mais lenta e filtrada para estabilidade — não consegue capturar com fidelidade. O operador escolhe a duração (padrão 30 s) e a taxa de amostragem (padrão 50 Hz, máximo de 500 Hz) da captura; o firmware amostra os dois eixos nessa taxa, sem os filtros de estabilização usados na leitura contínua, armazenando as amostras em um buffer dedicado (até 6000 amostras por eixo, aproximadamente 24 kB de memória RAM estática para os dois buffers). Como o buffer é o limite, a duração efetiva encurta à medida que a taxa aumenta — a 500 Hz, a captura é truncada em aproximadamente 12 s, o que o aplicativo informa na própria tela de configuração, antes de iniciar.</w:t>
+        <w:t xml:space="preserve">Até a versão 1.4.0 do firmware, o rastreamento de mínimo/máximo por eixo era calculado inteiramente nos aplicativos, a partir do mesmo valor filtrado exibido na tela — o que compunha dois problemas: o filtro pesado da tela (necessário para não tremular) achatava o pico de uma rajada breve, e o próprio ritmo de sondagem (4–5 Hz) deixava passar entre duas leituras o que sobrava do pico depois do filtro. Numa rajada real de 2,0° durando meio segundo, apenas 39% da amplitude chegava a ser registrada como extremo. A partir da versão 1.5.0, o extremo passou a ser medido dentro do próprio firmware, a 100 Hz, pelo caminho de filtragem descrito na seção 4.3, e transmitido pronto pelo protocolo (registradores Modbus 2–5, característica BLE 6e6e000c-...) — a mesma rajada passou a registrar 88% da amplitude real. Contra um firmware anterior à v1.5.0, o aplicativo detecta a ausência do recurso e volta a calcular os extremos por conta própria, como antes.</w:t>
       </w:r>
     </w:p>
     <w:p>
@@ -10830,7 +10968,23 @@
           <w:sz w:val="24"/>
           <w:szCs w:val="24"/>
         </w:rPr>
-        <w:t xml:space="preserve">Ao final da captura, cada aplicativo calcula, para cada eixo, um resumo estatístico (desvio padrão, valor RMS, amplitude pico a pico, mínimo e máximo) e realiza uma análise espectral por Transformada Rápida de Fourier (FFT), identificando a frequência dominante — com sua amplitude e relação sinal-ruído (SNR), ou a indicação de que nenhum pico é estatisticamente confiável, caso o sinal seja compatível com ruído puro. Opcionalmente, é gerado um relatório em PDF com uma página por eixo, contendo o gráfico da variação angular no tempo e o espectro de frequência, com a frequência dominante marcada.</w:t>
+        <w:t xml:space="preserve">Uma consequência visível dessa separação é que o gráfico da sessão, no relatório em PDF, continua traçando o valor exibido na tela (mais filtrado), enquanto o resumo numérico de mínimo/máximo e os marcadores de extremo no próprio gráfico vêm do caminho de medida — de modo que um marcador de extremo pode aparecer graficamente acima ou abaixo da própria curva: a curva mostra o que a tela mostrou, o marcador mostra o que de fato ocorreu no eixo.</w:t>
+      </w:r>
+    </w:p>
+    <w:p>
+      <w:pPr>
+        <w:pStyle w:val="Heading2"/>
+        <w:spacing w:after="200" w:before="360"/>
+      </w:pPr>
+      <w:r>
+        <w:rPr>
+          <w:rFonts w:ascii="Times New Roman" w:cs="Times New Roman" w:eastAsia="Times New Roman" w:hAnsi="Times New Roman"/>
+          <w:b/>
+          <w:bCs/>
+          <w:sz w:val="24"/>
+          <w:szCs w:val="24"/>
+        </w:rPr>
+        <w:t xml:space="preserve">6.3 Teste de conexão</w:t>
       </w:r>
     </w:p>
     <w:p>
@@ -10845,7 +10999,23 @@
           <w:sz w:val="24"/>
           <w:szCs w:val="24"/>
         </w:rPr>
-        <w:t xml:space="preserve">O pipeline de processamento de sinais, implementado de forma equivalente em Python (limits/vibration_stats.py) e em Kotlin (limits/Fft.kt), aplica remoção de tendência linear, janelamento de Hann (para reduzir vazamento espectral), correção de amplitude para um espectro de um único lado, e detecção do pico dominante por interpolação parabólica (resolução sub-bin), com um limiar de relação sinal-ruído que se adapta ao número de bins do espectro para evitar falsos positivos em sinais compostos apenas por ruído.</w:t>
+        <w:t xml:space="preserve">Em qualquer um dos modos reais (Modbus/USB ou BLE), um botão dedicado de teste de conexão realiza uma única leitura para confirmar a comunicação antes de iniciar uma sessão de monitoramento, exibindo o ângulo lido e a versão do firmware conectado em caso de sucesso, ou uma mensagem de erro específica em caso de falha — uma verificação rápida de campo antes de comprometer uma sessão de medição inteira.</w:t>
+      </w:r>
+    </w:p>
+    <w:p>
+      <w:pPr>
+        <w:pStyle w:val="Heading2"/>
+        <w:spacing w:after="200" w:before="360"/>
+      </w:pPr>
+      <w:r>
+        <w:rPr>
+          <w:rFonts w:ascii="Times New Roman" w:cs="Times New Roman" w:eastAsia="Times New Roman" w:hAnsi="Times New Roman"/>
+          <w:b/>
+          <w:bCs/>
+          <w:sz w:val="24"/>
+          <w:szCs w:val="24"/>
+        </w:rPr>
+        <w:t xml:space="preserve">6.4 Modo Vibração</w:t>
       </w:r>
     </w:p>
     <w:p>
@@ -10860,7 +11030,7 @@
           <w:sz w:val="24"/>
           <w:szCs w:val="24"/>
         </w:rPr>
-        <w:t xml:space="preserve">Dois refinamentos desse pipeline foram introduzidos após validação numérica contra sinais sintéticos de amplitude e frequência conhecidas. O primeiro diz respeito à amplitude reportada: a interpolação parabólica passou a ser feita sobre a magnitude em decibéis, e não sobre a magnitude linear. O lóbulo principal da janela de Hann é aproximadamente gaussiano, e uma gaussiana em escala logarítmica é exatamente uma parábola, de modo que o ajuste em decibéis localiza o vértice com muito mais precisão. A diferença é significativa porque o preenchimento com zeros até a próxima potência de dois altera o espaçamento entre bins, fazendo com que um tom que antes coincidia com o centro de um bin passe a cair entre bins: nessa condição, a magnitude do bin de pico subestima a amplitude real em até 12,5 % (perda de scalloping), e o ajuste parabólico linear ainda apresenta erro de até 5,6 %, contra 2,9 % do ajuste em decibéis.</w:t>
+        <w:t xml:space="preserve">Destinado à caracterização de oscilações de curta duração e maior frequência (por exemplo, o comportamento dinâmico do mastro sob rajadas de vento), que a leitura contínua — mais lenta e filtrada para estabilidade — não consegue capturar com fidelidade. O operador escolhe a duração (padrão 30 s) e a taxa de amostragem (padrão 50 Hz, máximo de 500 Hz) da captura; o firmware amostra os dois eixos nessa taxa, sem os filtros de estabilização usados na leitura contínua, armazenando as amostras em um buffer dedicado (até 6000 amostras por eixo, aproximadamente 24 kB de memória RAM estática para os dois buffers). Como o buffer é o limite, a duração efetiva encurta à medida que a taxa aumenta — a 500 Hz, a captura é truncada em aproximadamente 12 s, o que o aplicativo informa na própria tela de configuração, antes de iniciar.</w:t>
       </w:r>
     </w:p>
     <w:p>
@@ -10875,7 +11045,7 @@
           <w:sz w:val="24"/>
           <w:szCs w:val="24"/>
         </w:rPr>
-        <w:t xml:space="preserve">O segundo refinamento diz respeito ao piso de ruído usado no teste de confiança. A mediana era calculada sobre todo o espectro, o que só é legítimo quando o piso de ruído é aproximadamente plano. Na prática ele não é: o filtro passa-baixa interno do sensor (seção 4.3) atenua o ruído acima de sua banda de passagem, e em um espectro que se estende muito além dela a mediana global é puxada para baixo pela região já filtrada, inflando artificialmente a relação sinal-ruído de qualquer ondulação de ruído situada na porção não filtrada. Medido com ruído puro filtrado a 500 Hz de amostragem, o piso global resultava em 49 dB de relação sinal-ruído — muito acima do limiar de 19 dB, ou seja, um falso positivo garantido —, enquanto o piso medido em uma janela local em torno do pico resulta em 10 dB, e o pico é corretamente rejeitado. O efeito se agrava quanto maior a taxa de amostragem, o que tornou a correção condição necessária para a operação em 500 Hz.</w:t>
+        <w:t xml:space="preserve">Ao final da captura, cada aplicativo calcula, para cada eixo, um resumo estatístico (desvio padrão, valor RMS, amplitude pico a pico, mínimo e máximo) e realiza uma análise espectral por Transformada Rápida de Fourier (FFT), identificando a frequência dominante — com sua amplitude e relação sinal-ruído (SNR), ou a indicação de que nenhum pico é estatisticamente confiável, caso o sinal seja compatível com ruído puro. Opcionalmente, é gerado um relatório em PDF com uma página por eixo, contendo o gráfico da variação angular no tempo e o espectro de frequência, com a frequência dominante marcada.</w:t>
       </w:r>
     </w:p>
     <w:p>
@@ -10890,7 +11060,7 @@
           <w:sz w:val="24"/>
           <w:szCs w:val="24"/>
         </w:rPr>
-        <w:t xml:space="preserve">A transferência das amostras capturadas para o aplicativo recebe tratamento distinto em cada transporte, por uma diferença fundamental entre eles. No Modbus RTU, cada bloco de amostras é obtido por uma transação de requisição e resposta: se a resposta não chega, a leitura falha explicitamente. Já no BLE os dados são enviados por notificação, que não é confirmada pelo receptor — se a fila do rádio do ESP32 estiver cheia, o pacote é descartado sem qualquer indicação. Como as amostras são identificadas por índice, um pacote perdido deixa uma lacuna na série, e reconstruí-la ignorando essa lacuna adiantaria no tempo todas as amostras subsequentes, deslocando o espectro inteiro sem nenhum sinal de erro. Por isso o aplicativo verifica a completude da série recebida contra o total informado pelo firmware e, havendo lacunas, solicita a retransmissão a partir do primeiro índice faltante de cada eixo (característica de retransmissão, seção 5.2). Persistindo a falha após um número limitado de tentativas, o resultado é rejeitado com mensagem explícita — a alternativa, entregar um espectro plausível porém incorreto, é o pior desfecho possível para um instrumento de medição.</w:t>
+        <w:t xml:space="preserve">O pipeline de processamento de sinais, implementado de forma equivalente em Python (limits/vibration_stats.py) e em Kotlin (limits/Fft.kt), aplica remoção de tendência linear, janelamento de Hann (para reduzir vazamento espectral), correção de amplitude para um espectro de um único lado, e detecção do pico dominante por interpolação parabólica (resolução sub-bin), com um limiar de relação sinal-ruído que se adapta ao número de bins do espectro para evitar falsos positivos em sinais compostos apenas por ruído.</w:t>
       </w:r>
     </w:p>
     <w:p>
@@ -10905,23 +11075,7 @@
           <w:sz w:val="24"/>
           <w:szCs w:val="24"/>
         </w:rPr>
-        <w:t xml:space="preserve">No eixo de azimute, o Modo Vibração transmite a velocidade angular (°/s), e não o ângulo integrado — porque o mecanismo de cancelamento de janela parada do ZUPT (seção 4.2.1) apagaria justamente a oscilação que se quer medir, uma vez que um ensaio de vibração ocorre exatamente com o eixo mecanicamente parado. Cada aplicativo integra a velocidade angular recebida (regra do trapézio) e remove a tendência linear resultante, que corresponde ao viés residual do giroscópio. A detecção do pico espectral, nesse eixo, é realizada sobre o espectro da taxa angular (onde o ruído do giroscópio é efetivamente branco), e apenas a amplitude do pico encontrado é convertida para graus pela relação A = R(f) / (2πf) — uma correção necessária porque a integração de ruído branco produz um espectro com queda proporcional a 1/f² (passeio aleatório), o que, sem essa correção, levava o algoritmo a apontar ruído puro como "frequência dominante" em todos os testes realizados.</w:t>
-      </w:r>
-    </w:p>
-    <w:p>
-      <w:pPr>
-        <w:pStyle w:val="Heading1"/>
-        <w:spacing w:after="240" w:before="480"/>
-      </w:pPr>
-      <w:r>
-        <w:rPr>
-          <w:rFonts w:ascii="Times New Roman" w:cs="Times New Roman" w:eastAsia="Times New Roman" w:hAnsi="Times New Roman"/>
-          <w:b/>
-          <w:bCs/>
-          <w:sz w:val="24"/>
-          <w:szCs w:val="24"/>
-        </w:rPr>
-        <w:t xml:space="preserve">7 RESULTADOS E VALIDAÇÃO</w:t>
+        <w:t xml:space="preserve">Dois refinamentos desse pipeline foram introduzidos após validação numérica contra sinais sintéticos de amplitude e frequência conhecidas. O primeiro diz respeito à amplitude reportada: a interpolação parabólica passou a ser feita sobre a magnitude em decibéis, e não sobre a magnitude linear. O lóbulo principal da janela de Hann é aproximadamente gaussiano, e uma gaussiana em escala logarítmica é exatamente uma parábola, de modo que o ajuste em decibéis localiza o vértice com muito mais precisão. A diferença é significativa porque o preenchimento com zeros até a próxima potência de dois altera o espaçamento entre bins, fazendo com que um tom que antes coincidia com o centro de um bin passe a cair entre bins: nessa condição, a magnitude do bin de pico subestima a amplitude real em até 12,5 % (perda de scalloping), e o ajuste parabólico linear ainda apresenta erro de até 5,6 %, contra 2,9 % do ajuste em decibéis.</w:t>
       </w:r>
     </w:p>
     <w:p>
@@ -10936,7 +11090,68 @@
           <w:sz w:val="24"/>
           <w:szCs w:val="24"/>
         </w:rPr>
-        <w:t xml:space="preserve">Até a elaboração deste relatório, o hardware físico completo (ESP32 + MPU6050 montado no pan-tilt) não havia sido submetido a testes de validação final; os resultados apresentados a seguir referem-se a validações realizadas por simulação numérica e por testes unitários do código, descritos nesta seção juntamente com as limitações e verificações pendentes.</w:t>
+        <w:t xml:space="preserve">O segundo refinamento diz respeito ao piso de ruído usado no teste de confiança. A mediana era calculada sobre todo o espectro, o que só é legítimo quando o piso de ruído é aproximadamente plano. Na prática ele não é: o filtro passa-baixa interno do sensor (seção 4.3) atenua o ruído acima de sua banda de passagem, e em um espectro que se estende muito além dela a mediana global é puxada para baixo pela região já filtrada, inflando artificialmente a relação sinal-ruído de qualquer ondulação de ruído situada na porção não filtrada. Medido com ruído puro filtrado a 500 Hz de amostragem, o piso global resultava em 49 dB de relação sinal-ruído — muito acima do limiar de 19 dB, ou seja, um falso positivo garantido —, enquanto o piso medido em uma janela local em torno do pico resulta em 10 dB, e o pico é corretamente rejeitado. O efeito se agrava quanto maior a taxa de amostragem, o que tornou a correção condição necessária para a operação em 500 Hz.</w:t>
+      </w:r>
+    </w:p>
+    <w:p>
+      <w:pPr>
+        <w:spacing w:after="200" w:before="0" w:line="360" w:lineRule="auto"/>
+        <w:ind w:firstLine="709"/>
+        <w:jc w:val="both"/>
+      </w:pPr>
+      <w:r>
+        <w:rPr>
+          <w:rFonts w:ascii="Times New Roman" w:cs="Times New Roman" w:eastAsia="Times New Roman" w:hAnsi="Times New Roman"/>
+          <w:sz w:val="24"/>
+          <w:szCs w:val="24"/>
+        </w:rPr>
+        <w:t xml:space="preserve">A transferência das amostras capturadas para o aplicativo recebe tratamento distinto em cada transporte, por uma diferença fundamental entre eles. No Modbus RTU, cada bloco de amostras é obtido por uma transação de requisição e resposta: se a resposta não chega, a leitura falha explicitamente. Já no BLE os dados são enviados por notificação, que não é confirmada pelo receptor — se a fila do rádio do ESP32 estiver cheia, o pacote é descartado sem qualquer indicação. Como as amostras são identificadas por índice, um pacote perdido deixa uma lacuna na série, e reconstruí-la ignorando essa lacuna adiantaria no tempo todas as amostras subsequentes, deslocando o espectro inteiro sem nenhum sinal de erro. Por isso o aplicativo verifica a completude da série recebida contra o total informado pelo firmware e, havendo lacunas, solicita a retransmissão a partir do primeiro índice faltante de cada eixo (característica de retransmissão, seção 5.2). A solicitação é repetida enquanto cada rodada recuperar amostras — até 20 rodadas, encerrando após três rodadas seguidas sem progresso —, pois uma perda elevada exige apenas mais rodadas; persistindo lacunas, o resultado é rejeitado com mensagem explícita — a alternativa, entregar um espectro plausível porém incorreto, é o pior desfecho possível para um instrumento de medição.</w:t>
+      </w:r>
+    </w:p>
+    <w:p>
+      <w:pPr>
+        <w:spacing w:after="200" w:before="0" w:line="360" w:lineRule="auto"/>
+        <w:ind w:firstLine="709"/>
+        <w:jc w:val="both"/>
+      </w:pPr>
+      <w:r>
+        <w:rPr>
+          <w:rFonts w:ascii="Times New Roman" w:cs="Times New Roman" w:eastAsia="Times New Roman" w:hAnsi="Times New Roman"/>
+          <w:sz w:val="24"/>
+          <w:szCs w:val="24"/>
+        </w:rPr>
+        <w:t xml:space="preserve">No eixo de azimute, o Modo Vibração transmite a velocidade angular (°/s), e não o ângulo integrado — porque o mecanismo de cancelamento de janela parada do ZUPT (seção 4.2.1) apagaria justamente a oscilação que se quer medir, uma vez que um ensaio de vibração ocorre exatamente com o eixo mecanicamente parado. Cada aplicativo integra a velocidade angular recebida (regra do trapézio) e remove a tendência linear resultante, que corresponde ao viés residual do giroscópio. A detecção do pico espectral, nesse eixo, é realizada sobre o espectro da taxa angular (onde o ruído do giroscópio é efetivamente branco), e apenas a amplitude do pico encontrado é convertida para graus pela relação A = R(f) / (2πf) — uma correção necessária porque a integração de ruído branco produz um espectro com queda proporcional a 1/f² (passeio aleatório), o que, sem essa correção, levava o algoritmo a apontar ruído puro como "frequência dominante" em todos os testes realizados.</w:t>
+      </w:r>
+    </w:p>
+    <w:p>
+      <w:pPr>
+        <w:pStyle w:val="Heading1"/>
+        <w:spacing w:after="240" w:before="480"/>
+      </w:pPr>
+      <w:r>
+        <w:rPr>
+          <w:rFonts w:ascii="Times New Roman" w:cs="Times New Roman" w:eastAsia="Times New Roman" w:hAnsi="Times New Roman"/>
+          <w:b/>
+          <w:bCs/>
+          <w:sz w:val="24"/>
+          <w:szCs w:val="24"/>
+        </w:rPr>
+        <w:t xml:space="preserve">7 RESULTADOS E VALIDAÇÃO</w:t>
+      </w:r>
+    </w:p>
+    <w:p>
+      <w:pPr>
+        <w:spacing w:after="200" w:before="0" w:line="360" w:lineRule="auto"/>
+        <w:ind w:firstLine="709"/>
+        <w:jc w:val="both"/>
+      </w:pPr>
+      <w:r>
+        <w:rPr>
+          <w:rFonts w:ascii="Times New Roman" w:cs="Times New Roman" w:eastAsia="Times New Roman" w:hAnsi="Times New Roman"/>
+          <w:sz w:val="24"/>
+          <w:szCs w:val="24"/>
+        </w:rPr>
+        <w:t xml:space="preserve">O firmware foi compilado, gravado em um ESP32 físico (DevKit com módulo WROOM-32) e exercitado em bancada por BLE: o teste de conexão com leitura da versão, a leitura contínua dos dois eixos e a captura do Modo Vibração a 500 Hz por 10 s funcionaram após as correções da versão 1.6.1, motivadas justamente por defeitos observados nesse ensaio (seções 4.2.1 e 5.2). O sistema completo montado no pan-tilt, entretanto, ainda não foi submetido a testes de validação final; os resultados quantitativos apresentados a seguir referem-se a validações por simulação numérica e por testes do código, descritos nesta seção juntamente com as limitações e verificações pendentes.</w:t>
       </w:r>
     </w:p>
     <w:p>
@@ -11339,6 +11554,180 @@
           </w:p>
         </w:tc>
       </w:tr>
+      <w:tr>
+        <w:tc>
+          <w:tcPr>
+            <w:tcW w:type="dxa" w:w="4700"/>
+            <w:tcMar>
+              <w:top w:type="dxa" w:w="60"/>
+              <w:left w:type="dxa" w:w="100"/>
+              <w:bottom w:type="dxa" w:w="60"/>
+              <w:right w:type="dxa" w:w="100"/>
+            </w:tcMar>
+            <w:vAlign w:val="center"/>
+          </w:tcPr>
+          <w:p>
+            <w:pPr>
+              <w:spacing w:line="240" w:lineRule="auto"/>
+              <w:jc w:val="left"/>
+            </w:pPr>
+            <w:r>
+              <w:rPr>
+                <w:rFonts w:ascii="Times New Roman" w:cs="Times New Roman" w:eastAsia="Times New Roman" w:hAnsi="Times New Roman"/>
+                <w:b w:val="false"/>
+                <w:bCs w:val="false"/>
+                <w:sz w:val="20"/>
+                <w:szCs w:val="20"/>
+              </w:rPr>
+              <w:t xml:space="preserve">Placa parada, inclinação alterada de 0° para 45° (viés típico) — v1.6.1</w:t>
+            </w:r>
+          </w:p>
+        </w:tc>
+        <w:tc>
+          <w:tcPr>
+            <w:tcW w:type="dxa" w:w="4300"/>
+            <w:tcMar>
+              <w:top w:type="dxa" w:w="60"/>
+              <w:left w:type="dxa" w:w="100"/>
+              <w:bottom w:type="dxa" w:w="60"/>
+              <w:right w:type="dxa" w:w="100"/>
+            </w:tcMar>
+            <w:vAlign w:val="center"/>
+          </w:tcPr>
+          <w:p>
+            <w:pPr>
+              <w:spacing w:line="240" w:lineRule="auto"/>
+              <w:jc w:val="left"/>
+            </w:pPr>
+            <w:r>
+              <w:rPr>
+                <w:rFonts w:ascii="Times New Roman" w:cs="Times New Roman" w:eastAsia="Times New Roman" w:hAnsi="Times New Roman"/>
+                <w:b w:val="false"/>
+                <w:bCs w:val="false"/>
+                <w:sz w:val="20"/>
+                <w:szCs w:val="20"/>
+              </w:rPr>
+              <w:t xml:space="preserve">0,00° (na versão 1.6.0: leitura cravada em −90° após cerca de 1 min)</w:t>
+            </w:r>
+          </w:p>
+        </w:tc>
+      </w:tr>
+      <w:tr>
+        <w:tc>
+          <w:tcPr>
+            <w:tcW w:type="dxa" w:w="4700"/>
+            <w:tcMar>
+              <w:top w:type="dxa" w:w="60"/>
+              <w:left w:type="dxa" w:w="100"/>
+              <w:bottom w:type="dxa" w:w="60"/>
+              <w:right w:type="dxa" w:w="100"/>
+            </w:tcMar>
+            <w:vAlign w:val="center"/>
+          </w:tcPr>
+          <w:p>
+            <w:pPr>
+              <w:spacing w:line="240" w:lineRule="auto"/>
+              <w:jc w:val="left"/>
+            </w:pPr>
+            <w:r>
+              <w:rPr>
+                <w:rFonts w:ascii="Times New Roman" w:cs="Times New Roman" w:eastAsia="Times New Roman" w:hAnsi="Times New Roman"/>
+                <w:b w:val="false"/>
+                <w:bCs w:val="false"/>
+                <w:sz w:val="20"/>
+                <w:szCs w:val="20"/>
+              </w:rPr>
+              <w:t xml:space="preserve">Azimute +30°, inclinação vai a 45° e retorna a 0° — v1.6.1</w:t>
+            </w:r>
+          </w:p>
+        </w:tc>
+        <w:tc>
+          <w:tcPr>
+            <w:tcW w:type="dxa" w:w="4300"/>
+            <w:tcMar>
+              <w:top w:type="dxa" w:w="60"/>
+              <w:left w:type="dxa" w:w="100"/>
+              <w:bottom w:type="dxa" w:w="60"/>
+              <w:right w:type="dxa" w:w="100"/>
+            </w:tcMar>
+            <w:vAlign w:val="center"/>
+          </w:tcPr>
+          <w:p>
+            <w:pPr>
+              <w:spacing w:line="240" w:lineRule="auto"/>
+              <w:jc w:val="left"/>
+            </w:pPr>
+            <w:r>
+              <w:rPr>
+                <w:rFonts w:ascii="Times New Roman" w:cs="Times New Roman" w:eastAsia="Times New Roman" w:hAnsi="Times New Roman"/>
+                <w:b w:val="false"/>
+                <w:bCs w:val="false"/>
+                <w:sz w:val="20"/>
+                <w:szCs w:val="20"/>
+              </w:rPr>
+              <w:t xml:space="preserve">29,76° mantidos (na versão 1.6.0: −39,5°, sem recuperação)</w:t>
+            </w:r>
+          </w:p>
+        </w:tc>
+      </w:tr>
+      <w:tr>
+        <w:tc>
+          <w:tcPr>
+            <w:tcW w:type="dxa" w:w="4700"/>
+            <w:tcMar>
+              <w:top w:type="dxa" w:w="60"/>
+              <w:left w:type="dxa" w:w="100"/>
+              <w:bottom w:type="dxa" w:w="60"/>
+              <w:right w:type="dxa" w:w="100"/>
+            </w:tcMar>
+            <w:vAlign w:val="center"/>
+          </w:tcPr>
+          <w:p>
+            <w:pPr>
+              <w:spacing w:line="240" w:lineRule="auto"/>
+              <w:jc w:val="left"/>
+            </w:pPr>
+            <w:r>
+              <w:rPr>
+                <w:rFonts w:ascii="Times New Roman" w:cs="Times New Roman" w:eastAsia="Times New Roman" w:hAnsi="Times New Roman"/>
+                <w:b w:val="false"/>
+                <w:bCs w:val="false"/>
+                <w:sz w:val="20"/>
+                <w:szCs w:val="20"/>
+              </w:rPr>
+              <w:t xml:space="preserve">Viés de fábrica de até 15 °/s por eixo; inclinação 0°→60°, azimute +30°, inclinação 60°→10° — v1.6.1</w:t>
+            </w:r>
+          </w:p>
+        </w:tc>
+        <w:tc>
+          <w:tcPr>
+            <w:tcW w:type="dxa" w:w="4300"/>
+            <w:tcMar>
+              <w:top w:type="dxa" w:w="60"/>
+              <w:left w:type="dxa" w:w="100"/>
+              <w:bottom w:type="dxa" w:w="60"/>
+              <w:right w:type="dxa" w:w="100"/>
+            </w:tcMar>
+            <w:vAlign w:val="center"/>
+          </w:tcPr>
+          <w:p>
+            <w:pPr>
+              <w:spacing w:line="240" w:lineRule="auto"/>
+              <w:jc w:val="left"/>
+            </w:pPr>
+            <w:r>
+              <w:rPr>
+                <w:rFonts w:ascii="Times New Roman" w:cs="Times New Roman" w:eastAsia="Times New Roman" w:hAnsi="Times New Roman"/>
+                <w:b w:val="false"/>
+                <w:bCs w:val="false"/>
+                <w:sz w:val="20"/>
+                <w:szCs w:val="20"/>
+              </w:rPr>
+              <w:t xml:space="preserve">29,77° mantidos</w:t>
+            </w:r>
+          </w:p>
+        </w:tc>
+      </w:tr>
     </w:tbl>
     <w:p>
       <w:pPr>
@@ -11351,7 +11740,7 @@
           <w:sz w:val="20"/>
           <w:szCs w:val="20"/>
         </w:rPr>
-        <w:t xml:space="preserve">Tabela 8 — Resultados de validação do algoritmo de azimute contra sinais sintéticos. Fonte: elaborado pelo autor, com base nos testes documentados em firmware/README.md.</w:t>
+        <w:t xml:space="preserve">Tabela 8 — Resultados de validação do algoritmo de azimute contra sinais sintéticos. Fonte: elaborado pelo autor, com base nos testes documentados em firmware/README.md e em sim/pan_sim.cpp.</w:t>
       </w:r>
     </w:p>
     <w:p>
@@ -11366,7 +11755,7 @@
           <w:sz w:val="24"/>
           <w:szCs w:val="24"/>
         </w:rPr>
-        <w:t xml:space="preserve">O piso de detecção observado nos testes correspondeu ao previsto pelo produto limiar × janela (seção 4.2.1): movimentos de até aproximadamente 1° foram descartados como ruído, e movimentos a partir de aproximadamente 2° foram preservados integralmente. Ressalta-se que esses resultados validam a correção matemática do algoritmo, e não seu comportamento contra o sensor físico real — validação que permanece pendente (seção 7.3).</w:t>
+        <w:t xml:space="preserve">O piso de detecção observado nos testes correspondeu ao previsto pelo produto limiar × janela (seção 4.2.1): movimentos de até aproximadamente 1° foram descartados como ruído, e movimentos a partir de aproximadamente 2° foram preservados integralmente. As três últimas linhas foram acrescentadas nesta revisão, depois que o defeito de viés dependente da inclinação (seção 4.2.1) foi observado em bancada: os cenários originais, todos com inclinação fixa durante o teste, não o exercitavam. Os cenários estão automatizados em sim/pan_sim.cpp, executado pelo script sim/run.sh. Ressalta-se que esses resultados validam a correção matemática do algoritmo, e não seu comportamento contra o sensor físico real — validação que permanece pendente (seção 7.4).</w:t>
       </w:r>
     </w:p>
     <w:p>
@@ -11413,7 +11802,7 @@
           <w:sz w:val="24"/>
           <w:szCs w:val="24"/>
         </w:rPr>
-        <w:t xml:space="preserve">7.3 Limitações conhecidas e validações pendentes</w:t>
+        <w:t xml:space="preserve">7.3 Validação de ponta a ponta do Modo Vibração via BLE</w:t>
       </w:r>
     </w:p>
     <w:p>
@@ -11428,163 +11817,391 @@
           <w:sz w:val="24"/>
           <w:szCs w:val="24"/>
         </w:rPr>
-        <w:t xml:space="preserve">As seguintes limitações e verificações são conhecidas e permanecem pendentes de confirmação em hardware físico:</w:t>
-      </w:r>
-    </w:p>
-    <w:p>
-      <w:pPr>
-        <w:spacing w:after="140" w:line="360" w:lineRule="auto"/>
-        <w:ind w:left="700" w:hanging="300"/>
-      </w:pPr>
-      <w:r>
-        <w:rPr>
-          <w:rFonts w:ascii="Times New Roman" w:cs="Times New Roman" w:eastAsia="Times New Roman" w:hAnsi="Times New Roman"/>
-          <w:sz w:val="24"/>
-          <w:szCs w:val="24"/>
-        </w:rPr>
-        <w:t xml:space="preserve">• Compilação e gravação do firmware em hardware real: o ambiente de desenvolvimento utilizado não permitiu o download do toolchain espressif32 pela ferramenta PlatformIO; o código foi revisado manualmente, mas ainda não foi compilado nem executado em um ESP32 físico.</w:t>
-      </w:r>
-    </w:p>
-    <w:p>
-      <w:pPr>
-        <w:spacing w:after="140" w:line="360" w:lineRule="auto"/>
-        <w:ind w:left="700" w:hanging="300"/>
-      </w:pPr>
-      <w:r>
-        <w:rPr>
-          <w:rFonts w:ascii="Times New Roman" w:cs="Times New Roman" w:eastAsia="Times New Roman" w:hAnsi="Times New Roman"/>
-          <w:sz w:val="24"/>
-          <w:szCs w:val="24"/>
-        </w:rPr>
-        <w:t xml:space="preserve">• Orientação de montagem do sensor: a fórmula de inclinação (atan2 sobre os eixos Y e Z) e a de compensação de tilt do azimute assumem uma orientação específica de montagem do MPU6050 (eixo X alinhado ao eixo mecânico de giro), recomendada mas ainda não confirmada fisicamente por um ensaio de bancada.</w:t>
-      </w:r>
-    </w:p>
-    <w:p>
-      <w:pPr>
-        <w:spacing w:after="140" w:line="360" w:lineRule="auto"/>
-        <w:ind w:left="700" w:hanging="300"/>
-      </w:pPr>
-      <w:r>
-        <w:rPr>
-          <w:rFonts w:ascii="Times New Roman" w:cs="Times New Roman" w:eastAsia="Times New Roman" w:hAnsi="Times New Roman"/>
-          <w:sz w:val="24"/>
-          <w:szCs w:val="24"/>
-        </w:rPr>
-        <w:t xml:space="preserve">• Sinal do termo de compensação de tilt (−g_y·sen θ): depende da lateralidade (handedness) real da montagem física; próximo de θ = 0° esse termo se anula, de modo que um sinal invertido não se manifestaria nos testes realizados com a inclinação zerada — é necessário testar o azimute com a inclinação em ±45°/±60° para confirmar o sinal.</w:t>
-      </w:r>
-    </w:p>
-    <w:p>
-      <w:pPr>
-        <w:spacing w:after="140" w:line="360" w:lineRule="auto"/>
-        <w:ind w:left="700" w:hanging="300"/>
-      </w:pPr>
-      <w:r>
-        <w:rPr>
-          <w:rFonts w:ascii="Times New Roman" w:cs="Times New Roman" w:eastAsia="Times New Roman" w:hAnsi="Times New Roman"/>
-          <w:sz w:val="24"/>
-          <w:szCs w:val="24"/>
-        </w:rPr>
-        <w:t xml:space="preserve">• Fator de escala do giroscópio (PAN_SCALE_CORRECTION): permanece fixado em 1,0, pendente de uma calibração de bancada entre duas posições de separação angular conhecida; até então, subsiste a tolerância de fábrica do giroscópio (aproximadamente ±3%).</w:t>
-      </w:r>
-    </w:p>
-    <w:p>
-      <w:pPr>
-        <w:spacing w:after="140" w:line="360" w:lineRule="auto"/>
-        <w:ind w:left="700" w:hanging="300"/>
-      </w:pPr>
-      <w:r>
-        <w:rPr>
-          <w:rFonts w:ascii="Times New Roman" w:cs="Times New Roman" w:eastAsia="Times New Roman" w:hAnsi="Times New Roman"/>
-          <w:sz w:val="24"/>
-          <w:szCs w:val="24"/>
-        </w:rPr>
-        <w:t xml:space="preserve">• Faixa mecânica do azimute (PAN_MIN_DEG/PAN_MAX_DEG): valor de referência provisório de ±90°, a ajustar quando a mecânica definitiva do pan-tilt for definida.</w:t>
-      </w:r>
-    </w:p>
-    <w:p>
-      <w:pPr>
-        <w:spacing w:after="140" w:line="360" w:lineRule="auto"/>
-        <w:ind w:left="700" w:hanging="300"/>
-      </w:pPr>
-      <w:r>
-        <w:rPr>
-          <w:rFonts w:ascii="Times New Roman" w:cs="Times New Roman" w:eastAsia="Times New Roman" w:hAnsi="Times New Roman"/>
-          <w:sz w:val="24"/>
-          <w:szCs w:val="24"/>
-        </w:rPr>
-        <w:t xml:space="preserve">• Compilação do aplicativo Android com o Gradle/AGP real: o projeto foi desenvolvido sem acesso ao Android SDK completo; apenas o algoritmo de FFT foi testado isoladamente com o compilador Kotlin puro — a primeira sincronização no Android Studio é necessária para confirmar a compilação completa.</w:t>
-      </w:r>
-    </w:p>
-    <w:p>
-      <w:pPr>
-        <w:spacing w:after="140" w:line="360" w:lineRule="auto"/>
-        <w:ind w:left="700" w:hanging="300"/>
-      </w:pPr>
-      <w:r>
-        <w:rPr>
-          <w:rFonts w:ascii="Times New Roman" w:cs="Times New Roman" w:eastAsia="Times New Roman" w:hAnsi="Times New Roman"/>
-          <w:sz w:val="24"/>
-          <w:szCs w:val="24"/>
-        </w:rPr>
-        <w:t xml:space="preserve">• Detecção de fim de quadro Modbus RTU por temporizador fixo de silêncio (5 ms), em vez do cálculo exato de 3,5 tempos de caractere previsto pela especificação — adequado na taxa de transmissão utilizada (9600 bauds), mas a revisar em taxas mais altas.</w:t>
-      </w:r>
-    </w:p>
-    <w:p>
-      <w:pPr>
-        <w:spacing w:after="140" w:line="360" w:lineRule="auto"/>
-        <w:ind w:left="700" w:hanging="300"/>
-      </w:pPr>
-      <w:r>
-        <w:rPr>
-          <w:rFonts w:ascii="Times New Roman" w:cs="Times New Roman" w:eastAsia="Times New Roman" w:hAnsi="Times New Roman"/>
-          <w:sz w:val="24"/>
-          <w:szCs w:val="24"/>
-        </w:rPr>
-        <w:t xml:space="preserve">• Persistência da calibração: o deslocamento (offset) de calibração dos dois eixos é mantido apenas em memória volátil (RAM), sendo perdido a cada reinicialização do ESP32.</w:t>
-      </w:r>
-    </w:p>
-    <w:p>
-      <w:pPr>
-        <w:spacing w:after="140" w:line="360" w:lineRule="auto"/>
-        <w:ind w:left="700" w:hanging="300"/>
-      </w:pPr>
-      <w:r>
-        <w:rPr>
-          <w:rFonts w:ascii="Times New Roman" w:cs="Times New Roman" w:eastAsia="Times New Roman" w:hAnsi="Times New Roman"/>
-          <w:sz w:val="24"/>
-          <w:szCs w:val="24"/>
-        </w:rPr>
-        <w:t xml:space="preserve">• Filtro adaptativo "1-euro" e extremos medidos no firmware (v1.6.0 — seções 4.3 e 6.2): os números apresentados vêm de simulação da cadeia completa (ruído do MPU6050 → DLPF → atan2 → filtro), e o código foi conferido contra essa mesma simulação, mas ainda não foi exercitado contra o sensor físico — ruído real inclui vibração mecânica, montagem e temperatura, que a simulação não modela.</w:t>
-      </w:r>
-    </w:p>
-    <w:p>
-      <w:pPr>
-        <w:spacing w:after="140" w:line="360" w:lineRule="auto"/>
-        <w:ind w:left="700" w:hanging="300"/>
-      </w:pPr>
-      <w:r>
-        <w:rPr>
-          <w:rFonts w:ascii="Times New Roman" w:cs="Times New Roman" w:eastAsia="Times New Roman" w:hAnsi="Times New Roman"/>
-          <w:sz w:val="24"/>
-          <w:szCs w:val="24"/>
-        </w:rPr>
-        <w:t xml:space="preserve">• Retransmissão de amostras perdidas do Modo Vibração via BLE (v1.4.0 — seção 6.4): a lógica de detecção de lacuna e resolicitação foi validada com simulação de perda de pacote, mas não contra uma conexão BLE real sujeita a interferência de rádio.</w:t>
-      </w:r>
-    </w:p>
-    <w:p>
-      <w:pPr>
-        <w:pStyle w:val="Heading1"/>
-        <w:spacing w:after="240" w:before="480"/>
-      </w:pPr>
-      <w:r>
-        <w:rPr>
-          <w:rFonts w:ascii="Times New Roman" w:cs="Times New Roman" w:eastAsia="Times New Roman" w:hAnsi="Times New Roman"/>
-          <w:b/>
-          <w:bCs/>
-          <w:sz w:val="24"/>
-          <w:szCs w:val="24"/>
-        </w:rPr>
-        <w:t xml:space="preserve">8 CONSIDERAÇÕES FINAIS</w:t>
+        <w:t xml:space="preserve">Para validar o Modo Vibração via BLE de ponta a ponta sem depender do hardware, o código real do firmware (firmware/src) foi compilado em computador contra um MPU6050 simulado, que injeta uma oscilação conhecida em cada eixo — 0,5° a 3,0 Hz na inclinação e 2 °/s a 4,5 Hz na velocidade angular de azimute, equivalente a 0,0707° —, e contra uma biblioteca BLE simulada que reproduz a contabilidade de handles da pilha real, inclusive o padrão de 15 por serviço. A captura foi conduzida pelo código real do aplicativo desktop (solicitação, recepção, retransmissão e decodificação) e analisada pelo mesmo pipeline espectral da seção 6.4, com perda aleatória de pacotes de dados injetada. Os resultados estão na Tabela 9; o procedimento é reproduzível pelo script sim/run.sh.</w:t>
+      </w:r>
+    </w:p>
+    <w:tbl>
+      <w:tblPr>
+        <w:tblW w:type="dxa" w:w="9000"/>
+        <w:tblBorders>
+          <w:top w:val="single" w:color="444444" w:sz="4"/>
+          <w:left w:val="single" w:color="444444" w:sz="4"/>
+          <w:bottom w:val="single" w:color="444444" w:sz="4"/>
+          <w:right w:val="single" w:color="444444" w:sz="4"/>
+          <w:insideH w:val="single" w:color="888888" w:sz="2"/>
+          <w:insideV w:val="single" w:color="888888" w:sz="2"/>
+        </w:tblBorders>
+      </w:tblPr>
+      <w:tblGrid>
+        <w:gridCol w:w="4200"/>
+        <w:gridCol w:w="4800"/>
+      </w:tblGrid>
+      <w:tr>
+        <w:trPr>
+          <w:tblHeader/>
+        </w:trPr>
+        <w:tc>
+          <w:tcPr>
+            <w:tcW w:type="dxa" w:w="4200"/>
+            <w:shd w:fill="D9D9D9" w:val="clear"/>
+            <w:tcMar>
+              <w:top w:type="dxa" w:w="60"/>
+              <w:left w:type="dxa" w:w="100"/>
+              <w:bottom w:type="dxa" w:w="60"/>
+              <w:right w:type="dxa" w:w="100"/>
+            </w:tcMar>
+            <w:vAlign w:val="center"/>
+          </w:tcPr>
+          <w:p>
+            <w:pPr>
+              <w:spacing w:line="240" w:lineRule="auto"/>
+              <w:jc w:val="center"/>
+            </w:pPr>
+            <w:r>
+              <w:rPr>
+                <w:rFonts w:ascii="Times New Roman" w:cs="Times New Roman" w:eastAsia="Times New Roman" w:hAnsi="Times New Roman"/>
+                <w:b/>
+                <w:bCs/>
+                <w:sz w:val="20"/>
+                <w:szCs w:val="20"/>
+              </w:rPr>
+              <w:t xml:space="preserve">Cenário simulado</w:t>
+            </w:r>
+          </w:p>
+        </w:tc>
+        <w:tc>
+          <w:tcPr>
+            <w:tcW w:type="dxa" w:w="4800"/>
+            <w:shd w:fill="D9D9D9" w:val="clear"/>
+            <w:tcMar>
+              <w:top w:type="dxa" w:w="60"/>
+              <w:left w:type="dxa" w:w="100"/>
+              <w:bottom w:type="dxa" w:w="60"/>
+              <w:right w:type="dxa" w:w="100"/>
+            </w:tcMar>
+            <w:vAlign w:val="center"/>
+          </w:tcPr>
+          <w:p>
+            <w:pPr>
+              <w:spacing w:line="240" w:lineRule="auto"/>
+              <w:jc w:val="center"/>
+            </w:pPr>
+            <w:r>
+              <w:rPr>
+                <w:rFonts w:ascii="Times New Roman" w:cs="Times New Roman" w:eastAsia="Times New Roman" w:hAnsi="Times New Roman"/>
+                <w:b/>
+                <w:bCs/>
+                <w:sz w:val="20"/>
+                <w:szCs w:val="20"/>
+              </w:rPr>
+              <w:t xml:space="preserve">Resultado obtido</w:t>
+            </w:r>
+          </w:p>
+        </w:tc>
+      </w:tr>
+      <w:tr>
+        <w:tc>
+          <w:tcPr>
+            <w:tcW w:type="dxa" w:w="4200"/>
+            <w:tcMar>
+              <w:top w:type="dxa" w:w="60"/>
+              <w:left w:type="dxa" w:w="100"/>
+              <w:bottom w:type="dxa" w:w="60"/>
+              <w:right w:type="dxa" w:w="100"/>
+            </w:tcMar>
+            <w:vAlign w:val="center"/>
+          </w:tcPr>
+          <w:p>
+            <w:pPr>
+              <w:spacing w:line="240" w:lineRule="auto"/>
+              <w:jc w:val="left"/>
+            </w:pPr>
+            <w:r>
+              <w:rPr>
+                <w:rFonts w:ascii="Times New Roman" w:cs="Times New Roman" w:eastAsia="Times New Roman" w:hAnsi="Times New Roman"/>
+                <w:b w:val="false"/>
+                <w:bCs w:val="false"/>
+                <w:sz w:val="20"/>
+                <w:szCs w:val="20"/>
+              </w:rPr>
+              <w:t xml:space="preserve">Firmware 1.6.0, captura de 500 Hz por 10 s</w:t>
+            </w:r>
+          </w:p>
+        </w:tc>
+        <w:tc>
+          <w:tcPr>
+            <w:tcW w:type="dxa" w:w="4800"/>
+            <w:tcMar>
+              <w:top w:type="dxa" w:w="60"/>
+              <w:left w:type="dxa" w:w="100"/>
+              <w:bottom w:type="dxa" w:w="60"/>
+              <w:right w:type="dxa" w:w="100"/>
+            </w:tcMar>
+            <w:vAlign w:val="center"/>
+          </w:tcPr>
+          <w:p>
+            <w:pPr>
+              <w:spacing w:line="240" w:lineRule="auto"/>
+              <w:jc w:val="left"/>
+            </w:pPr>
+            <w:r>
+              <w:rPr>
+                <w:rFonts w:ascii="Times New Roman" w:cs="Times New Roman" w:eastAsia="Times New Roman" w:hAnsi="Times New Roman"/>
+                <w:b w:val="false"/>
+                <w:bCs w:val="false"/>
+                <w:sz w:val="20"/>
+                <w:szCs w:val="20"/>
+              </w:rPr>
+              <w:t xml:space="preserve">Falha: característica 6e6e0005 não encontrada — o mesmo erro observado em bancada</w:t>
+            </w:r>
+          </w:p>
+        </w:tc>
+      </w:tr>
+      <w:tr>
+        <w:tc>
+          <w:tcPr>
+            <w:tcW w:type="dxa" w:w="4200"/>
+            <w:tcMar>
+              <w:top w:type="dxa" w:w="60"/>
+              <w:left w:type="dxa" w:w="100"/>
+              <w:bottom w:type="dxa" w:w="60"/>
+              <w:right w:type="dxa" w:w="100"/>
+            </w:tcMar>
+            <w:vAlign w:val="center"/>
+          </w:tcPr>
+          <w:p>
+            <w:pPr>
+              <w:spacing w:line="240" w:lineRule="auto"/>
+              <w:jc w:val="left"/>
+            </w:pPr>
+            <w:r>
+              <w:rPr>
+                <w:rFonts w:ascii="Times New Roman" w:cs="Times New Roman" w:eastAsia="Times New Roman" w:hAnsi="Times New Roman"/>
+                <w:b w:val="false"/>
+                <w:bCs w:val="false"/>
+                <w:sz w:val="20"/>
+                <w:szCs w:val="20"/>
+              </w:rPr>
+              <w:t xml:space="preserve">Firmware 1.6.1: características registradas</w:t>
+            </w:r>
+          </w:p>
+        </w:tc>
+        <w:tc>
+          <w:tcPr>
+            <w:tcW w:type="dxa" w:w="4800"/>
+            <w:tcMar>
+              <w:top w:type="dxa" w:w="60"/>
+              <w:left w:type="dxa" w:w="100"/>
+              <w:bottom w:type="dxa" w:w="60"/>
+              <w:right w:type="dxa" w:w="100"/>
+            </w:tcMar>
+            <w:vAlign w:val="center"/>
+          </w:tcPr>
+          <w:p>
+            <w:pPr>
+              <w:spacing w:line="240" w:lineRule="auto"/>
+              <w:jc w:val="left"/>
+            </w:pPr>
+            <w:r>
+              <w:rPr>
+                <w:rFonts w:ascii="Times New Roman" w:cs="Times New Roman" w:eastAsia="Times New Roman" w:hAnsi="Times New Roman"/>
+                <w:b w:val="false"/>
+                <w:bCs w:val="false"/>
+                <w:sz w:val="20"/>
+                <w:szCs w:val="20"/>
+              </w:rPr>
+              <w:t xml:space="preserve">11 de 11; versão lida via BLE: 1.6.1</w:t>
+            </w:r>
+          </w:p>
+        </w:tc>
+      </w:tr>
+      <w:tr>
+        <w:tc>
+          <w:tcPr>
+            <w:tcW w:type="dxa" w:w="4200"/>
+            <w:tcMar>
+              <w:top w:type="dxa" w:w="60"/>
+              <w:left w:type="dxa" w:w="100"/>
+              <w:bottom w:type="dxa" w:w="60"/>
+              <w:right w:type="dxa" w:w="100"/>
+            </w:tcMar>
+            <w:vAlign w:val="center"/>
+          </w:tcPr>
+          <w:p>
+            <w:pPr>
+              <w:spacing w:line="240" w:lineRule="auto"/>
+              <w:jc w:val="left"/>
+            </w:pPr>
+            <w:r>
+              <w:rPr>
+                <w:rFonts w:ascii="Times New Roman" w:cs="Times New Roman" w:eastAsia="Times New Roman" w:hAnsi="Times New Roman"/>
+                <w:b w:val="false"/>
+                <w:bCs w:val="false"/>
+                <w:sz w:val="20"/>
+                <w:szCs w:val="20"/>
+              </w:rPr>
+              <w:t xml:space="preserve">500 Hz por 10 s, sem perda de pacotes</w:t>
+            </w:r>
+          </w:p>
+        </w:tc>
+        <w:tc>
+          <w:tcPr>
+            <w:tcW w:type="dxa" w:w="4800"/>
+            <w:tcMar>
+              <w:top w:type="dxa" w:w="60"/>
+              <w:left w:type="dxa" w:w="100"/>
+              <w:bottom w:type="dxa" w:w="60"/>
+              <w:right w:type="dxa" w:w="100"/>
+            </w:tcMar>
+            <w:vAlign w:val="center"/>
+          </w:tcPr>
+          <w:p>
+            <w:pPr>
+              <w:spacing w:line="240" w:lineRule="auto"/>
+              <w:jc w:val="left"/>
+            </w:pPr>
+            <w:r>
+              <w:rPr>
+                <w:rFonts w:ascii="Times New Roman" w:cs="Times New Roman" w:eastAsia="Times New Roman" w:hAnsi="Times New Roman"/>
+                <w:b w:val="false"/>
+                <w:bCs w:val="false"/>
+                <w:sz w:val="20"/>
+                <w:szCs w:val="20"/>
+              </w:rPr>
+              <w:t xml:space="preserve">5000 amostras; tilt 3,000 Hz / 0,5000°; pan 4,500 Hz / 0,0709°</w:t>
+            </w:r>
+          </w:p>
+        </w:tc>
+      </w:tr>
+      <w:tr>
+        <w:tc>
+          <w:tcPr>
+            <w:tcW w:type="dxa" w:w="4200"/>
+            <w:tcMar>
+              <w:top w:type="dxa" w:w="60"/>
+              <w:left w:type="dxa" w:w="100"/>
+              <w:bottom w:type="dxa" w:w="60"/>
+              <w:right w:type="dxa" w:w="100"/>
+            </w:tcMar>
+            <w:vAlign w:val="center"/>
+          </w:tcPr>
+          <w:p>
+            <w:pPr>
+              <w:spacing w:line="240" w:lineRule="auto"/>
+              <w:jc w:val="left"/>
+            </w:pPr>
+            <w:r>
+              <w:rPr>
+                <w:rFonts w:ascii="Times New Roman" w:cs="Times New Roman" w:eastAsia="Times New Roman" w:hAnsi="Times New Roman"/>
+                <w:b w:val="false"/>
+                <w:bCs w:val="false"/>
+                <w:sz w:val="20"/>
+                <w:szCs w:val="20"/>
+              </w:rPr>
+              <w:t xml:space="preserve">500 Hz por 10 s, 5% dos pacotes perdidos</w:t>
+            </w:r>
+          </w:p>
+        </w:tc>
+        <w:tc>
+          <w:tcPr>
+            <w:tcW w:type="dxa" w:w="4800"/>
+            <w:tcMar>
+              <w:top w:type="dxa" w:w="60"/>
+              <w:left w:type="dxa" w:w="100"/>
+              <w:bottom w:type="dxa" w:w="60"/>
+              <w:right w:type="dxa" w:w="100"/>
+            </w:tcMar>
+            <w:vAlign w:val="center"/>
+          </w:tcPr>
+          <w:p>
+            <w:pPr>
+              <w:spacing w:line="240" w:lineRule="auto"/>
+              <w:jc w:val="left"/>
+            </w:pPr>
+            <w:r>
+              <w:rPr>
+                <w:rFonts w:ascii="Times New Roman" w:cs="Times New Roman" w:eastAsia="Times New Roman" w:hAnsi="Times New Roman"/>
+                <w:b w:val="false"/>
+                <w:bCs w:val="false"/>
+                <w:sz w:val="20"/>
+                <w:szCs w:val="20"/>
+              </w:rPr>
+              <w:t xml:space="preserve">Captura completa após retransmissão; resultado idêntico</w:t>
+            </w:r>
+          </w:p>
+        </w:tc>
+      </w:tr>
+      <w:tr>
+        <w:tc>
+          <w:tcPr>
+            <w:tcW w:type="dxa" w:w="4200"/>
+            <w:tcMar>
+              <w:top w:type="dxa" w:w="60"/>
+              <w:left w:type="dxa" w:w="100"/>
+              <w:bottom w:type="dxa" w:w="60"/>
+              <w:right w:type="dxa" w:w="100"/>
+            </w:tcMar>
+            <w:vAlign w:val="center"/>
+          </w:tcPr>
+          <w:p>
+            <w:pPr>
+              <w:spacing w:line="240" w:lineRule="auto"/>
+              <w:jc w:val="left"/>
+            </w:pPr>
+            <w:r>
+              <w:rPr>
+                <w:rFonts w:ascii="Times New Roman" w:cs="Times New Roman" w:eastAsia="Times New Roman" w:hAnsi="Times New Roman"/>
+                <w:b w:val="false"/>
+                <w:bCs w:val="false"/>
+                <w:sz w:val="20"/>
+                <w:szCs w:val="20"/>
+              </w:rPr>
+              <w:t xml:space="preserve">500 Hz por 10 s, 30% dos pacotes perdidos</w:t>
+            </w:r>
+          </w:p>
+        </w:tc>
+        <w:tc>
+          <w:tcPr>
+            <w:tcW w:type="dxa" w:w="4800"/>
+            <w:tcMar>
+              <w:top w:type="dxa" w:w="60"/>
+              <w:left w:type="dxa" w:w="100"/>
+              <w:bottom w:type="dxa" w:w="60"/>
+              <w:right w:type="dxa" w:w="100"/>
+            </w:tcMar>
+            <w:vAlign w:val="center"/>
+          </w:tcPr>
+          <w:p>
+            <w:pPr>
+              <w:spacing w:line="240" w:lineRule="auto"/>
+              <w:jc w:val="left"/>
+            </w:pPr>
+            <w:r>
+              <w:rPr>
+                <w:rFonts w:ascii="Times New Roman" w:cs="Times New Roman" w:eastAsia="Times New Roman" w:hAnsi="Times New Roman"/>
+                <w:b w:val="false"/>
+                <w:bCs w:val="false"/>
+                <w:sz w:val="20"/>
+                <w:szCs w:val="20"/>
+              </w:rPr>
+              <w:t xml:space="preserve">Captura completa; resultado idêntico (antes das correções de retransmissão desta revisão, 1464 amostras permaneciam faltando)</w:t>
+            </w:r>
+          </w:p>
+        </w:tc>
+      </w:tr>
+    </w:tbl>
+    <w:p>
+      <w:pPr>
+        <w:spacing w:after="240" w:before="120"/>
+        <w:jc w:val="left"/>
+      </w:pPr>
+      <w:r>
+        <w:rPr>
+          <w:rFonts w:ascii="Times New Roman" w:cs="Times New Roman" w:eastAsia="Times New Roman" w:hAnsi="Times New Roman"/>
+          <w:sz w:val="20"/>
+          <w:szCs w:val="20"/>
+        </w:rPr>
+        <w:t xml:space="preserve">Tabela 9 — Validação de ponta a ponta do Modo Vibração via BLE, com firmware e aplicativo reais sobre sensor e rádio simulados. Fonte: elaborado pelo autor, com base em sim/run.sh.</w:t>
       </w:r>
     </w:p>
     <w:p>
@@ -11599,7 +12216,23 @@
           <w:sz w:val="24"/>
           <w:szCs w:val="24"/>
         </w:rPr>
-        <w:t xml:space="preserve">Este relatório apresentou o projeto completo de um sistema de medição de inclinação e azimute para um pan-tilt em mastro elevado, cobrindo o hardware, os cálculos e modelos matemáticos, os protocolos de comunicação e os dois aplicativos de supervisão desenvolvidos. A abordagem adotada para o azimute — reaproveitar o giroscópio já presente no sensor inercial, combinado com compensação de inclinação e ZUPT — permitiu obter uma segunda grandeza medida sem adicionar hardware, ao custo de uma modelagem matemática mais elaborada, cuja correção foi verificada por simulação numérica antes da disponibilidade de hardware físico completo.</w:t>
+        <w:t xml:space="preserve">A simulação não reproduz a temporização real do barramento I2C nem do rádio e, portanto, não substitui o ensaio em bancada, que confirmou o funcionamento da captura a 500 Hz por 10 s (capítulo 7, introdução). Seu papel é detectar regressões de lógica e de contrato de protocolo — como o defeito de handles descrito na seção 5.2, que ela reproduz com o firmware 1.6.0.</w:t>
+      </w:r>
+    </w:p>
+    <w:p>
+      <w:pPr>
+        <w:pStyle w:val="Heading2"/>
+        <w:spacing w:after="200" w:before="360"/>
+      </w:pPr>
+      <w:r>
+        <w:rPr>
+          <w:rFonts w:ascii="Times New Roman" w:cs="Times New Roman" w:eastAsia="Times New Roman" w:hAnsi="Times New Roman"/>
+          <w:b/>
+          <w:bCs/>
+          <w:sz w:val="24"/>
+          <w:szCs w:val="24"/>
+        </w:rPr>
+        <w:t xml:space="preserve">7.4 Limitações conhecidas e validações pendentes</w:t>
       </w:r>
     </w:p>
     <w:p>
@@ -11614,7 +12247,191 @@
           <w:sz w:val="24"/>
           <w:szCs w:val="24"/>
         </w:rPr>
-        <w:t xml:space="preserve">O sistema foi projetado com compatibilidade retroativa e extensibilidade como princípios centrais: os protocolos Modbus RTU e BLE evoluem de forma aditiva, os aplicativos degradam graciosamente contra firmware mais antigo, e os dois softwares de supervisão compartilham a mesma arquitetura conceitual (fonte de dados plugável, rastreamento de limites, histórico persistente e geração de relatório), reduzindo o esforço de manter duas plataformas com a mesma finalidade.</w:t>
+        <w:t xml:space="preserve">As seguintes limitações e verificações são conhecidas e permanecem pendentes de confirmação com o sistema montado ou em campo:</w:t>
+      </w:r>
+    </w:p>
+    <w:p>
+      <w:pPr>
+        <w:spacing w:after="140" w:line="360" w:lineRule="auto"/>
+        <w:ind w:left="700" w:hanging="300"/>
+      </w:pPr>
+      <w:r>
+        <w:rPr>
+          <w:rFonts w:ascii="Times New Roman" w:cs="Times New Roman" w:eastAsia="Times New Roman" w:hAnsi="Times New Roman"/>
+          <w:sz w:val="24"/>
+          <w:szCs w:val="24"/>
+        </w:rPr>
+        <w:t xml:space="preserve">• Validação do sistema montado: o firmware já foi compilado, gravado e exercitado em bancada em um ESP32 físico (capítulo 7), mas ainda não com o sensor fixado ao pan-tilt definitivo, nem em campo.</w:t>
+      </w:r>
+    </w:p>
+    <w:p>
+      <w:pPr>
+        <w:spacing w:after="140" w:line="360" w:lineRule="auto"/>
+        <w:ind w:left="700" w:hanging="300"/>
+      </w:pPr>
+      <w:r>
+        <w:rPr>
+          <w:rFonts w:ascii="Times New Roman" w:cs="Times New Roman" w:eastAsia="Times New Roman" w:hAnsi="Times New Roman"/>
+          <w:sz w:val="24"/>
+          <w:szCs w:val="24"/>
+        </w:rPr>
+        <w:t xml:space="preserve">• Correção do viés do azimute por eixo (v1.6.1 — seção 4.2.1): validada em simulação com mudanças de inclinação e viés de fábrica de até 15 °/s por eixo; a confirmação em bancada está pendente — mudar a inclinação da placa em repouso e verificar que o azimute não deriva.</w:t>
+      </w:r>
+    </w:p>
+    <w:p>
+      <w:pPr>
+        <w:spacing w:after="140" w:line="360" w:lineRule="auto"/>
+        <w:ind w:left="700" w:hanging="300"/>
+      </w:pPr>
+      <w:r>
+        <w:rPr>
+          <w:rFonts w:ascii="Times New Roman" w:cs="Times New Roman" w:eastAsia="Times New Roman" w:hAnsi="Times New Roman"/>
+          <w:sz w:val="24"/>
+          <w:szCs w:val="24"/>
+        </w:rPr>
+        <w:t xml:space="preserve">• Orientação de montagem do sensor: a fórmula de inclinação (atan2 sobre os eixos Y e Z) e a de compensação de tilt do azimute assumem uma orientação específica de montagem do MPU6050 (eixo X alinhado ao eixo mecânico de giro), recomendada mas ainda não confirmada fisicamente por um ensaio de bancada.</w:t>
+      </w:r>
+    </w:p>
+    <w:p>
+      <w:pPr>
+        <w:spacing w:after="140" w:line="360" w:lineRule="auto"/>
+        <w:ind w:left="700" w:hanging="300"/>
+      </w:pPr>
+      <w:r>
+        <w:rPr>
+          <w:rFonts w:ascii="Times New Roman" w:cs="Times New Roman" w:eastAsia="Times New Roman" w:hAnsi="Times New Roman"/>
+          <w:sz w:val="24"/>
+          <w:szCs w:val="24"/>
+        </w:rPr>
+        <w:t xml:space="preserve">• Sinal do termo de compensação de tilt (−g_y·sen θ): depende da lateralidade (handedness) real da montagem física; próximo de θ = 0° esse termo se anula, de modo que um sinal invertido não se manifestaria nos testes realizados com a inclinação zerada — é necessário testar o azimute com a inclinação em ±45°/±60° para confirmar o sinal.</w:t>
+      </w:r>
+    </w:p>
+    <w:p>
+      <w:pPr>
+        <w:spacing w:after="140" w:line="360" w:lineRule="auto"/>
+        <w:ind w:left="700" w:hanging="300"/>
+      </w:pPr>
+      <w:r>
+        <w:rPr>
+          <w:rFonts w:ascii="Times New Roman" w:cs="Times New Roman" w:eastAsia="Times New Roman" w:hAnsi="Times New Roman"/>
+          <w:sz w:val="24"/>
+          <w:szCs w:val="24"/>
+        </w:rPr>
+        <w:t xml:space="preserve">• Fator de escala do giroscópio (PAN_SCALE_CORRECTION): permanece fixado em 1,0, pendente de uma calibração de bancada entre duas posições de separação angular conhecida; até então, subsiste a tolerância de fábrica do giroscópio (aproximadamente ±3%).</w:t>
+      </w:r>
+    </w:p>
+    <w:p>
+      <w:pPr>
+        <w:spacing w:after="140" w:line="360" w:lineRule="auto"/>
+        <w:ind w:left="700" w:hanging="300"/>
+      </w:pPr>
+      <w:r>
+        <w:rPr>
+          <w:rFonts w:ascii="Times New Roman" w:cs="Times New Roman" w:eastAsia="Times New Roman" w:hAnsi="Times New Roman"/>
+          <w:sz w:val="24"/>
+          <w:szCs w:val="24"/>
+        </w:rPr>
+        <w:t xml:space="preserve">• Faixa mecânica do azimute (PAN_MIN_DEG/PAN_MAX_DEG): valor de referência provisório de ±90°, a ajustar quando a mecânica definitiva do pan-tilt for definida.</w:t>
+      </w:r>
+    </w:p>
+    <w:p>
+      <w:pPr>
+        <w:spacing w:after="140" w:line="360" w:lineRule="auto"/>
+        <w:ind w:left="700" w:hanging="300"/>
+      </w:pPr>
+      <w:r>
+        <w:rPr>
+          <w:rFonts w:ascii="Times New Roman" w:cs="Times New Roman" w:eastAsia="Times New Roman" w:hAnsi="Times New Roman"/>
+          <w:sz w:val="24"/>
+          <w:szCs w:val="24"/>
+        </w:rPr>
+        <w:t xml:space="preserve">• Compilação do aplicativo Android com o Gradle/AGP real: o projeto foi desenvolvido sem acesso ao Android SDK completo; apenas o algoritmo de FFT foi testado isoladamente com o compilador Kotlin puro — a primeira sincronização no Android Studio é necessária para confirmar a compilação completa.</w:t>
+      </w:r>
+    </w:p>
+    <w:p>
+      <w:pPr>
+        <w:spacing w:after="140" w:line="360" w:lineRule="auto"/>
+        <w:ind w:left="700" w:hanging="300"/>
+      </w:pPr>
+      <w:r>
+        <w:rPr>
+          <w:rFonts w:ascii="Times New Roman" w:cs="Times New Roman" w:eastAsia="Times New Roman" w:hAnsi="Times New Roman"/>
+          <w:sz w:val="24"/>
+          <w:szCs w:val="24"/>
+        </w:rPr>
+        <w:t xml:space="preserve">• Detecção de fim de quadro Modbus RTU por temporizador fixo de silêncio (5 ms), em vez do cálculo exato de 3,5 tempos de caractere previsto pela especificação — adequado na taxa de transmissão utilizada (9600 bauds), mas a revisar em taxas mais altas.</w:t>
+      </w:r>
+    </w:p>
+    <w:p>
+      <w:pPr>
+        <w:spacing w:after="140" w:line="360" w:lineRule="auto"/>
+        <w:ind w:left="700" w:hanging="300"/>
+      </w:pPr>
+      <w:r>
+        <w:rPr>
+          <w:rFonts w:ascii="Times New Roman" w:cs="Times New Roman" w:eastAsia="Times New Roman" w:hAnsi="Times New Roman"/>
+          <w:sz w:val="24"/>
+          <w:szCs w:val="24"/>
+        </w:rPr>
+        <w:t xml:space="preserve">• Persistência da calibração: o deslocamento (offset) de calibração dos dois eixos é mantido apenas em memória volátil (RAM), sendo perdido a cada reinicialização do ESP32.</w:t>
+      </w:r>
+    </w:p>
+    <w:p>
+      <w:pPr>
+        <w:spacing w:after="140" w:line="360" w:lineRule="auto"/>
+        <w:ind w:left="700" w:hanging="300"/>
+      </w:pPr>
+      <w:r>
+        <w:rPr>
+          <w:rFonts w:ascii="Times New Roman" w:cs="Times New Roman" w:eastAsia="Times New Roman" w:hAnsi="Times New Roman"/>
+          <w:sz w:val="24"/>
+          <w:szCs w:val="24"/>
+        </w:rPr>
+        <w:t xml:space="preserve">• Filtro adaptativo "1-euro" e extremos medidos no firmware (v1.6.0 — seções 4.3 e 6.2): os números apresentados vêm de simulação da cadeia completa (ruído do MPU6050 → DLPF → atan2 → filtro), e o código foi conferido contra essa mesma simulação, mas ainda não foi exercitado contra o sensor físico — ruído real inclui vibração mecânica, montagem e temperatura, que a simulação não modela.</w:t>
+      </w:r>
+    </w:p>
+    <w:p>
+      <w:pPr>
+        <w:spacing w:after="140" w:line="360" w:lineRule="auto"/>
+        <w:ind w:left="700" w:hanging="300"/>
+      </w:pPr>
+      <w:r>
+        <w:rPr>
+          <w:rFonts w:ascii="Times New Roman" w:cs="Times New Roman" w:eastAsia="Times New Roman" w:hAnsi="Times New Roman"/>
+          <w:sz w:val="24"/>
+          <w:szCs w:val="24"/>
+        </w:rPr>
+        <w:t xml:space="preserve">• Retransmissão de amostras perdidas do Modo Vibração via BLE (seção 6.4): validada de ponta a ponta em simulação com até 30% de perda de pacotes (seção 7.3), e captura a 500 Hz verificada em bancada; o comportamento sob interferência de rádio intensa, em campo, ainda não foi caracterizado.</w:t>
+      </w:r>
+    </w:p>
+    <w:p>
+      <w:pPr>
+        <w:spacing w:after="140" w:line="360" w:lineRule="auto"/>
+        <w:ind w:left="700" w:hanging="300"/>
+      </w:pPr>
+      <w:r>
+        <w:rPr>
+          <w:rFonts w:ascii="Times New Roman" w:cs="Times New Roman" w:eastAsia="Times New Roman" w:hAnsi="Times New Roman"/>
+          <w:sz w:val="24"/>
+          <w:szCs w:val="24"/>
+        </w:rPr>
+        <w:t xml:space="preserve">• Cache de características do Windows: o aplicativo desktop solicita descoberta sem cache a cada conexão (seção 5.2), mas, se o sistema ainda apresentar a lista de um firmware anterior, é necessário remover o dispositivo nas configurações de Bluetooth do Windows e conectar novamente.</w:t>
+      </w:r>
+    </w:p>
+    <w:p>
+      <w:pPr>
+        <w:pStyle w:val="Heading1"/>
+        <w:spacing w:after="240" w:before="480"/>
+      </w:pPr>
+      <w:r>
+        <w:rPr>
+          <w:rFonts w:ascii="Times New Roman" w:cs="Times New Roman" w:eastAsia="Times New Roman" w:hAnsi="Times New Roman"/>
+          <w:b/>
+          <w:bCs/>
+          <w:sz w:val="24"/>
+          <w:szCs w:val="24"/>
+        </w:rPr>
+        <w:t xml:space="preserve">8 CONSIDERAÇÕES FINAIS</w:t>
       </w:r>
     </w:p>
     <w:p>
@@ -11629,7 +12446,52 @@
           <w:sz w:val="24"/>
           <w:szCs w:val="24"/>
         </w:rPr>
-        <w:t xml:space="preserve">Os próximos passos naturais do projeto são as validações em bancada e em campo listadas na seção 7.3 — em particular, a confirmação da orientação de montagem do sensor, a calibração do fator de escala do giroscópio e a compilação/gravação do firmware em hardware real —, sem as quais o sistema deve ser considerado funcionalmente projetado, mas ainda não fisicamente validado.</w:t>
+        <w:t xml:space="preserve">Este relatório apresentou o projeto completo de um sistema de medição de inclinação e azimute para um pan-tilt em mastro elevado, cobrindo o hardware, os cálculos e modelos matemáticos, os protocolos de comunicação e os dois aplicativos de supervisão desenvolvidos. A abordagem adotada para o azimute — reaproveitar o giroscópio já presente no sensor inercial, combinado com compensação de inclinação e ZUPT — permitiu obter uma segunda grandeza medida sem adicionar hardware, ao custo de uma modelagem matemática mais elaborada, cuja correção foi verificada por simulação numérica antes da disponibilidade de hardware físico completo.</w:t>
+      </w:r>
+    </w:p>
+    <w:p>
+      <w:pPr>
+        <w:spacing w:after="200" w:before="0" w:line="360" w:lineRule="auto"/>
+        <w:ind w:firstLine="709"/>
+        <w:jc w:val="both"/>
+      </w:pPr>
+      <w:r>
+        <w:rPr>
+          <w:rFonts w:ascii="Times New Roman" w:cs="Times New Roman" w:eastAsia="Times New Roman" w:hAnsi="Times New Roman"/>
+          <w:sz w:val="24"/>
+          <w:szCs w:val="24"/>
+        </w:rPr>
+        <w:t xml:space="preserve">O sistema foi projetado com compatibilidade retroativa e extensibilidade como princípios centrais: os protocolos Modbus RTU e BLE evoluem de forma aditiva, os aplicativos degradam graciosamente contra firmware mais antigo, e os dois softwares de supervisão compartilham a mesma arquitetura conceitual (fonte de dados plugável, rastreamento de limites, histórico persistente e geração de relatório), reduzindo o esforço de manter duas plataformas com a mesma finalidade.</w:t>
+      </w:r>
+    </w:p>
+    <w:p>
+      <w:pPr>
+        <w:spacing w:after="200" w:before="0" w:line="360" w:lineRule="auto"/>
+        <w:ind w:firstLine="709"/>
+        <w:jc w:val="both"/>
+      </w:pPr>
+      <w:r>
+        <w:rPr>
+          <w:rFonts w:ascii="Times New Roman" w:cs="Times New Roman" w:eastAsia="Times New Roman" w:hAnsi="Times New Roman"/>
+          <w:sz w:val="24"/>
+          <w:szCs w:val="24"/>
+        </w:rPr>
+        <w:t xml:space="preserve">O primeiro ensaio em bancada, com o firmware gravado em um ESP32 físico, expôs dois defeitos que as simulações anteriores não cobriam — o viés do azimute dependente da inclinação e o orçamento de handles do serviço BLE —, ambos corrigidos na versão 1.6.1 e agora reproduzidos por testes automatizados (seções 7.1 e 7.3). O episódio reforça o valor do ensaio físico e, ao mesmo tempo, o de transformar cada defeito encontrado em um caso de teste permanente.</w:t>
+      </w:r>
+    </w:p>
+    <w:p>
+      <w:pPr>
+        <w:spacing w:after="200" w:before="0" w:line="360" w:lineRule="auto"/>
+        <w:ind w:firstLine="709"/>
+        <w:jc w:val="both"/>
+      </w:pPr>
+      <w:r>
+        <w:rPr>
+          <w:rFonts w:ascii="Times New Roman" w:cs="Times New Roman" w:eastAsia="Times New Roman" w:hAnsi="Times New Roman"/>
+          <w:sz w:val="24"/>
+          <w:szCs w:val="24"/>
+        </w:rPr>
+        <w:t xml:space="preserve">Os próximos passos naturais do projeto são as validações listadas na seção 7.4 — em particular, a confirmação da orientação de montagem do sensor, a calibração do fator de escala do giroscópio e a validação com o sensor montado no pan-tilt —, sem as quais o sistema, já verificado em bancada, ainda não deve ser considerado validado para uso em campo.</w:t>
       </w:r>
     </w:p>
     <w:p>

</xml_diff>